<commit_message>
Make v2 documentation self-contained
Rewrite passages that referred to sections of the v1 documentation so
Project_Documentation_v2 stands on its own, and fix two inherited
markup validation errors (table shading, zoom).

Co-Authored-By: Claude Opus 5.5 <noreply@anthropic.com>
</commit_message>
<xml_diff>
--- a/documentation/Project_Documentation_v2.docx
+++ b/documentation/Project_Documentation_v2.docx
@@ -67,12 +67,12 @@
     </w:p>
     <w:p>
       <w:r>
-        <w:t xml:space="preserve">This document reports the second version (v2) of the project's linguistic feature analysis, in the order the scripts were built. Each section describes the purpose of a script, the methodology it implements, and the output it produced on the 418-episode podcast dataset. It is a companion to Project_Documentation.docx (the v1 documentation), which covers the first-version lexicon features, the balanced 200-episode sample, and the dialogue-act analysis; references to “v1 Section N” point to that document.</w:t>
+        <w:t xml:space="preserve">This document records the second version (v2) of the project's linguistic feature analysis of host and guest speech in 418 Indian podcast episodes, in the order the scripts were built. Each section describes the purpose of a script, the methodology it implements, how it was run, and the output it produced.</w:t>
       </w:r>
     </w:p>
     <w:p>
       <w:r>
-        <w:t xml:space="preserve">It covers: src/compute_bias_features_v2.py (Section 1, per-speaker hedge, booster and politeness features adapted to speech), the precision audits built with src/make_audit_sample.py (Section 2), src/episode_dyads.py (Section 3, gender dyads over all 418 episodes), src/dyad_analysis_v2.py (Section 4, episode-level dyad dataset), src/stat_analysis/kruskal_wallis_test_v2.py (Section 5), and src/stat_analysis/Mann_Whitney_test_v2.py and src/stat_analysis/within_host_test_v2.py (Section 6, pairwise dyad tests and the guest-gender test within host).</w:t>
+        <w:t xml:space="preserve">It covers: src/compute_bias_features_v2.py (Section 1, per-speaker hedge, booster and politeness features adapted to speech), the precision audits built with src/make_audit_sample.py (Section 2), src/episode_dyads.py (Section 3, host→guest gender dyads), src/dyad_analysis_v2.py (Section 4, episode-level dyad dataset), src/stat_analysis/kruskal_wallis_test_v2.py (Section 5), and src/stat_analysis/Mann_Whitney_test_v2.py and src/stat_analysis/within_host_test_v2.py (Section 6, pairwise dyad tests and the guest-gender test within host).</w:t>
       </w:r>
     </w:p>
     <w:p>
@@ -93,7 +93,7 @@
     </w:p>
     <w:p>
       <w:r>
-        <w:t xml:space="preserve">The manual audit of the first version (v1 Section 5) showed that the hand-built lexicons in compute_bias_features.py (v1 Section 1) were unreliable: only 12 of 50 sampled "directive" matches were real directives. This script replaces the four hand-built lexicons with two published resources and adapts them to spontaneous podcast speech using repeated precision audits (Section 2). It produces one row of conversational style features per speaker per episode, over all 418 collected episodes rather than the balanced 200-episode sample.</w:t>
+        <w:t xml:space="preserve">The project's first feature script counted hedges, boosters, politeness and directives with four hand-built word lists, and a manual check found them unreliable: only 12 of 50 sampled "directive" matches were real directives. This script replaces those lists with two published resources and adapts them to spontaneous podcast speech using repeated precision audits (Section 2). It produces one row of conversational style features per speaker per episode, over all 418 collected episodes.</w:t>
       </w:r>
     </w:p>
     <w:p>
@@ -243,7 +243,7 @@
         <w:tc>
           <w:tcPr>
             <w:tcW w:type="dxa" w:w="2880"/>
-            <w:shd w:fill="2E5395"/>
+            <w:shd w:val="clear" w:color="auto" w:fill="2E5395"/>
           </w:tcPr>
           <w:p>
             <w:r>
@@ -258,7 +258,7 @@
         <w:tc>
           <w:tcPr>
             <w:tcW w:type="dxa" w:w="960"/>
-            <w:shd w:fill="2E5395"/>
+            <w:shd w:val="clear" w:color="auto" w:fill="2E5395"/>
           </w:tcPr>
           <w:p>
             <w:r>
@@ -273,7 +273,7 @@
         <w:tc>
           <w:tcPr>
             <w:tcW w:type="dxa" w:w="4800"/>
-            <w:shd w:fill="2E5395"/>
+            <w:shd w:val="clear" w:color="auto" w:fill="2E5395"/>
           </w:tcPr>
           <w:p>
             <w:r>
@@ -439,7 +439,7 @@
         <w:tc>
           <w:tcPr>
             <w:tcW w:type="dxa" w:w="1728"/>
-            <w:shd w:fill="2E5395"/>
+            <w:shd w:val="clear" w:color="auto" w:fill="2E5395"/>
           </w:tcPr>
           <w:p>
             <w:r>
@@ -454,7 +454,7 @@
         <w:tc>
           <w:tcPr>
             <w:tcW w:type="dxa" w:w="1728"/>
-            <w:shd w:fill="2E5395"/>
+            <w:shd w:val="clear" w:color="auto" w:fill="2E5395"/>
           </w:tcPr>
           <w:p>
             <w:r>
@@ -469,7 +469,7 @@
         <w:tc>
           <w:tcPr>
             <w:tcW w:type="dxa" w:w="1728"/>
-            <w:shd w:fill="2E5395"/>
+            <w:shd w:val="clear" w:color="auto" w:fill="2E5395"/>
           </w:tcPr>
           <w:p>
             <w:r>
@@ -484,7 +484,7 @@
         <w:tc>
           <w:tcPr>
             <w:tcW w:type="dxa" w:w="1728"/>
-            <w:shd w:fill="2E5395"/>
+            <w:shd w:val="clear" w:color="auto" w:fill="2E5395"/>
           </w:tcPr>
           <w:p>
             <w:r>
@@ -499,7 +499,7 @@
         <w:tc>
           <w:tcPr>
             <w:tcW w:type="dxa" w:w="1728"/>
-            <w:shd w:fill="2E5395"/>
+            <w:shd w:val="clear" w:color="auto" w:fill="2E5395"/>
           </w:tcPr>
           <w:p>
             <w:r>
@@ -653,7 +653,7 @@
         <w:tc>
           <w:tcPr>
             <w:tcW w:type="dxa" w:w="1728"/>
-            <w:shd w:fill="2E5395"/>
+            <w:shd w:val="clear" w:color="auto" w:fill="2E5395"/>
           </w:tcPr>
           <w:p>
             <w:r>
@@ -668,7 +668,7 @@
         <w:tc>
           <w:tcPr>
             <w:tcW w:type="dxa" w:w="1728"/>
-            <w:shd w:fill="2E5395"/>
+            <w:shd w:val="clear" w:color="auto" w:fill="2E5395"/>
           </w:tcPr>
           <w:p>
             <w:r>
@@ -683,7 +683,7 @@
         <w:tc>
           <w:tcPr>
             <w:tcW w:type="dxa" w:w="1728"/>
-            <w:shd w:fill="2E5395"/>
+            <w:shd w:val="clear" w:color="auto" w:fill="2E5395"/>
           </w:tcPr>
           <w:p>
             <w:r>
@@ -698,7 +698,7 @@
         <w:tc>
           <w:tcPr>
             <w:tcW w:type="dxa" w:w="3456"/>
-            <w:shd w:fill="2E5395"/>
+            <w:shd w:val="clear" w:color="auto" w:fill="2E5395"/>
           </w:tcPr>
           <w:p>
             <w:r>
@@ -994,7 +994,7 @@
     </w:p>
     <w:p>
       <w:r>
-        <w:t xml:space="preserve">The v1 lexical audit (v1 Section 5) showed that a feature can look plausible and still be mostly wrong. Before using the v2 features, each one was checked by hand: a random sample of the words the script counted was read in context, and each hit was marked correct or not. The results drove the adjustments in Section 1.2, and the audit was repeated after each change.</w:t>
+        <w:t xml:space="preserve">A word list can look plausible and still count mostly the wrong things. Before using the v2 features, each one was checked by hand: a random sample of the words the script counted was read in context, and each hit was marked correct or not. The results drove the adjustments in Section 1.2, and the audit was repeated after each change.</w:t>
       </w:r>
     </w:p>
     <w:p>
@@ -1088,7 +1088,7 @@
         <w:tc>
           <w:tcPr>
             <w:tcW w:type="dxa" w:w="897"/>
-            <w:shd w:fill="2E5395"/>
+            <w:shd w:val="clear" w:color="auto" w:fill="2E5395"/>
           </w:tcPr>
           <w:p>
             <w:r>
@@ -1103,7 +1103,7 @@
         <w:tc>
           <w:tcPr>
             <w:tcW w:type="dxa" w:w="1386"/>
-            <w:shd w:fill="2E5395"/>
+            <w:shd w:val="clear" w:color="auto" w:fill="2E5395"/>
           </w:tcPr>
           <w:p>
             <w:r>
@@ -1118,7 +1118,7 @@
         <w:tc>
           <w:tcPr>
             <w:tcW w:type="dxa" w:w="815"/>
-            <w:shd w:fill="2E5395"/>
+            <w:shd w:val="clear" w:color="auto" w:fill="2E5395"/>
           </w:tcPr>
           <w:p>
             <w:r>
@@ -1133,7 +1133,7 @@
         <w:tc>
           <w:tcPr>
             <w:tcW w:type="dxa" w:w="815"/>
-            <w:shd w:fill="2E5395"/>
+            <w:shd w:val="clear" w:color="auto" w:fill="2E5395"/>
           </w:tcPr>
           <w:p>
             <w:r>
@@ -1148,7 +1148,7 @@
         <w:tc>
           <w:tcPr>
             <w:tcW w:type="dxa" w:w="815"/>
-            <w:shd w:fill="2E5395"/>
+            <w:shd w:val="clear" w:color="auto" w:fill="2E5395"/>
           </w:tcPr>
           <w:p>
             <w:r>
@@ -1163,7 +1163,7 @@
         <w:tc>
           <w:tcPr>
             <w:tcW w:type="dxa" w:w="815"/>
-            <w:shd w:fill="2E5395"/>
+            <w:shd w:val="clear" w:color="auto" w:fill="2E5395"/>
           </w:tcPr>
           <w:p>
             <w:r>
@@ -1178,7 +1178,7 @@
         <w:tc>
           <w:tcPr>
             <w:tcW w:type="dxa" w:w="815"/>
-            <w:shd w:fill="2E5395"/>
+            <w:shd w:val="clear" w:color="auto" w:fill="2E5395"/>
           </w:tcPr>
           <w:p>
             <w:r>
@@ -1193,7 +1193,7 @@
         <w:tc>
           <w:tcPr>
             <w:tcW w:type="dxa" w:w="2282"/>
-            <w:shd w:fill="2E5395"/>
+            <w:shd w:val="clear" w:color="auto" w:fill="2E5395"/>
           </w:tcPr>
           <w:p>
             <w:r>
@@ -1659,7 +1659,7 @@
         <w:tc>
           <w:tcPr>
             <w:tcW w:type="dxa" w:w="1920"/>
-            <w:shd w:fill="2E5395"/>
+            <w:shd w:val="clear" w:color="auto" w:fill="2E5395"/>
           </w:tcPr>
           <w:p>
             <w:r>
@@ -1674,7 +1674,7 @@
         <w:tc>
           <w:tcPr>
             <w:tcW w:type="dxa" w:w="960"/>
-            <w:shd w:fill="2E5395"/>
+            <w:shd w:val="clear" w:color="auto" w:fill="2E5395"/>
           </w:tcPr>
           <w:p>
             <w:r>
@@ -1689,7 +1689,7 @@
         <w:tc>
           <w:tcPr>
             <w:tcW w:type="dxa" w:w="2304"/>
-            <w:shd w:fill="2E5395"/>
+            <w:shd w:val="clear" w:color="auto" w:fill="2E5395"/>
           </w:tcPr>
           <w:p>
             <w:r>
@@ -1704,7 +1704,7 @@
         <w:tc>
           <w:tcPr>
             <w:tcW w:type="dxa" w:w="1728"/>
-            <w:shd w:fill="2E5395"/>
+            <w:shd w:val="clear" w:color="auto" w:fill="2E5395"/>
           </w:tcPr>
           <w:p>
             <w:r>
@@ -1719,7 +1719,7 @@
         <w:tc>
           <w:tcPr>
             <w:tcW w:type="dxa" w:w="1728"/>
-            <w:shd w:fill="2E5395"/>
+            <w:shd w:val="clear" w:color="auto" w:fill="2E5395"/>
           </w:tcPr>
           <w:p>
             <w:r>
@@ -2057,7 +2057,7 @@
     </w:p>
     <w:p>
       <w:r>
-        <w:t xml:space="preserve">Assigns every episode its host→guest gender dyad, using all 418 episodes instead of the balanced 50-per-dyad sample used in v1 (balanced_dataset.py, v1 Section 2, stays available for robustness checks).</w:t>
+        <w:t xml:space="preserve">Assigns every episode its host→guest gender dyad, using all 418 episodes rather than a balanced subsample, so no episodes are discarded to equalize group sizes.</w:t>
       </w:r>
     </w:p>
     <w:p>
@@ -2137,7 +2137,7 @@
         <w:tc>
           <w:tcPr>
             <w:tcW w:type="dxa" w:w="4320"/>
-            <w:shd w:fill="2E5395"/>
+            <w:shd w:val="clear" w:color="auto" w:fill="2E5395"/>
           </w:tcPr>
           <w:p>
             <w:r>
@@ -2152,7 +2152,7 @@
         <w:tc>
           <w:tcPr>
             <w:tcW w:type="dxa" w:w="4320"/>
-            <w:shd w:fill="2E5395"/>
+            <w:shd w:val="clear" w:color="auto" w:fill="2E5395"/>
           </w:tcPr>
           <w:p>
             <w:r>
@@ -2309,7 +2309,7 @@
         <w:tc>
           <w:tcPr>
             <w:tcW w:type="dxa" w:w="3240"/>
-            <w:shd w:fill="2E5395"/>
+            <w:shd w:val="clear" w:color="auto" w:fill="2E5395"/>
           </w:tcPr>
           <w:p>
             <w:r>
@@ -2324,7 +2324,7 @@
         <w:tc>
           <w:tcPr>
             <w:tcW w:type="dxa" w:w="1080"/>
-            <w:shd w:fill="2E5395"/>
+            <w:shd w:val="clear" w:color="auto" w:fill="2E5395"/>
           </w:tcPr>
           <w:p>
             <w:r>
@@ -2339,7 +2339,7 @@
         <w:tc>
           <w:tcPr>
             <w:tcW w:type="dxa" w:w="1080"/>
-            <w:shd w:fill="2E5395"/>
+            <w:shd w:val="clear" w:color="auto" w:fill="2E5395"/>
           </w:tcPr>
           <w:p>
             <w:r>
@@ -2354,7 +2354,7 @@
         <w:tc>
           <w:tcPr>
             <w:tcW w:type="dxa" w:w="1080"/>
-            <w:shd w:fill="2E5395"/>
+            <w:shd w:val="clear" w:color="auto" w:fill="2E5395"/>
           </w:tcPr>
           <w:p>
             <w:r>
@@ -2369,7 +2369,7 @@
         <w:tc>
           <w:tcPr>
             <w:tcW w:type="dxa" w:w="1080"/>
-            <w:shd w:fill="2E5395"/>
+            <w:shd w:val="clear" w:color="auto" w:fill="2E5395"/>
           </w:tcPr>
           <w:p>
             <w:r>
@@ -2384,7 +2384,7 @@
         <w:tc>
           <w:tcPr>
             <w:tcW w:type="dxa" w:w="1080"/>
-            <w:shd w:fill="2E5395"/>
+            <w:shd w:val="clear" w:color="auto" w:fill="2E5395"/>
           </w:tcPr>
           <w:p>
             <w:r>
@@ -3066,7 +3066,7 @@
     </w:p>
     <w:p>
       <w:r>
-        <w:t xml:space="preserve">Builds the episode-level dyad dataset from the v2 features (the v2 counterpart of v1 Sections 3 and 4), with descriptive summaries by dyad and by host. The statistical tests on this dataset are separate scripts in src/stat_analysis/ (Sections 5 and 6).</w:t>
+        <w:t xml:space="preserve">Builds the episode-level dyad dataset from the v2 features, with descriptive summaries by dyad and by host. The statistical tests on this dataset are separate scripts in src/stat_analysis/ (Sections 5 and 6).</w:t>
       </w:r>
     </w:p>
     <w:p>
@@ -3098,7 +3098,7 @@
         <w:pStyle w:val="ListBullet"/>
       </w:pPr>
       <w:r>
-        <w:t xml:space="preserve">No host-minus-guest asymmetry columns. Because booster and deference precision differs between hosts and guests (Section 2.5), subtracting one from the other would mix two different error rates. Each role is instead compared across dyads, e.g. host hedging with male guests vs. female guests.</w:t>
+        <w:t xml:space="preserve">Host and guest are compared separately, not as a host-minus-guest difference. Because booster and deference precision differs between hosts and guests (Section 2.5), subtracting one from the other would mix two different error rates. Each role is instead compared across dyads, e.g. host hedging with male guests vs. female guests.</w:t>
       </w:r>
     </w:p>
     <w:p>
@@ -3154,7 +3154,7 @@
         <w:tc>
           <w:tcPr>
             <w:tcW w:type="dxa" w:w="4320"/>
-            <w:shd w:fill="2E5395"/>
+            <w:shd w:val="clear" w:color="auto" w:fill="2E5395"/>
           </w:tcPr>
           <w:p>
             <w:r>
@@ -3169,7 +3169,7 @@
         <w:tc>
           <w:tcPr>
             <w:tcW w:type="dxa" w:w="4320"/>
-            <w:shd w:fill="2E5395"/>
+            <w:shd w:val="clear" w:color="auto" w:fill="2E5395"/>
           </w:tcPr>
           <w:p>
             <w:r>
@@ -3276,7 +3276,7 @@
         <w:tc>
           <w:tcPr>
             <w:tcW w:type="dxa" w:w="3703"/>
-            <w:shd w:fill="2E5395"/>
+            <w:shd w:val="clear" w:color="auto" w:fill="2E5395"/>
           </w:tcPr>
           <w:p>
             <w:r>
@@ -3291,7 +3291,7 @@
         <w:tc>
           <w:tcPr>
             <w:tcW w:type="dxa" w:w="1234"/>
-            <w:shd w:fill="2E5395"/>
+            <w:shd w:val="clear" w:color="auto" w:fill="2E5395"/>
           </w:tcPr>
           <w:p>
             <w:r>
@@ -3306,7 +3306,7 @@
         <w:tc>
           <w:tcPr>
             <w:tcW w:type="dxa" w:w="1234"/>
-            <w:shd w:fill="2E5395"/>
+            <w:shd w:val="clear" w:color="auto" w:fill="2E5395"/>
           </w:tcPr>
           <w:p>
             <w:r>
@@ -3321,7 +3321,7 @@
         <w:tc>
           <w:tcPr>
             <w:tcW w:type="dxa" w:w="1234"/>
-            <w:shd w:fill="2E5395"/>
+            <w:shd w:val="clear" w:color="auto" w:fill="2E5395"/>
           </w:tcPr>
           <w:p>
             <w:r>
@@ -3336,7 +3336,7 @@
         <w:tc>
           <w:tcPr>
             <w:tcW w:type="dxa" w:w="1234"/>
-            <w:shd w:fill="2E5395"/>
+            <w:shd w:val="clear" w:color="auto" w:fill="2E5395"/>
           </w:tcPr>
           <w:p>
             <w:r>
@@ -3906,7 +3906,7 @@
         <w:tc>
           <w:tcPr>
             <w:tcW w:type="dxa" w:w="1938"/>
-            <w:shd w:fill="2E5395"/>
+            <w:shd w:val="clear" w:color="auto" w:fill="2E5395"/>
           </w:tcPr>
           <w:p>
             <w:r>
@@ -3921,7 +3921,7 @@
         <w:tc>
           <w:tcPr>
             <w:tcW w:type="dxa" w:w="565"/>
-            <w:shd w:fill="2E5395"/>
+            <w:shd w:val="clear" w:color="auto" w:fill="2E5395"/>
           </w:tcPr>
           <w:p>
             <w:r>
@@ -3936,7 +3936,7 @@
         <w:tc>
           <w:tcPr>
             <w:tcW w:type="dxa" w:w="646"/>
-            <w:shd w:fill="2E5395"/>
+            <w:shd w:val="clear" w:color="auto" w:fill="2E5395"/>
           </w:tcPr>
           <w:p>
             <w:r>
@@ -3951,7 +3951,7 @@
         <w:tc>
           <w:tcPr>
             <w:tcW w:type="dxa" w:w="888"/>
-            <w:shd w:fill="2E5395"/>
+            <w:shd w:val="clear" w:color="auto" w:fill="2E5395"/>
           </w:tcPr>
           <w:p>
             <w:r>
@@ -3966,7 +3966,7 @@
         <w:tc>
           <w:tcPr>
             <w:tcW w:type="dxa" w:w="888"/>
-            <w:shd w:fill="2E5395"/>
+            <w:shd w:val="clear" w:color="auto" w:fill="2E5395"/>
           </w:tcPr>
           <w:p>
             <w:r>
@@ -3981,7 +3981,7 @@
         <w:tc>
           <w:tcPr>
             <w:tcW w:type="dxa" w:w="969"/>
-            <w:shd w:fill="2E5395"/>
+            <w:shd w:val="clear" w:color="auto" w:fill="2E5395"/>
           </w:tcPr>
           <w:p>
             <w:r>
@@ -3996,7 +3996,7 @@
         <w:tc>
           <w:tcPr>
             <w:tcW w:type="dxa" w:w="888"/>
-            <w:shd w:fill="2E5395"/>
+            <w:shd w:val="clear" w:color="auto" w:fill="2E5395"/>
           </w:tcPr>
           <w:p>
             <w:r>
@@ -4011,7 +4011,7 @@
         <w:tc>
           <w:tcPr>
             <w:tcW w:type="dxa" w:w="888"/>
-            <w:shd w:fill="2E5395"/>
+            <w:shd w:val="clear" w:color="auto" w:fill="2E5395"/>
           </w:tcPr>
           <w:p>
             <w:r>
@@ -4026,7 +4026,7 @@
         <w:tc>
           <w:tcPr>
             <w:tcW w:type="dxa" w:w="969"/>
-            <w:shd w:fill="2E5395"/>
+            <w:shd w:val="clear" w:color="auto" w:fill="2E5395"/>
           </w:tcPr>
           <w:p>
             <w:r>
@@ -4892,7 +4892,7 @@
     </w:p>
     <w:p>
       <w:r>
-        <w:t xml:space="preserve">Tests whether each metric in results/dyads/dyad_analysis_v2.csv (Section 4) differs across the four gender dyads at all, before asking which dyads differ (Section 6). This is the v2 counterpart of v1 Section 8.</w:t>
+        <w:t xml:space="preserve">Tests whether each metric in results/dyads/dyad_analysis_v2.csv (Section 4) differs across the four gender dyads at all, before asking which dyads differ (Section 6).</w:t>
       </w:r>
     </w:p>
     <w:p>
@@ -4916,7 +4916,7 @@
         <w:pStyle w:val="ListBullet"/>
       </w:pPr>
       <w:r>
-        <w:t xml:space="preserve">Correct the 11 p-values for multiple testing with the Benjamini-Hochberg false discovery rate (FDR), and call a metric significant if its corrected p-value is below 0.05. (v1 Section 8 did not correct across metrics.)</w:t>
+        <w:t xml:space="preserve">Correct the 11 p-values for multiple testing with the Benjamini-Hochberg false discovery rate (FDR), and call a metric significant if its corrected p-value is below 0.05.</w:t>
       </w:r>
     </w:p>
     <w:p>
@@ -4975,7 +4975,7 @@
         <w:tc>
           <w:tcPr>
             <w:tcW w:type="dxa" w:w="3161"/>
-            <w:shd w:fill="2E5395"/>
+            <w:shd w:val="clear" w:color="auto" w:fill="2E5395"/>
           </w:tcPr>
           <w:p>
             <w:r>
@@ -4990,7 +4990,7 @@
         <w:tc>
           <w:tcPr>
             <w:tcW w:type="dxa" w:w="1370"/>
-            <w:shd w:fill="2E5395"/>
+            <w:shd w:val="clear" w:color="auto" w:fill="2E5395"/>
           </w:tcPr>
           <w:p>
             <w:r>
@@ -5005,7 +5005,7 @@
         <w:tc>
           <w:tcPr>
             <w:tcW w:type="dxa" w:w="1370"/>
-            <w:shd w:fill="2E5395"/>
+            <w:shd w:val="clear" w:color="auto" w:fill="2E5395"/>
           </w:tcPr>
           <w:p>
             <w:r>
@@ -5020,7 +5020,7 @@
         <w:tc>
           <w:tcPr>
             <w:tcW w:type="dxa" w:w="1370"/>
-            <w:shd w:fill="2E5395"/>
+            <w:shd w:val="clear" w:color="auto" w:fill="2E5395"/>
           </w:tcPr>
           <w:p>
             <w:r>
@@ -5035,7 +5035,7 @@
         <w:tc>
           <w:tcPr>
             <w:tcW w:type="dxa" w:w="1370"/>
-            <w:shd w:fill="2E5395"/>
+            <w:shd w:val="clear" w:color="auto" w:fill="2E5395"/>
           </w:tcPr>
           <w:p>
             <w:r>
@@ -5669,7 +5669,7 @@
     </w:p>
     <w:p>
       <w:r>
-        <w:t xml:space="preserve">Identifies which pairs of dyads differ for each significant metric (the v2 counterpart of v1 Section 9), and then checks which differences survive when the host is held fixed. Since each host interviews both female and male guests, guest-gender effects can be tested within each host's show; host-gender effects cannot.</w:t>
+        <w:t xml:space="preserve">Identifies which pairs of dyads differ for each significant metric, and then checks which differences survive when the host is held fixed. Since each host interviews both female and male guests, guest-gender effects can be tested within each host's show; host-gender effects cannot.</w:t>
       </w:r>
     </w:p>
     <w:p>
@@ -5685,7 +5685,7 @@
         <w:pStyle w:val="ListBullet"/>
       </w:pPr>
       <w:r>
-        <w:t xml:space="preserve">Pairwise (Mann_Whitney_test_v2.py): for each of the 10 metrics significant in Section 5 (read from kruskal_wallis_v2_results.csv), run a two-sided Mann-Whitney U test on all 6 dyad pairs, correct the 6 p-values with Benjamini-Hochberg FDR within each metric (as in v1 Section 9), and compute the rank-biserial correlation as effect size. Note the sign: here a positive value means dyad A is higher, the opposite of the convention in v1 Section 9.</w:t>
+        <w:t xml:space="preserve">Pairwise (Mann_Whitney_test_v2.py): for each of the 10 metrics significant in Section 5 (read from kruskal_wallis_v2_results.csv), run a two-sided Mann-Whitney U test on all 6 dyad pairs, correct the 6 p-values with Benjamini-Hochberg FDR within each metric, and compute the rank-biserial correlation as effect size. A positive value means dyad A is higher.</w:t>
       </w:r>
     </w:p>
     <w:p>
@@ -5776,7 +5776,7 @@
         <w:tc>
           <w:tcPr>
             <w:tcW w:type="dxa" w:w="2612"/>
-            <w:shd w:fill="2E5395"/>
+            <w:shd w:val="clear" w:color="auto" w:fill="2E5395"/>
           </w:tcPr>
           <w:p>
             <w:r>
@@ -5791,7 +5791,7 @@
         <w:tc>
           <w:tcPr>
             <w:tcW w:type="dxa" w:w="1005"/>
-            <w:shd w:fill="2E5395"/>
+            <w:shd w:val="clear" w:color="auto" w:fill="2E5395"/>
           </w:tcPr>
           <w:p>
             <w:r>
@@ -5806,7 +5806,7 @@
         <w:tc>
           <w:tcPr>
             <w:tcW w:type="dxa" w:w="1005"/>
-            <w:shd w:fill="2E5395"/>
+            <w:shd w:val="clear" w:color="auto" w:fill="2E5395"/>
           </w:tcPr>
           <w:p>
             <w:r>
@@ -5821,7 +5821,7 @@
         <w:tc>
           <w:tcPr>
             <w:tcW w:type="dxa" w:w="1005"/>
-            <w:shd w:fill="2E5395"/>
+            <w:shd w:val="clear" w:color="auto" w:fill="2E5395"/>
           </w:tcPr>
           <w:p>
             <w:r>
@@ -5836,7 +5836,7 @@
         <w:tc>
           <w:tcPr>
             <w:tcW w:type="dxa" w:w="1005"/>
-            <w:shd w:fill="2E5395"/>
+            <w:shd w:val="clear" w:color="auto" w:fill="2E5395"/>
           </w:tcPr>
           <w:p>
             <w:r>
@@ -5851,7 +5851,7 @@
         <w:tc>
           <w:tcPr>
             <w:tcW w:type="dxa" w:w="1005"/>
-            <w:shd w:fill="2E5395"/>
+            <w:shd w:val="clear" w:color="auto" w:fill="2E5395"/>
           </w:tcPr>
           <w:p>
             <w:r>
@@ -5866,7 +5866,7 @@
         <w:tc>
           <w:tcPr>
             <w:tcW w:type="dxa" w:w="1005"/>
-            <w:shd w:fill="2E5395"/>
+            <w:shd w:val="clear" w:color="auto" w:fill="2E5395"/>
           </w:tcPr>
           <w:p>
             <w:r>
@@ -6561,7 +6561,7 @@
         <w:tc>
           <w:tcPr>
             <w:tcW w:type="dxa" w:w="2279"/>
-            <w:shd w:fill="2E5395"/>
+            <w:shd w:val="clear" w:color="auto" w:fill="2E5395"/>
           </w:tcPr>
           <w:p>
             <w:r>
@@ -6576,7 +6576,7 @@
         <w:tc>
           <w:tcPr>
             <w:tcW w:type="dxa" w:w="1519"/>
-            <w:shd w:fill="2E5395"/>
+            <w:shd w:val="clear" w:color="auto" w:fill="2E5395"/>
           </w:tcPr>
           <w:p>
             <w:r>
@@ -6591,7 +6591,7 @@
         <w:tc>
           <w:tcPr>
             <w:tcW w:type="dxa" w:w="1044"/>
-            <w:shd w:fill="2E5395"/>
+            <w:shd w:val="clear" w:color="auto" w:fill="2E5395"/>
           </w:tcPr>
           <w:p>
             <w:r>
@@ -6606,7 +6606,7 @@
         <w:tc>
           <w:tcPr>
             <w:tcW w:type="dxa" w:w="1044"/>
-            <w:shd w:fill="2E5395"/>
+            <w:shd w:val="clear" w:color="auto" w:fill="2E5395"/>
           </w:tcPr>
           <w:p>
             <w:r>
@@ -6621,7 +6621,7 @@
         <w:tc>
           <w:tcPr>
             <w:tcW w:type="dxa" w:w="1424"/>
-            <w:shd w:fill="2E5395"/>
+            <w:shd w:val="clear" w:color="auto" w:fill="2E5395"/>
           </w:tcPr>
           <w:p>
             <w:r>
@@ -6636,7 +6636,7 @@
         <w:tc>
           <w:tcPr>
             <w:tcW w:type="dxa" w:w="1329"/>
-            <w:shd w:fill="2E5395"/>
+            <w:shd w:val="clear" w:color="auto" w:fill="2E5395"/>
           </w:tcPr>
           <w:p>
             <w:r>
@@ -7302,7 +7302,7 @@
         <w:tc>
           <w:tcPr>
             <w:tcW w:type="dxa" w:w="3086"/>
-            <w:shd w:fill="2E5395"/>
+            <w:shd w:val="clear" w:color="auto" w:fill="2E5395"/>
           </w:tcPr>
           <w:p>
             <w:r>
@@ -7317,7 +7317,7 @@
         <w:tc>
           <w:tcPr>
             <w:tcW w:type="dxa" w:w="1543"/>
-            <w:shd w:fill="2E5395"/>
+            <w:shd w:val="clear" w:color="auto" w:fill="2E5395"/>
           </w:tcPr>
           <w:p>
             <w:r>
@@ -7332,7 +7332,7 @@
         <w:tc>
           <w:tcPr>
             <w:tcW w:type="dxa" w:w="1543"/>
-            <w:shd w:fill="2E5395"/>
+            <w:shd w:val="clear" w:color="auto" w:fill="2E5395"/>
           </w:tcPr>
           <w:p>
             <w:r>
@@ -7347,7 +7347,7 @@
         <w:tc>
           <w:tcPr>
             <w:tcW w:type="dxa" w:w="1234"/>
-            <w:shd w:fill="2E5395"/>
+            <w:shd w:val="clear" w:color="auto" w:fill="2E5395"/>
           </w:tcPr>
           <w:p>
             <w:r>
@@ -7362,7 +7362,7 @@
         <w:tc>
           <w:tcPr>
             <w:tcW w:type="dxa" w:w="1234"/>
-            <w:shd w:fill="2E5395"/>
+            <w:shd w:val="clear" w:color="auto" w:fill="2E5395"/>
           </w:tcPr>
           <w:p>
             <w:r>
@@ -7977,7 +7977,7 @@
         <w:t xml:space="preserve">Direct questions may follow a cross-gender pattern. </w:t>
       </w:r>
       <w:r>
-        <w:t xml:space="preserve">Pooled, FM episodes have the most host direct questions, which agrees with v1 Section 9's finding that female hosts ask more (host_ask), but FF episodes do not. The exploratory within-host result suggests hosts ask more direct questions of guests of the other gender. This needs confirming.</w:t>
+        <w:t xml:space="preserve">Pooled, FM episodes have the most host direct questions but FF episodes do not, so this is not simply a host-gender difference. The exploratory within-host result suggests hosts ask more direct questions of guests of the other gender. This needs confirming.</w:t>
       </w:r>
     </w:p>
     <w:p>
@@ -8001,7 +8001,7 @@
         <w:pStyle w:val="ListBullet"/>
       </w:pPr>
       <w:r>
-        <w:t xml:space="preserve">These are associations in observational data. Guests are not randomly assigned to hosts, so female and male guests on the same show may also differ in profession or topic (compare the topic-control analyses), which could explain part of the guest-gender effects.</w:t>
+        <w:t xml:space="preserve">These are associations in observational data. Guests are not randomly assigned to hosts, so female and male guests on the same show may also differ in profession or topic, which this analysis does not control for and which could explain part of the guest-gender effects.</w:t>
       </w:r>
     </w:p>
     <w:p>

</xml_diff>

<commit_message>
Add speaking-time mixed-effects analysis (v2 documentation Section 7)
- speaking_time_v2.py: host/guest speaking time per episode from segment
  timestamps, host share, descriptives by dyad and by host
- stat_analysis/speaking_time_mixed_model_v2.py: host_time_share ~
  host_female * guest_female + (1 | host), between-within df, estimated
  means, contrasts, variance components, logit/word-share/balanced/
  leave-one-host-out/host-fixed-effects/rank-based checks, figures
- Project_Documentation_v2: Section 7 write-up

Co-Authored-By: Claude Opus 5.5 <noreply@anthropic.com>
</commit_message>
<xml_diff>
--- a/documentation/Project_Documentation_v2.docx
+++ b/documentation/Project_Documentation_v2.docx
@@ -72,7 +72,7 @@
     </w:p>
     <w:p>
       <w:r>
-        <w:t xml:space="preserve">It covers: src/compute_bias_features_v2.py (Section 1, per-speaker hedge, booster and politeness features adapted to speech), the precision audits built with src/make_audit_sample.py (Section 2), src/episode_dyads.py (Section 3, host→guest gender dyads), src/dyad_analysis_v2.py (Section 4, episode-level dyad dataset), src/stat_analysis/kruskal_wallis_test_v2.py (Section 5), and src/stat_analysis/Mann_Whitney_test_v2.py and src/stat_analysis/within_host_test_v2.py (Section 6, pairwise dyad tests and the guest-gender test within host).</w:t>
+        <w:t xml:space="preserve">It covers: src/compute_bias_features_v2.py (Section 1, per-speaker hedge, booster and politeness features adapted to speech), the precision audits built with src/make_audit_sample.py (Section 2), src/episode_dyads.py (Section 3, host→guest gender dyads), src/dyad_analysis_v2.py (Section 4, episode-level dyad dataset), src/stat_analysis/kruskal_wallis_test_v2.py (Section 5), and src/stat_analysis/Mann_Whitney_test_v2.py and src/stat_analysis/within_host_test_v2.py (Section 6, pairwise dyad tests and the guest-gender test within host), and src/speaking_time_v2.py with src/stat_analysis/speaking_time_mixed_model_v2.py (Section 7, host and guest speaking time and a mixed-effects model of the host's share).</w:t>
       </w:r>
     </w:p>
     <w:p>
@@ -8018,6 +8018,3441 @@
       </w:pPr>
       <w:r>
         <w:t xml:space="preserve">FDR correction is applied within each test family (11 omnibus metrics; 6 pairs per metric; 10 within-host metrics), not across all tests together.</w:t>
+      </w:r>
+    </w:p>
+    <w:p>
+      <w:pPr>
+        <w:pStyle w:val="Heading1"/>
+      </w:pPr>
+      <w:r>
+        <w:t xml:space="preserve">7. src/speaking_time_v2.py and src/stat_analysis/speaking_time_mixed_model_v2.py</w:t>
+      </w:r>
+    </w:p>
+    <w:p>
+      <w:pPr>
+        <w:pStyle w:val="Heading2"/>
+      </w:pPr>
+      <w:r>
+        <w:t xml:space="preserve">7.1 Purpose</w:t>
+      </w:r>
+    </w:p>
+    <w:p>
+      <w:r>
+        <w:t xml:space="preserve">Measures how much of each conversation the host and the guest speak, in time rather than words, and tests whether the host's share of speaking time depends on the host-&gt;guest gender dyad (MM, MF, FM, FF), using a linear mixed-effects model that separates gender effects from show-to-show variation.</w:t>
+      </w:r>
+    </w:p>
+    <w:p>
+      <w:pPr>
+        <w:pStyle w:val="Heading2"/>
+      </w:pPr>
+      <w:r>
+        <w:t xml:space="preserve">7.2 Methodology</w:t>
+      </w:r>
+    </w:p>
+    <w:p>
+      <w:pPr>
+        <w:pStyle w:val="ListBullet"/>
+      </w:pPr>
+      <w:r>
+        <w:t xml:space="preserve">Speaking time: for each speaker in each episode, the sum of (end - start) over their diarized WhisperX segments. As in Section 1, segments without a speaker are dropped and segments starting in the first or last 60 seconds of the episode are excluded. The host and guest of an episode are the HOST and GUEST speakers with the most words (Section 3).</w:t>
+      </w:r>
+    </w:p>
+    <w:p>
+      <w:pPr>
+        <w:pStyle w:val="ListBullet"/>
+      </w:pPr>
+      <w:r>
+        <w:t xml:space="preserve">Outcome: the host's share of the host-plus-guest speaking time, one value per episode. The guest's share is its complement, so modeling both speakers would add no information.</w:t>
+      </w:r>
+    </w:p>
+    <w:p>
+      <w:pPr>
+        <w:pStyle w:val="ListBullet"/>
+      </w:pPr>
+      <w:r>
+        <w:t xml:space="preserve">Model: host_time_share ~ host_female * guest_female + (1 | host). The two gender indicators and their interaction span the four dyads. The random intercept is per host (show), the level at which show-to-show variation lives; an episode-level random intercept is not identifiable, since each episode contributes one value.</w:t>
+      </w:r>
+    </w:p>
+    <w:p>
+      <w:pPr>
+        <w:pStyle w:val="ListBullet"/>
+      </w:pPr>
+      <w:r>
+        <w:t xml:space="preserve">The model uses the 389 episodes whose host matched the speaker library (9 hosts). The 29 episodes without a matched host have no host label and are excluded (MM 8, MF 0, FM 12, FF 9).</w:t>
+      </w:r>
+    </w:p>
+    <w:p>
+      <w:pPr>
+        <w:pStyle w:val="ListBullet"/>
+      </w:pPr>
+      <w:r>
+        <w:t xml:space="preserve">Estimation: restricted maximum likelihood (statsmodels MixedLM). With only 9 hosts, p-values use between-within degrees of freedom, a small-sample correction: terms that vary only between hosts (intercept, host gender) get 7 df (hosts minus 2); terms that vary within hosts (guest gender, interaction) get 378.</w:t>
+      </w:r>
+    </w:p>
+    <w:p>
+      <w:pPr>
+        <w:pStyle w:val="ListBullet"/>
+      </w:pPr>
+      <w:r>
+        <w:t xml:space="preserve">Reported: fixed effects; the model-estimated host share per dyad with 95% CIs; the 6 pairwise dyad contrasts (Holm-corrected); variance components, ICC and R2 (Nakagawa's marginal and conditional); likelihood-ratio tests of the host random effect (boundary-corrected) and of the interaction.</w:t>
+      </w:r>
+    </w:p>
+    <w:p>
+      <w:pPr>
+        <w:pStyle w:val="ListBullet"/>
+      </w:pPr>
+      <w:r>
+        <w:t xml:space="preserve">Checks: the outcome on the logit scale; word share instead of time share; the balanced 200-episode subset; each model re-fit leaving one host out; an OLS model with host fixed effects (guest-gender effect estimated strictly within host); and the rank-based within-host permutation test of Section 6.</w:t>
+      </w:r>
+    </w:p>
+    <w:p>
+      <w:pPr>
+        <w:pStyle w:val="Heading2"/>
+      </w:pPr>
+      <w:r>
+        <w:t xml:space="preserve">7.3 How It Was Run</w:t>
+      </w:r>
+    </w:p>
+    <w:p>
+      <w:r>
+        <w:rPr>
+          <w:rFonts w:ascii="Consolas" w:hAnsi="Consolas"/>
+          <w:sz w:val="20"/>
+        </w:rPr>
+        <w:t xml:space="preserve">python src/speaking_time_v2.py</w:t>
+      </w:r>
+    </w:p>
+    <w:p>
+      <w:r>
+        <w:rPr>
+          <w:rFonts w:ascii="Consolas" w:hAnsi="Consolas"/>
+          <w:sz w:val="20"/>
+        </w:rPr>
+        <w:t xml:space="preserve">python src/stat_analysis/speaking_time_mixed_model_v2.py</w:t>
+      </w:r>
+    </w:p>
+    <w:p>
+      <w:r>
+        <w:t xml:space="preserve">Both run in the convokit environment (the model needs statsmodels). Paths default to the files below.</w:t>
+      </w:r>
+    </w:p>
+    <w:p>
+      <w:pPr>
+        <w:pStyle w:val="Heading2"/>
+      </w:pPr>
+      <w:r>
+        <w:t xml:space="preserve">7.4 Output Files</w:t>
+      </w:r>
+    </w:p>
+    <w:tbl>
+      <w:tblPr>
+        <w:tblStyle w:val="LightGrid-Accent1"/>
+        <w:tblW w:type="auto" w:w="0"/>
+        <w:jc w:val="center"/>
+        <w:tblLook w:firstColumn="1" w:firstRow="1" w:lastColumn="0" w:lastRow="0" w:noHBand="0" w:noVBand="1" w:val="04A0"/>
+      </w:tblPr>
+      <w:tblGrid>
+        <w:gridCol w:w="4416"/>
+        <w:gridCol w:w="4224"/>
+      </w:tblGrid>
+      <w:tr>
+        <w:tc>
+          <w:tcPr>
+            <w:tcW w:type="dxa" w:w="4416"/>
+            <w:shd w:val="clear" w:color="auto" w:fill="2E5395"/>
+          </w:tcPr>
+          <w:p>
+            <w:r>
+              <w:rPr>
+                <w:b/>
+                <w:color w:val="FFFFFF"/>
+              </w:rPr>
+              <w:t xml:space="preserve">File</w:t>
+            </w:r>
+          </w:p>
+        </w:tc>
+        <w:tc>
+          <w:tcPr>
+            <w:tcW w:type="dxa" w:w="4224"/>
+            <w:shd w:val="clear" w:color="auto" w:fill="2E5395"/>
+          </w:tcPr>
+          <w:p>
+            <w:r>
+              <w:rPr>
+                <w:b/>
+                <w:color w:val="FFFFFF"/>
+              </w:rPr>
+              <w:t xml:space="preserve">Contents</w:t>
+            </w:r>
+          </w:p>
+        </w:tc>
+      </w:tr>
+      <w:tr>
+        <w:tc>
+          <w:tcPr>
+            <w:tcW w:type="dxa" w:w="4416"/>
+          </w:tcPr>
+          <w:p>
+            <w:r>
+              <w:t xml:space="preserve">results/features/speaking_time_v2.csv</w:t>
+            </w:r>
+          </w:p>
+        </w:tc>
+        <w:tc>
+          <w:tcPr>
+            <w:tcW w:type="dxa" w:w="4224"/>
+          </w:tcPr>
+          <w:p>
+            <w:r>
+              <w:t xml:space="preserve">Speaking time per (episode, speaker)</w:t>
+            </w:r>
+          </w:p>
+        </w:tc>
+      </w:tr>
+      <w:tr>
+        <w:tc>
+          <w:tcPr>
+            <w:tcW w:type="dxa" w:w="4416"/>
+          </w:tcPr>
+          <w:p>
+            <w:r>
+              <w:t xml:space="preserve">results/dyads/speaking_time_dyads_v2.csv</w:t>
+            </w:r>
+          </w:p>
+        </w:tc>
+        <w:tc>
+          <w:tcPr>
+            <w:tcW w:type="dxa" w:w="4224"/>
+          </w:tcPr>
+          <w:p>
+            <w:r>
+              <w:t xml:space="preserve">One row per episode: dyad, host, minutes, host share</w:t>
+            </w:r>
+          </w:p>
+        </w:tc>
+      </w:tr>
+      <w:tr>
+        <w:tc>
+          <w:tcPr>
+            <w:tcW w:type="dxa" w:w="4416"/>
+          </w:tcPr>
+          <w:p>
+            <w:r>
+              <w:t xml:space="preserve">results/dyads/speaking_time_by_dyad_v2.csv</w:t>
+            </w:r>
+          </w:p>
+        </w:tc>
+        <w:tc>
+          <w:tcPr>
+            <w:tcW w:type="dxa" w:w="4224"/>
+          </w:tcPr>
+          <w:p>
+            <w:r>
+              <w:t xml:space="preserve">Descriptives per dyad</w:t>
+            </w:r>
+          </w:p>
+        </w:tc>
+      </w:tr>
+      <w:tr>
+        <w:tc>
+          <w:tcPr>
+            <w:tcW w:type="dxa" w:w="4416"/>
+          </w:tcPr>
+          <w:p>
+            <w:r>
+              <w:t xml:space="preserve">results/dyads/speaking_time_by_host_v2.csv</w:t>
+            </w:r>
+          </w:p>
+        </w:tc>
+        <w:tc>
+          <w:tcPr>
+            <w:tcW w:type="dxa" w:w="4224"/>
+          </w:tcPr>
+          <w:p>
+            <w:r>
+              <w:t xml:space="preserve">Median host share per host and guest gender</w:t>
+            </w:r>
+          </w:p>
+        </w:tc>
+      </w:tr>
+      <w:tr>
+        <w:tc>
+          <w:tcPr>
+            <w:tcW w:type="dxa" w:w="4416"/>
+          </w:tcPr>
+          <w:p>
+            <w:r>
+              <w:t xml:space="preserve">results/stat_analysis/speaking_time_mixed_model_v2_*.csv</w:t>
+            </w:r>
+          </w:p>
+        </w:tc>
+        <w:tc>
+          <w:tcPr>
+            <w:tcW w:type="dxa" w:w="4224"/>
+          </w:tcPr>
+          <w:p>
+            <w:r>
+              <w:t xml:space="preserve">Fixed effects, estimated means, contrasts, variance, robustness, leave-one-host-out, rank test</w:t>
+            </w:r>
+          </w:p>
+        </w:tc>
+      </w:tr>
+      <w:tr>
+        <w:tc>
+          <w:tcPr>
+            <w:tcW w:type="dxa" w:w="4416"/>
+          </w:tcPr>
+          <w:p>
+            <w:r>
+              <w:t xml:space="preserve">results/figures/speaking_time_share_by_dyad.png</w:t>
+            </w:r>
+          </w:p>
+        </w:tc>
+        <w:tc>
+          <w:tcPr>
+            <w:tcW w:type="dxa" w:w="4224"/>
+          </w:tcPr>
+          <w:p>
+            <w:r>
+              <w:t xml:space="preserve">Figure 7.1</w:t>
+            </w:r>
+          </w:p>
+        </w:tc>
+      </w:tr>
+      <w:tr>
+        <w:tc>
+          <w:tcPr>
+            <w:tcW w:type="dxa" w:w="4416"/>
+          </w:tcPr>
+          <w:p>
+            <w:r>
+              <w:t xml:space="preserve">results/figures/speaking_time_model_diagnostics.png</w:t>
+            </w:r>
+          </w:p>
+        </w:tc>
+        <w:tc>
+          <w:tcPr>
+            <w:tcW w:type="dxa" w:w="4224"/>
+          </w:tcPr>
+          <w:p>
+            <w:r>
+              <w:t xml:space="preserve">Figure 7.2</w:t>
+            </w:r>
+          </w:p>
+        </w:tc>
+      </w:tr>
+    </w:tbl>
+    <w:p/>
+    <w:p>
+      <w:pPr>
+        <w:pStyle w:val="Heading2"/>
+      </w:pPr>
+      <w:r>
+        <w:t xml:space="preserve">7.5 Speaking Time by Dyad</w:t>
+      </w:r>
+    </w:p>
+    <w:tbl>
+      <w:tblPr>
+        <w:tblStyle w:val="LightGrid-Accent1"/>
+        <w:tblW w:type="auto" w:w="0"/>
+        <w:jc w:val="center"/>
+        <w:tblLook w:firstColumn="1" w:firstRow="1" w:lastColumn="0" w:lastRow="0" w:noHBand="0" w:noVBand="1" w:val="04A0"/>
+      </w:tblPr>
+      <w:tblGrid>
+        <w:gridCol w:w="1980"/>
+        <w:gridCol w:w="990"/>
+        <w:gridCol w:w="1260"/>
+        <w:gridCol w:w="1440"/>
+        <w:gridCol w:w="900"/>
+        <w:gridCol w:w="900"/>
+        <w:gridCol w:w="1170"/>
+      </w:tblGrid>
+      <w:tr>
+        <w:tc>
+          <w:tcPr>
+            <w:tcW w:type="dxa" w:w="1980"/>
+            <w:shd w:val="clear" w:color="auto" w:fill="2E5395"/>
+          </w:tcPr>
+          <w:p>
+            <w:r>
+              <w:rPr>
+                <w:b/>
+                <w:color w:val="FFFFFF"/>
+              </w:rPr>
+              <w:t xml:space="preserve">Dyad</w:t>
+            </w:r>
+          </w:p>
+        </w:tc>
+        <w:tc>
+          <w:tcPr>
+            <w:tcW w:type="dxa" w:w="990"/>
+            <w:shd w:val="clear" w:color="auto" w:fill="2E5395"/>
+          </w:tcPr>
+          <w:p>
+            <w:r>
+              <w:rPr>
+                <w:b/>
+                <w:color w:val="FFFFFF"/>
+              </w:rPr>
+              <w:t xml:space="preserve">Episodes</w:t>
+            </w:r>
+          </w:p>
+        </w:tc>
+        <w:tc>
+          <w:tcPr>
+            <w:tcW w:type="dxa" w:w="1260"/>
+            <w:shd w:val="clear" w:color="auto" w:fill="2E5395"/>
+          </w:tcPr>
+          <w:p>
+            <w:r>
+              <w:rPr>
+                <w:b/>
+                <w:color w:val="FFFFFF"/>
+              </w:rPr>
+              <w:t xml:space="preserve">Median host share</w:t>
+            </w:r>
+          </w:p>
+        </w:tc>
+        <w:tc>
+          <w:tcPr>
+            <w:tcW w:type="dxa" w:w="1440"/>
+            <w:shd w:val="clear" w:color="auto" w:fill="2E5395"/>
+          </w:tcPr>
+          <w:p>
+            <w:r>
+              <w:rPr>
+                <w:b/>
+                <w:color w:val="FFFFFF"/>
+              </w:rPr>
+              <w:t xml:space="preserve">IQR</w:t>
+            </w:r>
+          </w:p>
+        </w:tc>
+        <w:tc>
+          <w:tcPr>
+            <w:tcW w:type="dxa" w:w="900"/>
+            <w:shd w:val="clear" w:color="auto" w:fill="2E5395"/>
+          </w:tcPr>
+          <w:p>
+            <w:r>
+              <w:rPr>
+                <w:b/>
+                <w:color w:val="FFFFFF"/>
+              </w:rPr>
+              <w:t xml:space="preserve">Host min</w:t>
+            </w:r>
+          </w:p>
+        </w:tc>
+        <w:tc>
+          <w:tcPr>
+            <w:tcW w:type="dxa" w:w="900"/>
+            <w:shd w:val="clear" w:color="auto" w:fill="2E5395"/>
+          </w:tcPr>
+          <w:p>
+            <w:r>
+              <w:rPr>
+                <w:b/>
+                <w:color w:val="FFFFFF"/>
+              </w:rPr>
+              <w:t xml:space="preserve">Guest min</w:t>
+            </w:r>
+          </w:p>
+        </w:tc>
+        <w:tc>
+          <w:tcPr>
+            <w:tcW w:type="dxa" w:w="1170"/>
+            <w:shd w:val="clear" w:color="auto" w:fill="2E5395"/>
+          </w:tcPr>
+          <w:p>
+            <w:r>
+              <w:rPr>
+                <w:b/>
+                <w:color w:val="FFFFFF"/>
+              </w:rPr>
+              <w:t xml:space="preserve">Host+guest min</w:t>
+            </w:r>
+          </w:p>
+        </w:tc>
+      </w:tr>
+      <w:tr>
+        <w:tc>
+          <w:tcPr>
+            <w:tcW w:type="dxa" w:w="1980"/>
+          </w:tcPr>
+          <w:p>
+            <w:r>
+              <w:t xml:space="preserve">MALE-&gt;MALE</w:t>
+            </w:r>
+          </w:p>
+        </w:tc>
+        <w:tc>
+          <w:tcPr>
+            <w:tcW w:type="dxa" w:w="990"/>
+          </w:tcPr>
+          <w:p>
+            <w:r>
+              <w:t xml:space="preserve">226</w:t>
+            </w:r>
+          </w:p>
+        </w:tc>
+        <w:tc>
+          <w:tcPr>
+            <w:tcW w:type="dxa" w:w="1260"/>
+          </w:tcPr>
+          <w:p>
+            <w:r>
+              <w:t xml:space="preserve">21.3%</w:t>
+            </w:r>
+          </w:p>
+        </w:tc>
+        <w:tc>
+          <w:tcPr>
+            <w:tcW w:type="dxa" w:w="1440"/>
+          </w:tcPr>
+          <w:p>
+            <w:r>
+              <w:t xml:space="preserve">17.0%-28.1%</w:t>
+            </w:r>
+          </w:p>
+        </w:tc>
+        <w:tc>
+          <w:tcPr>
+            <w:tcW w:type="dxa" w:w="900"/>
+          </w:tcPr>
+          <w:p>
+            <w:r>
+              <w:t xml:space="preserve">13.8</w:t>
+            </w:r>
+          </w:p>
+        </w:tc>
+        <w:tc>
+          <w:tcPr>
+            <w:tcW w:type="dxa" w:w="900"/>
+          </w:tcPr>
+          <w:p>
+            <w:r>
+              <w:t xml:space="preserve">49.1</w:t>
+            </w:r>
+          </w:p>
+        </w:tc>
+        <w:tc>
+          <w:tcPr>
+            <w:tcW w:type="dxa" w:w="1170"/>
+          </w:tcPr>
+          <w:p>
+            <w:r>
+              <w:t xml:space="preserve">64.3</w:t>
+            </w:r>
+          </w:p>
+        </w:tc>
+      </w:tr>
+      <w:tr>
+        <w:tc>
+          <w:tcPr>
+            <w:tcW w:type="dxa" w:w="1980"/>
+          </w:tcPr>
+          <w:p>
+            <w:r>
+              <w:t xml:space="preserve">MALE-&gt;FEMALE</w:t>
+            </w:r>
+          </w:p>
+        </w:tc>
+        <w:tc>
+          <w:tcPr>
+            <w:tcW w:type="dxa" w:w="990"/>
+          </w:tcPr>
+          <w:p>
+            <w:r>
+              <w:t xml:space="preserve">67</w:t>
+            </w:r>
+          </w:p>
+        </w:tc>
+        <w:tc>
+          <w:tcPr>
+            <w:tcW w:type="dxa" w:w="1260"/>
+          </w:tcPr>
+          <w:p>
+            <w:r>
+              <w:t xml:space="preserve">26.3%</w:t>
+            </w:r>
+          </w:p>
+        </w:tc>
+        <w:tc>
+          <w:tcPr>
+            <w:tcW w:type="dxa" w:w="1440"/>
+          </w:tcPr>
+          <w:p>
+            <w:r>
+              <w:t xml:space="preserve">22.6%-32.8%</w:t>
+            </w:r>
+          </w:p>
+        </w:tc>
+        <w:tc>
+          <w:tcPr>
+            <w:tcW w:type="dxa" w:w="900"/>
+          </w:tcPr>
+          <w:p>
+            <w:r>
+              <w:t xml:space="preserve">18.0</w:t>
+            </w:r>
+          </w:p>
+        </w:tc>
+        <w:tc>
+          <w:tcPr>
+            <w:tcW w:type="dxa" w:w="900"/>
+          </w:tcPr>
+          <w:p>
+            <w:r>
+              <w:t xml:space="preserve">49.0</w:t>
+            </w:r>
+          </w:p>
+        </w:tc>
+        <w:tc>
+          <w:tcPr>
+            <w:tcW w:type="dxa" w:w="1170"/>
+          </w:tcPr>
+          <w:p>
+            <w:r>
+              <w:t xml:space="preserve">69.2</w:t>
+            </w:r>
+          </w:p>
+        </w:tc>
+      </w:tr>
+      <w:tr>
+        <w:tc>
+          <w:tcPr>
+            <w:tcW w:type="dxa" w:w="1980"/>
+          </w:tcPr>
+          <w:p>
+            <w:r>
+              <w:t xml:space="preserve">FEMALE-&gt;MALE</w:t>
+            </w:r>
+          </w:p>
+        </w:tc>
+        <w:tc>
+          <w:tcPr>
+            <w:tcW w:type="dxa" w:w="990"/>
+          </w:tcPr>
+          <w:p>
+            <w:r>
+              <w:t xml:space="preserve">64</w:t>
+            </w:r>
+          </w:p>
+        </w:tc>
+        <w:tc>
+          <w:tcPr>
+            <w:tcW w:type="dxa" w:w="1260"/>
+          </w:tcPr>
+          <w:p>
+            <w:r>
+              <w:t xml:space="preserve">19.0%</w:t>
+            </w:r>
+          </w:p>
+        </w:tc>
+        <w:tc>
+          <w:tcPr>
+            <w:tcW w:type="dxa" w:w="1440"/>
+          </w:tcPr>
+          <w:p>
+            <w:r>
+              <w:t xml:space="preserve">15.5%-21.4%</w:t>
+            </w:r>
+          </w:p>
+        </w:tc>
+        <w:tc>
+          <w:tcPr>
+            <w:tcW w:type="dxa" w:w="900"/>
+          </w:tcPr>
+          <w:p>
+            <w:r>
+              <w:t xml:space="preserve">7.8</w:t>
+            </w:r>
+          </w:p>
+        </w:tc>
+        <w:tc>
+          <w:tcPr>
+            <w:tcW w:type="dxa" w:w="900"/>
+          </w:tcPr>
+          <w:p>
+            <w:r>
+              <w:t xml:space="preserve">35.9</w:t>
+            </w:r>
+          </w:p>
+        </w:tc>
+        <w:tc>
+          <w:tcPr>
+            <w:tcW w:type="dxa" w:w="1170"/>
+          </w:tcPr>
+          <w:p>
+            <w:r>
+              <w:t xml:space="preserve">43.3</w:t>
+            </w:r>
+          </w:p>
+        </w:tc>
+      </w:tr>
+      <w:tr>
+        <w:tc>
+          <w:tcPr>
+            <w:tcW w:type="dxa" w:w="1980"/>
+          </w:tcPr>
+          <w:p>
+            <w:r>
+              <w:t xml:space="preserve">FEMALE-&gt;FEMALE</w:t>
+            </w:r>
+          </w:p>
+        </w:tc>
+        <w:tc>
+          <w:tcPr>
+            <w:tcW w:type="dxa" w:w="990"/>
+          </w:tcPr>
+          <w:p>
+            <w:r>
+              <w:t xml:space="preserve">61</w:t>
+            </w:r>
+          </w:p>
+        </w:tc>
+        <w:tc>
+          <w:tcPr>
+            <w:tcW w:type="dxa" w:w="1260"/>
+          </w:tcPr>
+          <w:p>
+            <w:r>
+              <w:t xml:space="preserve">19.8%</w:t>
+            </w:r>
+          </w:p>
+        </w:tc>
+        <w:tc>
+          <w:tcPr>
+            <w:tcW w:type="dxa" w:w="1440"/>
+          </w:tcPr>
+          <w:p>
+            <w:r>
+              <w:t xml:space="preserve">15.2%-25.0%</w:t>
+            </w:r>
+          </w:p>
+        </w:tc>
+        <w:tc>
+          <w:tcPr>
+            <w:tcW w:type="dxa" w:w="900"/>
+          </w:tcPr>
+          <w:p>
+            <w:r>
+              <w:t xml:space="preserve">8.0</w:t>
+            </w:r>
+          </w:p>
+        </w:tc>
+        <w:tc>
+          <w:tcPr>
+            <w:tcW w:type="dxa" w:w="900"/>
+          </w:tcPr>
+          <w:p>
+            <w:r>
+              <w:t xml:space="preserve">36.3</w:t>
+            </w:r>
+          </w:p>
+        </w:tc>
+        <w:tc>
+          <w:tcPr>
+            <w:tcW w:type="dxa" w:w="1170"/>
+          </w:tcPr>
+          <w:p>
+            <w:r>
+              <w:t xml:space="preserve">45.6</w:t>
+            </w:r>
+          </w:p>
+        </w:tc>
+      </w:tr>
+    </w:tbl>
+    <w:p/>
+    <w:p>
+      <w:r>
+        <w:t xml:space="preserve">All 418 episodes; minutes are medians per episode, after excluding the first and last minute. Guests speak for most of every conversation: the median host share is 19-26% across dyads. Episodes hosted by men are longer (about 65-70 minutes of host and guest speech, against about 45 for episodes hosted by women). Time-based and word-based host share agree closely (r = 0.986).</w:t>
+      </w:r>
+    </w:p>
+    <w:p>
+      <w:pPr>
+        <w:jc w:val="center"/>
+      </w:pPr>
+      <w:r>
+        <w:drawing>
+          <wp:inline xmlns:a="http://schemas.openxmlformats.org/drawingml/2006/main" xmlns:pic="http://schemas.openxmlformats.org/drawingml/2006/picture">
+            <wp:extent cx="5486400" cy="3429000"/>
+            <wp:docPr id="100" name="Picture 100"/>
+            <wp:cNvGraphicFramePr>
+              <a:graphicFrameLocks noChangeAspect="1"/>
+            </wp:cNvGraphicFramePr>
+            <a:graphic>
+              <a:graphicData uri="http://schemas.openxmlformats.org/drawingml/2006/picture">
+                <pic:pic>
+                  <pic:nvPicPr>
+                    <pic:cNvPr id="0" name="speaking_time_share_by_dyad.png"/>
+                    <pic:cNvPicPr/>
+                  </pic:nvPicPr>
+                  <pic:blipFill>
+                    <a:blip r:embed="rIdFig1"/>
+                    <a:stretch>
+                      <a:fillRect/>
+                    </a:stretch>
+                  </pic:blipFill>
+                  <pic:spPr>
+                    <a:xfrm>
+                      <a:off x="0" y="0"/>
+                      <a:ext cx="5486400" cy="3429000"/>
+                    </a:xfrm>
+                    <a:prstGeom prst="rect"/>
+                  </pic:spPr>
+                </pic:pic>
+              </a:graphicData>
+            </a:graphic>
+          </wp:inline>
+        </w:drawing>
+      </w:r>
+    </w:p>
+    <w:p>
+      <w:r>
+        <w:t xml:space="preserve">Figure 7.1. Host share of speaking time by dyad for the episodes in the model. Points are episodes, colored by host; boxes show the median and IQR; diamonds are the model estimates with 95% CIs.</w:t>
+      </w:r>
+    </w:p>
+    <w:p>
+      <w:r>
+        <w:t xml:space="preserve">Median host share for each host, by guest gender:</w:t>
+      </w:r>
+    </w:p>
+    <w:tbl>
+      <w:tblPr>
+        <w:tblStyle w:val="LightGrid-Accent1"/>
+        <w:tblW w:type="auto" w:w="0"/>
+        <w:jc w:val="center"/>
+        <w:tblLook w:firstColumn="1" w:firstRow="1" w:lastColumn="0" w:lastRow="0" w:noHBand="0" w:noVBand="1" w:val="04A0"/>
+      </w:tblPr>
+      <w:tblGrid>
+        <w:gridCol w:w="2206"/>
+        <w:gridCol w:w="643"/>
+        <w:gridCol w:w="1103"/>
+        <w:gridCol w:w="1103"/>
+        <w:gridCol w:w="1195"/>
+        <w:gridCol w:w="1195"/>
+        <w:gridCol w:w="1195"/>
+      </w:tblGrid>
+      <w:tr>
+        <w:tc>
+          <w:tcPr>
+            <w:tcW w:type="dxa" w:w="2206"/>
+            <w:shd w:val="clear" w:color="auto" w:fill="2E5395"/>
+          </w:tcPr>
+          <w:p>
+            <w:r>
+              <w:rPr>
+                <w:b/>
+                <w:color w:val="FFFFFF"/>
+              </w:rPr>
+              <w:t xml:space="preserve">Host</w:t>
+            </w:r>
+          </w:p>
+        </w:tc>
+        <w:tc>
+          <w:tcPr>
+            <w:tcW w:type="dxa" w:w="643"/>
+            <w:shd w:val="clear" w:color="auto" w:fill="2E5395"/>
+          </w:tcPr>
+          <w:p>
+            <w:r>
+              <w:rPr>
+                <w:b/>
+                <w:color w:val="FFFFFF"/>
+              </w:rPr>
+              <w:t xml:space="preserve">Sex</w:t>
+            </w:r>
+          </w:p>
+        </w:tc>
+        <w:tc>
+          <w:tcPr>
+            <w:tcW w:type="dxa" w:w="1103"/>
+            <w:shd w:val="clear" w:color="auto" w:fill="2E5395"/>
+          </w:tcPr>
+          <w:p>
+            <w:r>
+              <w:rPr>
+                <w:b/>
+                <w:color w:val="FFFFFF"/>
+              </w:rPr>
+              <w:t xml:space="preserve">Eps. (F guest)</w:t>
+            </w:r>
+          </w:p>
+        </w:tc>
+        <w:tc>
+          <w:tcPr>
+            <w:tcW w:type="dxa" w:w="1103"/>
+            <w:shd w:val="clear" w:color="auto" w:fill="2E5395"/>
+          </w:tcPr>
+          <w:p>
+            <w:r>
+              <w:rPr>
+                <w:b/>
+                <w:color w:val="FFFFFF"/>
+              </w:rPr>
+              <w:t xml:space="preserve">Eps. (M guest)</w:t>
+            </w:r>
+          </w:p>
+        </w:tc>
+        <w:tc>
+          <w:tcPr>
+            <w:tcW w:type="dxa" w:w="1195"/>
+            <w:shd w:val="clear" w:color="auto" w:fill="2E5395"/>
+          </w:tcPr>
+          <w:p>
+            <w:r>
+              <w:rPr>
+                <w:b/>
+                <w:color w:val="FFFFFF"/>
+              </w:rPr>
+              <w:t xml:space="preserve">Share, F guest</w:t>
+            </w:r>
+          </w:p>
+        </w:tc>
+        <w:tc>
+          <w:tcPr>
+            <w:tcW w:type="dxa" w:w="1195"/>
+            <w:shd w:val="clear" w:color="auto" w:fill="2E5395"/>
+          </w:tcPr>
+          <w:p>
+            <w:r>
+              <w:rPr>
+                <w:b/>
+                <w:color w:val="FFFFFF"/>
+              </w:rPr>
+              <w:t xml:space="preserve">Share, M guest</w:t>
+            </w:r>
+          </w:p>
+        </w:tc>
+        <w:tc>
+          <w:tcPr>
+            <w:tcW w:type="dxa" w:w="1195"/>
+            <w:shd w:val="clear" w:color="auto" w:fill="2E5395"/>
+          </w:tcPr>
+          <w:p>
+            <w:r>
+              <w:rPr>
+                <w:b/>
+                <w:color w:val="FFFFFF"/>
+              </w:rPr>
+              <w:t xml:space="preserve">Difference</w:t>
+            </w:r>
+          </w:p>
+        </w:tc>
+      </w:tr>
+      <w:tr>
+        <w:tc>
+          <w:tcPr>
+            <w:tcW w:type="dxa" w:w="2206"/>
+          </w:tcPr>
+          <w:p>
+            <w:r>
+              <w:t xml:space="preserve">Faye Dsouza</w:t>
+            </w:r>
+          </w:p>
+        </w:tc>
+        <w:tc>
+          <w:tcPr>
+            <w:tcW w:type="dxa" w:w="643"/>
+          </w:tcPr>
+          <w:p>
+            <w:r>
+              <w:t xml:space="preserve">F</w:t>
+            </w:r>
+          </w:p>
+        </w:tc>
+        <w:tc>
+          <w:tcPr>
+            <w:tcW w:type="dxa" w:w="1103"/>
+          </w:tcPr>
+          <w:p>
+            <w:r>
+              <w:t xml:space="preserve">14</w:t>
+            </w:r>
+          </w:p>
+        </w:tc>
+        <w:tc>
+          <w:tcPr>
+            <w:tcW w:type="dxa" w:w="1103"/>
+          </w:tcPr>
+          <w:p>
+            <w:r>
+              <w:t xml:space="preserve">19</w:t>
+            </w:r>
+          </w:p>
+        </w:tc>
+        <w:tc>
+          <w:tcPr>
+            <w:tcW w:type="dxa" w:w="1195"/>
+          </w:tcPr>
+          <w:p>
+            <w:r>
+              <w:t xml:space="preserve">19.9%</w:t>
+            </w:r>
+          </w:p>
+        </w:tc>
+        <w:tc>
+          <w:tcPr>
+            <w:tcW w:type="dxa" w:w="1195"/>
+          </w:tcPr>
+          <w:p>
+            <w:r>
+              <w:t xml:space="preserve">19.0%</w:t>
+            </w:r>
+          </w:p>
+        </w:tc>
+        <w:tc>
+          <w:tcPr>
+            <w:tcW w:type="dxa" w:w="1195"/>
+          </w:tcPr>
+          <w:p>
+            <w:r>
+              <w:t xml:space="preserve">+0.9 pts</w:t>
+            </w:r>
+          </w:p>
+        </w:tc>
+      </w:tr>
+      <w:tr>
+        <w:tc>
+          <w:tcPr>
+            <w:tcW w:type="dxa" w:w="2206"/>
+          </w:tcPr>
+          <w:p>
+            <w:r>
+              <w:t xml:space="preserve">Karishma Mehta</w:t>
+            </w:r>
+          </w:p>
+        </w:tc>
+        <w:tc>
+          <w:tcPr>
+            <w:tcW w:type="dxa" w:w="643"/>
+          </w:tcPr>
+          <w:p>
+            <w:r>
+              <w:t xml:space="preserve">F</w:t>
+            </w:r>
+          </w:p>
+        </w:tc>
+        <w:tc>
+          <w:tcPr>
+            <w:tcW w:type="dxa" w:w="1103"/>
+          </w:tcPr>
+          <w:p>
+            <w:r>
+              <w:t xml:space="preserve">32</w:t>
+            </w:r>
+          </w:p>
+        </w:tc>
+        <w:tc>
+          <w:tcPr>
+            <w:tcW w:type="dxa" w:w="1103"/>
+          </w:tcPr>
+          <w:p>
+            <w:r>
+              <w:t xml:space="preserve">28</w:t>
+            </w:r>
+          </w:p>
+        </w:tc>
+        <w:tc>
+          <w:tcPr>
+            <w:tcW w:type="dxa" w:w="1195"/>
+          </w:tcPr>
+          <w:p>
+            <w:r>
+              <w:t xml:space="preserve">19.8%</w:t>
+            </w:r>
+          </w:p>
+        </w:tc>
+        <w:tc>
+          <w:tcPr>
+            <w:tcW w:type="dxa" w:w="1195"/>
+          </w:tcPr>
+          <w:p>
+            <w:r>
+              <w:t xml:space="preserve">17.7%</w:t>
+            </w:r>
+          </w:p>
+        </w:tc>
+        <w:tc>
+          <w:tcPr>
+            <w:tcW w:type="dxa" w:w="1195"/>
+          </w:tcPr>
+          <w:p>
+            <w:r>
+              <w:t xml:space="preserve">+2.0 pts</w:t>
+            </w:r>
+          </w:p>
+        </w:tc>
+      </w:tr>
+      <w:tr>
+        <w:tc>
+          <w:tcPr>
+            <w:tcW w:type="dxa" w:w="2206"/>
+          </w:tcPr>
+          <w:p>
+            <w:r>
+              <w:t xml:space="preserve">Pooja Dhingra</w:t>
+            </w:r>
+          </w:p>
+        </w:tc>
+        <w:tc>
+          <w:tcPr>
+            <w:tcW w:type="dxa" w:w="643"/>
+          </w:tcPr>
+          <w:p>
+            <w:r>
+              <w:t xml:space="preserve">F</w:t>
+            </w:r>
+          </w:p>
+        </w:tc>
+        <w:tc>
+          <w:tcPr>
+            <w:tcW w:type="dxa" w:w="1103"/>
+          </w:tcPr>
+          <w:p>
+            <w:r>
+              <w:t xml:space="preserve">5</w:t>
+            </w:r>
+          </w:p>
+        </w:tc>
+        <w:tc>
+          <w:tcPr>
+            <w:tcW w:type="dxa" w:w="1103"/>
+          </w:tcPr>
+          <w:p>
+            <w:r>
+              <w:t xml:space="preserve">4</w:t>
+            </w:r>
+          </w:p>
+        </w:tc>
+        <w:tc>
+          <w:tcPr>
+            <w:tcW w:type="dxa" w:w="1195"/>
+          </w:tcPr>
+          <w:p>
+            <w:r>
+              <w:t xml:space="preserve">21.7%</w:t>
+            </w:r>
+          </w:p>
+        </w:tc>
+        <w:tc>
+          <w:tcPr>
+            <w:tcW w:type="dxa" w:w="1195"/>
+          </w:tcPr>
+          <w:p>
+            <w:r>
+              <w:t xml:space="preserve">24.2%</w:t>
+            </w:r>
+          </w:p>
+        </w:tc>
+        <w:tc>
+          <w:tcPr>
+            <w:tcW w:type="dxa" w:w="1195"/>
+          </w:tcPr>
+          <w:p>
+            <w:r>
+              <w:t xml:space="preserve">-2.5 pts</w:t>
+            </w:r>
+          </w:p>
+        </w:tc>
+      </w:tr>
+      <w:tr>
+        <w:tc>
+          <w:tcPr>
+            <w:tcW w:type="dxa" w:w="2206"/>
+          </w:tcPr>
+          <w:p>
+            <w:r>
+              <w:t xml:space="preserve">Soha Ali Khan</w:t>
+            </w:r>
+          </w:p>
+        </w:tc>
+        <w:tc>
+          <w:tcPr>
+            <w:tcW w:type="dxa" w:w="643"/>
+          </w:tcPr>
+          <w:p>
+            <w:r>
+              <w:t xml:space="preserve">F</w:t>
+            </w:r>
+          </w:p>
+        </w:tc>
+        <w:tc>
+          <w:tcPr>
+            <w:tcW w:type="dxa" w:w="1103"/>
+          </w:tcPr>
+          <w:p>
+            <w:r>
+              <w:t xml:space="preserve">1</w:t>
+            </w:r>
+          </w:p>
+        </w:tc>
+        <w:tc>
+          <w:tcPr>
+            <w:tcW w:type="dxa" w:w="1103"/>
+          </w:tcPr>
+          <w:p>
+            <w:r>
+              <w:t xml:space="preserve">1</w:t>
+            </w:r>
+          </w:p>
+        </w:tc>
+        <w:tc>
+          <w:tcPr>
+            <w:tcW w:type="dxa" w:w="1195"/>
+          </w:tcPr>
+          <w:p>
+            <w:r>
+              <w:t xml:space="preserve">15.0%</w:t>
+            </w:r>
+          </w:p>
+        </w:tc>
+        <w:tc>
+          <w:tcPr>
+            <w:tcW w:type="dxa" w:w="1195"/>
+          </w:tcPr>
+          <w:p>
+            <w:r>
+              <w:t xml:space="preserve">28.5%</w:t>
+            </w:r>
+          </w:p>
+        </w:tc>
+        <w:tc>
+          <w:tcPr>
+            <w:tcW w:type="dxa" w:w="1195"/>
+          </w:tcPr>
+          <w:p>
+            <w:r>
+              <w:t xml:space="preserve">-13.6 pts</w:t>
+            </w:r>
+          </w:p>
+        </w:tc>
+      </w:tr>
+      <w:tr>
+        <w:tc>
+          <w:tcPr>
+            <w:tcW w:type="dxa" w:w="2206"/>
+          </w:tcPr>
+          <w:p>
+            <w:r>
+              <w:t xml:space="preserve">Nikhil Kamath</w:t>
+            </w:r>
+          </w:p>
+        </w:tc>
+        <w:tc>
+          <w:tcPr>
+            <w:tcW w:type="dxa" w:w="643"/>
+          </w:tcPr>
+          <w:p>
+            <w:r>
+              <w:t xml:space="preserve">M</w:t>
+            </w:r>
+          </w:p>
+        </w:tc>
+        <w:tc>
+          <w:tcPr>
+            <w:tcW w:type="dxa" w:w="1103"/>
+          </w:tcPr>
+          <w:p>
+            <w:r>
+              <w:t xml:space="preserve">—</w:t>
+            </w:r>
+          </w:p>
+        </w:tc>
+        <w:tc>
+          <w:tcPr>
+            <w:tcW w:type="dxa" w:w="1103"/>
+          </w:tcPr>
+          <w:p>
+            <w:r>
+              <w:t xml:space="preserve">15</w:t>
+            </w:r>
+          </w:p>
+        </w:tc>
+        <w:tc>
+          <w:tcPr>
+            <w:tcW w:type="dxa" w:w="1195"/>
+          </w:tcPr>
+          <w:p>
+            <w:r>
+              <w:t xml:space="preserve">—</w:t>
+            </w:r>
+          </w:p>
+        </w:tc>
+        <w:tc>
+          <w:tcPr>
+            <w:tcW w:type="dxa" w:w="1195"/>
+          </w:tcPr>
+          <w:p>
+            <w:r>
+              <w:t xml:space="preserve">21.1%</w:t>
+            </w:r>
+          </w:p>
+        </w:tc>
+        <w:tc>
+          <w:tcPr>
+            <w:tcW w:type="dxa" w:w="1195"/>
+          </w:tcPr>
+          <w:p>
+            <w:r>
+              <w:t xml:space="preserve">—</w:t>
+            </w:r>
+          </w:p>
+        </w:tc>
+      </w:tr>
+      <w:tr>
+        <w:tc>
+          <w:tcPr>
+            <w:tcW w:type="dxa" w:w="2206"/>
+          </w:tcPr>
+          <w:p>
+            <w:r>
+              <w:t xml:space="preserve">Prakhar Gupta</w:t>
+            </w:r>
+          </w:p>
+        </w:tc>
+        <w:tc>
+          <w:tcPr>
+            <w:tcW w:type="dxa" w:w="643"/>
+          </w:tcPr>
+          <w:p>
+            <w:r>
+              <w:t xml:space="preserve">M</w:t>
+            </w:r>
+          </w:p>
+        </w:tc>
+        <w:tc>
+          <w:tcPr>
+            <w:tcW w:type="dxa" w:w="1103"/>
+          </w:tcPr>
+          <w:p>
+            <w:r>
+              <w:t xml:space="preserve">5</w:t>
+            </w:r>
+          </w:p>
+        </w:tc>
+        <w:tc>
+          <w:tcPr>
+            <w:tcW w:type="dxa" w:w="1103"/>
+          </w:tcPr>
+          <w:p>
+            <w:r>
+              <w:t xml:space="preserve">18</w:t>
+            </w:r>
+          </w:p>
+        </w:tc>
+        <w:tc>
+          <w:tcPr>
+            <w:tcW w:type="dxa" w:w="1195"/>
+          </w:tcPr>
+          <w:p>
+            <w:r>
+              <w:t xml:space="preserve">30.7%</w:t>
+            </w:r>
+          </w:p>
+        </w:tc>
+        <w:tc>
+          <w:tcPr>
+            <w:tcW w:type="dxa" w:w="1195"/>
+          </w:tcPr>
+          <w:p>
+            <w:r>
+              <w:t xml:space="preserve">21.9%</w:t>
+            </w:r>
+          </w:p>
+        </w:tc>
+        <w:tc>
+          <w:tcPr>
+            <w:tcW w:type="dxa" w:w="1195"/>
+          </w:tcPr>
+          <w:p>
+            <w:r>
+              <w:t xml:space="preserve">+8.7 pts</w:t>
+            </w:r>
+          </w:p>
+        </w:tc>
+      </w:tr>
+      <w:tr>
+        <w:tc>
+          <w:tcPr>
+            <w:tcW w:type="dxa" w:w="2206"/>
+          </w:tcPr>
+          <w:p>
+            <w:r>
+              <w:t xml:space="preserve">Raj Shamani</w:t>
+            </w:r>
+          </w:p>
+        </w:tc>
+        <w:tc>
+          <w:tcPr>
+            <w:tcW w:type="dxa" w:w="643"/>
+          </w:tcPr>
+          <w:p>
+            <w:r>
+              <w:t xml:space="preserve">M</w:t>
+            </w:r>
+          </w:p>
+        </w:tc>
+        <w:tc>
+          <w:tcPr>
+            <w:tcW w:type="dxa" w:w="1103"/>
+          </w:tcPr>
+          <w:p>
+            <w:r>
+              <w:t xml:space="preserve">32</w:t>
+            </w:r>
+          </w:p>
+        </w:tc>
+        <w:tc>
+          <w:tcPr>
+            <w:tcW w:type="dxa" w:w="1103"/>
+          </w:tcPr>
+          <w:p>
+            <w:r>
+              <w:t xml:space="preserve">117</w:t>
+            </w:r>
+          </w:p>
+        </w:tc>
+        <w:tc>
+          <w:tcPr>
+            <w:tcW w:type="dxa" w:w="1195"/>
+          </w:tcPr>
+          <w:p>
+            <w:r>
+              <w:t xml:space="preserve">25.9%</w:t>
+            </w:r>
+          </w:p>
+        </w:tc>
+        <w:tc>
+          <w:tcPr>
+            <w:tcW w:type="dxa" w:w="1195"/>
+          </w:tcPr>
+          <w:p>
+            <w:r>
+              <w:t xml:space="preserve">20.8%</w:t>
+            </w:r>
+          </w:p>
+        </w:tc>
+        <w:tc>
+          <w:tcPr>
+            <w:tcW w:type="dxa" w:w="1195"/>
+          </w:tcPr>
+          <w:p>
+            <w:r>
+              <w:t xml:space="preserve">+5.1 pts</w:t>
+            </w:r>
+          </w:p>
+        </w:tc>
+      </w:tr>
+      <w:tr>
+        <w:tc>
+          <w:tcPr>
+            <w:tcW w:type="dxa" w:w="2206"/>
+          </w:tcPr>
+          <w:p>
+            <w:r>
+              <w:t xml:space="preserve">Ranveer A</w:t>
+            </w:r>
+          </w:p>
+        </w:tc>
+        <w:tc>
+          <w:tcPr>
+            <w:tcW w:type="dxa" w:w="643"/>
+          </w:tcPr>
+          <w:p>
+            <w:r>
+              <w:t xml:space="preserve">M</w:t>
+            </w:r>
+          </w:p>
+        </w:tc>
+        <w:tc>
+          <w:tcPr>
+            <w:tcW w:type="dxa" w:w="1103"/>
+          </w:tcPr>
+          <w:p>
+            <w:r>
+              <w:t xml:space="preserve">26</w:t>
+            </w:r>
+          </w:p>
+        </w:tc>
+        <w:tc>
+          <w:tcPr>
+            <w:tcW w:type="dxa" w:w="1103"/>
+          </w:tcPr>
+          <w:p>
+            <w:r>
+              <w:t xml:space="preserve">49</w:t>
+            </w:r>
+          </w:p>
+        </w:tc>
+        <w:tc>
+          <w:tcPr>
+            <w:tcW w:type="dxa" w:w="1195"/>
+          </w:tcPr>
+          <w:p>
+            <w:r>
+              <w:t xml:space="preserve">26.7%</w:t>
+            </w:r>
+          </w:p>
+        </w:tc>
+        <w:tc>
+          <w:tcPr>
+            <w:tcW w:type="dxa" w:w="1195"/>
+          </w:tcPr>
+          <w:p>
+            <w:r>
+              <w:t xml:space="preserve">23.1%</w:t>
+            </w:r>
+          </w:p>
+        </w:tc>
+        <w:tc>
+          <w:tcPr>
+            <w:tcW w:type="dxa" w:w="1195"/>
+          </w:tcPr>
+          <w:p>
+            <w:r>
+              <w:t xml:space="preserve">+3.6 pts</w:t>
+            </w:r>
+          </w:p>
+        </w:tc>
+      </w:tr>
+      <w:tr>
+        <w:tc>
+          <w:tcPr>
+            <w:tcW w:type="dxa" w:w="2206"/>
+          </w:tcPr>
+          <w:p>
+            <w:r>
+              <w:t xml:space="preserve">Samdish Bhatia</w:t>
+            </w:r>
+          </w:p>
+        </w:tc>
+        <w:tc>
+          <w:tcPr>
+            <w:tcW w:type="dxa" w:w="643"/>
+          </w:tcPr>
+          <w:p>
+            <w:r>
+              <w:t xml:space="preserve">M</w:t>
+            </w:r>
+          </w:p>
+        </w:tc>
+        <w:tc>
+          <w:tcPr>
+            <w:tcW w:type="dxa" w:w="1103"/>
+          </w:tcPr>
+          <w:p>
+            <w:r>
+              <w:t xml:space="preserve">4</w:t>
+            </w:r>
+          </w:p>
+        </w:tc>
+        <w:tc>
+          <w:tcPr>
+            <w:tcW w:type="dxa" w:w="1103"/>
+          </w:tcPr>
+          <w:p>
+            <w:r>
+              <w:t xml:space="preserve">19</w:t>
+            </w:r>
+          </w:p>
+        </w:tc>
+        <w:tc>
+          <w:tcPr>
+            <w:tcW w:type="dxa" w:w="1195"/>
+          </w:tcPr>
+          <w:p>
+            <w:r>
+              <w:t xml:space="preserve">23.1%</w:t>
+            </w:r>
+          </w:p>
+        </w:tc>
+        <w:tc>
+          <w:tcPr>
+            <w:tcW w:type="dxa" w:w="1195"/>
+          </w:tcPr>
+          <w:p>
+            <w:r>
+              <w:t xml:space="preserve">22.3%</w:t>
+            </w:r>
+          </w:p>
+        </w:tc>
+        <w:tc>
+          <w:tcPr>
+            <w:tcW w:type="dxa" w:w="1195"/>
+          </w:tcPr>
+          <w:p>
+            <w:r>
+              <w:t xml:space="preserve">+0.8 pts</w:t>
+            </w:r>
+          </w:p>
+        </w:tc>
+      </w:tr>
+    </w:tbl>
+    <w:p/>
+    <w:p>
+      <w:r>
+        <w:t xml:space="preserve">Six of the seven hosts with several episodes of each guest gender take a larger share with female guests (Pooja Dhingra, with 5 and 4 episodes, is the exception; Soha Ali Khan has one of each).</w:t>
+      </w:r>
+    </w:p>
+    <w:p>
+      <w:pPr>
+        <w:pStyle w:val="Heading2"/>
+      </w:pPr>
+      <w:r>
+        <w:t xml:space="preserve">7.6 Model Results</w:t>
+      </w:r>
+    </w:p>
+    <w:tbl>
+      <w:tblPr>
+        <w:tblStyle w:val="LightGrid-Accent1"/>
+        <w:tblW w:type="auto" w:w="0"/>
+        <w:jc w:val="center"/>
+        <w:tblLook w:firstColumn="1" w:firstRow="1" w:lastColumn="0" w:lastRow="0" w:noHBand="0" w:noVBand="1" w:val="04A0"/>
+      </w:tblPr>
+      <w:tblGrid>
+        <w:gridCol w:w="3142"/>
+        <w:gridCol w:w="1080"/>
+        <w:gridCol w:w="884"/>
+        <w:gridCol w:w="687"/>
+        <w:gridCol w:w="1865"/>
+        <w:gridCol w:w="982"/>
+      </w:tblGrid>
+      <w:tr>
+        <w:tc>
+          <w:tcPr>
+            <w:tcW w:type="dxa" w:w="3142"/>
+            <w:shd w:val="clear" w:color="auto" w:fill="2E5395"/>
+          </w:tcPr>
+          <w:p>
+            <w:r>
+              <w:rPr>
+                <w:b/>
+                <w:color w:val="FFFFFF"/>
+              </w:rPr>
+              <w:t xml:space="preserve">Term</w:t>
+            </w:r>
+          </w:p>
+        </w:tc>
+        <w:tc>
+          <w:tcPr>
+            <w:tcW w:type="dxa" w:w="1080"/>
+            <w:shd w:val="clear" w:color="auto" w:fill="2E5395"/>
+          </w:tcPr>
+          <w:p>
+            <w:r>
+              <w:rPr>
+                <w:b/>
+                <w:color w:val="FFFFFF"/>
+              </w:rPr>
+              <w:t xml:space="preserve">Estimate</w:t>
+            </w:r>
+          </w:p>
+        </w:tc>
+        <w:tc>
+          <w:tcPr>
+            <w:tcW w:type="dxa" w:w="884"/>
+            <w:shd w:val="clear" w:color="auto" w:fill="2E5395"/>
+          </w:tcPr>
+          <w:p>
+            <w:r>
+              <w:rPr>
+                <w:b/>
+                <w:color w:val="FFFFFF"/>
+              </w:rPr>
+              <w:t xml:space="preserve">SE</w:t>
+            </w:r>
+          </w:p>
+        </w:tc>
+        <w:tc>
+          <w:tcPr>
+            <w:tcW w:type="dxa" w:w="687"/>
+            <w:shd w:val="clear" w:color="auto" w:fill="2E5395"/>
+          </w:tcPr>
+          <w:p>
+            <w:r>
+              <w:rPr>
+                <w:b/>
+                <w:color w:val="FFFFFF"/>
+              </w:rPr>
+              <w:t xml:space="preserve">df</w:t>
+            </w:r>
+          </w:p>
+        </w:tc>
+        <w:tc>
+          <w:tcPr>
+            <w:tcW w:type="dxa" w:w="1865"/>
+            <w:shd w:val="clear" w:color="auto" w:fill="2E5395"/>
+          </w:tcPr>
+          <w:p>
+            <w:r>
+              <w:rPr>
+                <w:b/>
+                <w:color w:val="FFFFFF"/>
+              </w:rPr>
+              <w:t xml:space="preserve">95% CI</w:t>
+            </w:r>
+          </w:p>
+        </w:tc>
+        <w:tc>
+          <w:tcPr>
+            <w:tcW w:type="dxa" w:w="982"/>
+            <w:shd w:val="clear" w:color="auto" w:fill="2E5395"/>
+          </w:tcPr>
+          <w:p>
+            <w:r>
+              <w:rPr>
+                <w:b/>
+                <w:color w:val="FFFFFF"/>
+              </w:rPr>
+              <w:t xml:space="preserve">p</w:t>
+            </w:r>
+          </w:p>
+        </w:tc>
+      </w:tr>
+      <w:tr>
+        <w:tc>
+          <w:tcPr>
+            <w:tcW w:type="dxa" w:w="3142"/>
+          </w:tcPr>
+          <w:p>
+            <w:r>
+              <w:t xml:space="preserve">Intercept (male host, male guest)</w:t>
+            </w:r>
+          </w:p>
+        </w:tc>
+        <w:tc>
+          <w:tcPr>
+            <w:tcW w:type="dxa" w:w="1080"/>
+          </w:tcPr>
+          <w:p>
+            <w:r>
+              <w:t xml:space="preserve">+0.2375</w:t>
+            </w:r>
+          </w:p>
+        </w:tc>
+        <w:tc>
+          <w:tcPr>
+            <w:tcW w:type="dxa" w:w="884"/>
+          </w:tcPr>
+          <w:p>
+            <w:r>
+              <w:t xml:space="preserve">0.0070</w:t>
+            </w:r>
+          </w:p>
+        </w:tc>
+        <w:tc>
+          <w:tcPr>
+            <w:tcW w:type="dxa" w:w="687"/>
+          </w:tcPr>
+          <w:p>
+            <w:r>
+              <w:t xml:space="preserve">7</w:t>
+            </w:r>
+          </w:p>
+        </w:tc>
+        <w:tc>
+          <w:tcPr>
+            <w:tcW w:type="dxa" w:w="1865"/>
+          </w:tcPr>
+          <w:p>
+            <w:r>
+              <w:t xml:space="preserve">+0.221 to +0.254</w:t>
+            </w:r>
+          </w:p>
+        </w:tc>
+        <w:tc>
+          <w:tcPr>
+            <w:tcW w:type="dxa" w:w="982"/>
+          </w:tcPr>
+          <w:p>
+            <w:r>
+              <w:t xml:space="preserve">&lt;0.0001</w:t>
+            </w:r>
+          </w:p>
+        </w:tc>
+      </w:tr>
+      <w:tr>
+        <w:tc>
+          <w:tcPr>
+            <w:tcW w:type="dxa" w:w="3142"/>
+          </w:tcPr>
+          <w:p>
+            <w:r>
+              <w:t xml:space="preserve">Host female</w:t>
+            </w:r>
+          </w:p>
+        </w:tc>
+        <w:tc>
+          <w:tcPr>
+            <w:tcW w:type="dxa" w:w="1080"/>
+          </w:tcPr>
+          <w:p>
+            <w:r>
+              <w:t xml:space="preserve">-0.0526</w:t>
+            </w:r>
+          </w:p>
+        </w:tc>
+        <w:tc>
+          <w:tcPr>
+            <w:tcW w:type="dxa" w:w="884"/>
+          </w:tcPr>
+          <w:p>
+            <w:r>
+              <w:t xml:space="preserve">0.0145</w:t>
+            </w:r>
+          </w:p>
+        </w:tc>
+        <w:tc>
+          <w:tcPr>
+            <w:tcW w:type="dxa" w:w="687"/>
+          </w:tcPr>
+          <w:p>
+            <w:r>
+              <w:t xml:space="preserve">7</w:t>
+            </w:r>
+          </w:p>
+        </w:tc>
+        <w:tc>
+          <w:tcPr>
+            <w:tcW w:type="dxa" w:w="1865"/>
+          </w:tcPr>
+          <w:p>
+            <w:r>
+              <w:t xml:space="preserve">-0.087 to -0.018</w:t>
+            </w:r>
+          </w:p>
+        </w:tc>
+        <w:tc>
+          <w:tcPr>
+            <w:tcW w:type="dxa" w:w="982"/>
+          </w:tcPr>
+          <w:p>
+            <w:r>
+              <w:t xml:space="preserve">0.0083</w:t>
+            </w:r>
+          </w:p>
+        </w:tc>
+      </w:tr>
+      <w:tr>
+        <w:tc>
+          <w:tcPr>
+            <w:tcW w:type="dxa" w:w="3142"/>
+          </w:tcPr>
+          <w:p>
+            <w:r>
+              <w:t xml:space="preserve">Guest female</w:t>
+            </w:r>
+          </w:p>
+        </w:tc>
+        <w:tc>
+          <w:tcPr>
+            <w:tcW w:type="dxa" w:w="1080"/>
+          </w:tcPr>
+          <w:p>
+            <w:r>
+              <w:t xml:space="preserve">+0.0393</w:t>
+            </w:r>
+          </w:p>
+        </w:tc>
+        <w:tc>
+          <w:tcPr>
+            <w:tcW w:type="dxa" w:w="884"/>
+          </w:tcPr>
+          <w:p>
+            <w:r>
+              <w:t xml:space="preserve">0.0131</w:t>
+            </w:r>
+          </w:p>
+        </w:tc>
+        <w:tc>
+          <w:tcPr>
+            <w:tcW w:type="dxa" w:w="687"/>
+          </w:tcPr>
+          <w:p>
+            <w:r>
+              <w:t xml:space="preserve">378</w:t>
+            </w:r>
+          </w:p>
+        </w:tc>
+        <w:tc>
+          <w:tcPr>
+            <w:tcW w:type="dxa" w:w="1865"/>
+          </w:tcPr>
+          <w:p>
+            <w:r>
+              <w:t xml:space="preserve">+0.014 to +0.065</w:t>
+            </w:r>
+          </w:p>
+        </w:tc>
+        <w:tc>
+          <w:tcPr>
+            <w:tcW w:type="dxa" w:w="982"/>
+          </w:tcPr>
+          <w:p>
+            <w:r>
+              <w:t xml:space="preserve">0.0029</w:t>
+            </w:r>
+          </w:p>
+        </w:tc>
+      </w:tr>
+      <w:tr>
+        <w:tc>
+          <w:tcPr>
+            <w:tcW w:type="dxa" w:w="3142"/>
+          </w:tcPr>
+          <w:p>
+            <w:r>
+              <w:t xml:space="preserve">Host female × guest female</w:t>
+            </w:r>
+          </w:p>
+        </w:tc>
+        <w:tc>
+          <w:tcPr>
+            <w:tcW w:type="dxa" w:w="1080"/>
+          </w:tcPr>
+          <w:p>
+            <w:r>
+              <w:t xml:space="preserve">-0.0176</w:t>
+            </w:r>
+          </w:p>
+        </w:tc>
+        <w:tc>
+          <w:tcPr>
+            <w:tcW w:type="dxa" w:w="884"/>
+          </w:tcPr>
+          <w:p>
+            <w:r>
+              <w:t xml:space="preserve">0.0225</w:t>
+            </w:r>
+          </w:p>
+        </w:tc>
+        <w:tc>
+          <w:tcPr>
+            <w:tcW w:type="dxa" w:w="687"/>
+          </w:tcPr>
+          <w:p>
+            <w:r>
+              <w:t xml:space="preserve">378</w:t>
+            </w:r>
+          </w:p>
+        </w:tc>
+        <w:tc>
+          <w:tcPr>
+            <w:tcW w:type="dxa" w:w="1865"/>
+          </w:tcPr>
+          <w:p>
+            <w:r>
+              <w:t xml:space="preserve">-0.062 to +0.027</w:t>
+            </w:r>
+          </w:p>
+        </w:tc>
+        <w:tc>
+          <w:tcPr>
+            <w:tcW w:type="dxa" w:w="982"/>
+          </w:tcPr>
+          <w:p>
+            <w:r>
+              <w:t xml:space="preserve">0.4342</w:t>
+            </w:r>
+          </w:p>
+        </w:tc>
+      </w:tr>
+    </w:tbl>
+    <w:p/>
+    <w:p>
+      <w:r>
+        <w:t xml:space="preserve">Estimates are in share units (0.039 = 3.9 percentage points). Model-estimated host share per dyad:</w:t>
+      </w:r>
+    </w:p>
+    <w:tbl>
+      <w:tblPr>
+        <w:tblStyle w:val="LightGrid-Accent1"/>
+        <w:tblW w:type="auto" w:w="0"/>
+        <w:jc w:val="center"/>
+        <w:tblLook w:firstColumn="1" w:firstRow="1" w:lastColumn="0" w:lastRow="0" w:noHBand="0" w:noVBand="1" w:val="04A0"/>
+      </w:tblPr>
+      <w:tblGrid>
+        <w:gridCol w:w="2805"/>
+        <w:gridCol w:w="1346"/>
+        <w:gridCol w:w="2244"/>
+        <w:gridCol w:w="2244"/>
+      </w:tblGrid>
+      <w:tr>
+        <w:tc>
+          <w:tcPr>
+            <w:tcW w:type="dxa" w:w="2805"/>
+            <w:shd w:val="clear" w:color="auto" w:fill="2E5395"/>
+          </w:tcPr>
+          <w:p>
+            <w:r>
+              <w:rPr>
+                <w:b/>
+                <w:color w:val="FFFFFF"/>
+              </w:rPr>
+              <w:t xml:space="preserve">Dyad</w:t>
+            </w:r>
+          </w:p>
+        </w:tc>
+        <w:tc>
+          <w:tcPr>
+            <w:tcW w:type="dxa" w:w="1346"/>
+            <w:shd w:val="clear" w:color="auto" w:fill="2E5395"/>
+          </w:tcPr>
+          <w:p>
+            <w:r>
+              <w:rPr>
+                <w:b/>
+                <w:color w:val="FFFFFF"/>
+              </w:rPr>
+              <w:t xml:space="preserve">Episodes</w:t>
+            </w:r>
+          </w:p>
+        </w:tc>
+        <w:tc>
+          <w:tcPr>
+            <w:tcW w:type="dxa" w:w="2244"/>
+            <w:shd w:val="clear" w:color="auto" w:fill="2E5395"/>
+          </w:tcPr>
+          <w:p>
+            <w:r>
+              <w:rPr>
+                <w:b/>
+                <w:color w:val="FFFFFF"/>
+              </w:rPr>
+              <w:t xml:space="preserve">Estimated host share</w:t>
+            </w:r>
+          </w:p>
+        </w:tc>
+        <w:tc>
+          <w:tcPr>
+            <w:tcW w:type="dxa" w:w="2244"/>
+            <w:shd w:val="clear" w:color="auto" w:fill="2E5395"/>
+          </w:tcPr>
+          <w:p>
+            <w:r>
+              <w:rPr>
+                <w:b/>
+                <w:color w:val="FFFFFF"/>
+              </w:rPr>
+              <w:t xml:space="preserve">95% CI</w:t>
+            </w:r>
+          </w:p>
+        </w:tc>
+      </w:tr>
+      <w:tr>
+        <w:tc>
+          <w:tcPr>
+            <w:tcW w:type="dxa" w:w="2805"/>
+          </w:tcPr>
+          <w:p>
+            <w:r>
+              <w:t xml:space="preserve">MALE-&gt;MALE</w:t>
+            </w:r>
+          </w:p>
+        </w:tc>
+        <w:tc>
+          <w:tcPr>
+            <w:tcW w:type="dxa" w:w="1346"/>
+          </w:tcPr>
+          <w:p>
+            <w:r>
+              <w:t xml:space="preserve">218</w:t>
+            </w:r>
+          </w:p>
+        </w:tc>
+        <w:tc>
+          <w:tcPr>
+            <w:tcW w:type="dxa" w:w="2244"/>
+          </w:tcPr>
+          <w:p>
+            <w:r>
+              <w:t xml:space="preserve">23.7%</w:t>
+            </w:r>
+          </w:p>
+        </w:tc>
+        <w:tc>
+          <w:tcPr>
+            <w:tcW w:type="dxa" w:w="2244"/>
+          </w:tcPr>
+          <w:p>
+            <w:r>
+              <w:t xml:space="preserve">22.1%-25.4%</w:t>
+            </w:r>
+          </w:p>
+        </w:tc>
+      </w:tr>
+      <w:tr>
+        <w:tc>
+          <w:tcPr>
+            <w:tcW w:type="dxa" w:w="2805"/>
+          </w:tcPr>
+          <w:p>
+            <w:r>
+              <w:t xml:space="preserve">MALE-&gt;FEMALE</w:t>
+            </w:r>
+          </w:p>
+        </w:tc>
+        <w:tc>
+          <w:tcPr>
+            <w:tcW w:type="dxa" w:w="1346"/>
+          </w:tcPr>
+          <w:p>
+            <w:r>
+              <w:t xml:space="preserve">67</w:t>
+            </w:r>
+          </w:p>
+        </w:tc>
+        <w:tc>
+          <w:tcPr>
+            <w:tcW w:type="dxa" w:w="2244"/>
+          </w:tcPr>
+          <w:p>
+            <w:r>
+              <w:t xml:space="preserve">27.7%</w:t>
+            </w:r>
+          </w:p>
+        </w:tc>
+        <w:tc>
+          <w:tcPr>
+            <w:tcW w:type="dxa" w:w="2244"/>
+          </w:tcPr>
+          <w:p>
+            <w:r>
+              <w:t xml:space="preserve">25.0%-30.4%</w:t>
+            </w:r>
+          </w:p>
+        </w:tc>
+      </w:tr>
+      <w:tr>
+        <w:tc>
+          <w:tcPr>
+            <w:tcW w:type="dxa" w:w="2805"/>
+          </w:tcPr>
+          <w:p>
+            <w:r>
+              <w:t xml:space="preserve">FEMALE-&gt;MALE</w:t>
+            </w:r>
+          </w:p>
+        </w:tc>
+        <w:tc>
+          <w:tcPr>
+            <w:tcW w:type="dxa" w:w="1346"/>
+          </w:tcPr>
+          <w:p>
+            <w:r>
+              <w:t xml:space="preserve">52</w:t>
+            </w:r>
+          </w:p>
+        </w:tc>
+        <w:tc>
+          <w:tcPr>
+            <w:tcW w:type="dxa" w:w="2244"/>
+          </w:tcPr>
+          <w:p>
+            <w:r>
+              <w:t xml:space="preserve">18.5%</w:t>
+            </w:r>
+          </w:p>
+        </w:tc>
+        <w:tc>
+          <w:tcPr>
+            <w:tcW w:type="dxa" w:w="2244"/>
+          </w:tcPr>
+          <w:p>
+            <w:r>
+              <w:t xml:space="preserve">15.4%-21.6%</w:t>
+            </w:r>
+          </w:p>
+        </w:tc>
+      </w:tr>
+      <w:tr>
+        <w:tc>
+          <w:tcPr>
+            <w:tcW w:type="dxa" w:w="2805"/>
+          </w:tcPr>
+          <w:p>
+            <w:r>
+              <w:t xml:space="preserve">FEMALE-&gt;FEMALE</w:t>
+            </w:r>
+          </w:p>
+        </w:tc>
+        <w:tc>
+          <w:tcPr>
+            <w:tcW w:type="dxa" w:w="1346"/>
+          </w:tcPr>
+          <w:p>
+            <w:r>
+              <w:t xml:space="preserve">52</w:t>
+            </w:r>
+          </w:p>
+        </w:tc>
+        <w:tc>
+          <w:tcPr>
+            <w:tcW w:type="dxa" w:w="2244"/>
+          </w:tcPr>
+          <w:p>
+            <w:r>
+              <w:t xml:space="preserve">20.7%</w:t>
+            </w:r>
+          </w:p>
+        </w:tc>
+        <w:tc>
+          <w:tcPr>
+            <w:tcW w:type="dxa" w:w="2244"/>
+          </w:tcPr>
+          <w:p>
+            <w:r>
+              <w:t xml:space="preserve">17.6%-23.7%</w:t>
+            </w:r>
+          </w:p>
+        </w:tc>
+      </w:tr>
+    </w:tbl>
+    <w:p/>
+    <w:p>
+      <w:r>
+        <w:t xml:space="preserve">Pairwise contrasts (difference in host share, first minus second; Holm-corrected across the 6):</w:t>
+      </w:r>
+    </w:p>
+    <w:tbl>
+      <w:tblPr>
+        <w:tblStyle w:val="LightGrid-Accent1"/>
+        <w:tblW w:type="auto" w:w="0"/>
+        <w:jc w:val="center"/>
+        <w:tblLook w:firstColumn="1" w:firstRow="1" w:lastColumn="0" w:lastRow="0" w:noHBand="0" w:noVBand="1" w:val="04A0"/>
+      </w:tblPr>
+      <w:tblGrid>
+        <w:gridCol w:w="1312"/>
+        <w:gridCol w:w="1422"/>
+        <w:gridCol w:w="2844"/>
+        <w:gridCol w:w="766"/>
+        <w:gridCol w:w="1094"/>
+        <w:gridCol w:w="1203"/>
+      </w:tblGrid>
+      <w:tr>
+        <w:tc>
+          <w:tcPr>
+            <w:tcW w:type="dxa" w:w="1312"/>
+            <w:shd w:val="clear" w:color="auto" w:fill="2E5395"/>
+          </w:tcPr>
+          <w:p>
+            <w:r>
+              <w:rPr>
+                <w:b/>
+                <w:color w:val="FFFFFF"/>
+              </w:rPr>
+              <w:t xml:space="preserve">Contrast</w:t>
+            </w:r>
+          </w:p>
+        </w:tc>
+        <w:tc>
+          <w:tcPr>
+            <w:tcW w:type="dxa" w:w="1422"/>
+            <w:shd w:val="clear" w:color="auto" w:fill="2E5395"/>
+          </w:tcPr>
+          <w:p>
+            <w:r>
+              <w:rPr>
+                <w:b/>
+                <w:color w:val="FFFFFF"/>
+              </w:rPr>
+              <w:t xml:space="preserve">Difference</w:t>
+            </w:r>
+          </w:p>
+        </w:tc>
+        <w:tc>
+          <w:tcPr>
+            <w:tcW w:type="dxa" w:w="2844"/>
+            <w:shd w:val="clear" w:color="auto" w:fill="2E5395"/>
+          </w:tcPr>
+          <w:p>
+            <w:r>
+              <w:rPr>
+                <w:b/>
+                <w:color w:val="FFFFFF"/>
+              </w:rPr>
+              <w:t xml:space="preserve">Type</w:t>
+            </w:r>
+          </w:p>
+        </w:tc>
+        <w:tc>
+          <w:tcPr>
+            <w:tcW w:type="dxa" w:w="766"/>
+            <w:shd w:val="clear" w:color="auto" w:fill="2E5395"/>
+          </w:tcPr>
+          <w:p>
+            <w:r>
+              <w:rPr>
+                <w:b/>
+                <w:color w:val="FFFFFF"/>
+              </w:rPr>
+              <w:t xml:space="preserve">df</w:t>
+            </w:r>
+          </w:p>
+        </w:tc>
+        <w:tc>
+          <w:tcPr>
+            <w:tcW w:type="dxa" w:w="1094"/>
+            <w:shd w:val="clear" w:color="auto" w:fill="2E5395"/>
+          </w:tcPr>
+          <w:p>
+            <w:r>
+              <w:rPr>
+                <w:b/>
+                <w:color w:val="FFFFFF"/>
+              </w:rPr>
+              <w:t xml:space="preserve">p</w:t>
+            </w:r>
+          </w:p>
+        </w:tc>
+        <w:tc>
+          <w:tcPr>
+            <w:tcW w:type="dxa" w:w="1203"/>
+            <w:shd w:val="clear" w:color="auto" w:fill="2E5395"/>
+          </w:tcPr>
+          <w:p>
+            <w:r>
+              <w:rPr>
+                <w:b/>
+                <w:color w:val="FFFFFF"/>
+              </w:rPr>
+              <w:t xml:space="preserve">p (Holm)</w:t>
+            </w:r>
+          </w:p>
+        </w:tc>
+      </w:tr>
+      <w:tr>
+        <w:tc>
+          <w:tcPr>
+            <w:tcW w:type="dxa" w:w="1312"/>
+          </w:tcPr>
+          <w:p>
+            <w:r>
+              <w:t xml:space="preserve">MM - MF</w:t>
+            </w:r>
+          </w:p>
+        </w:tc>
+        <w:tc>
+          <w:tcPr>
+            <w:tcW w:type="dxa" w:w="1422"/>
+          </w:tcPr>
+          <w:p>
+            <w:r>
+              <w:t xml:space="preserve">-3.9 pts</w:t>
+            </w:r>
+          </w:p>
+        </w:tc>
+        <w:tc>
+          <w:tcPr>
+            <w:tcW w:type="dxa" w:w="2844"/>
+          </w:tcPr>
+          <w:p>
+            <w:r>
+              <w:t xml:space="preserve">within host (guest gender)</w:t>
+            </w:r>
+          </w:p>
+        </w:tc>
+        <w:tc>
+          <w:tcPr>
+            <w:tcW w:type="dxa" w:w="766"/>
+          </w:tcPr>
+          <w:p>
+            <w:r>
+              <w:t xml:space="preserve">378</w:t>
+            </w:r>
+          </w:p>
+        </w:tc>
+        <w:tc>
+          <w:tcPr>
+            <w:tcW w:type="dxa" w:w="1094"/>
+          </w:tcPr>
+          <w:p>
+            <w:r>
+              <w:t xml:space="preserve">0.0029</w:t>
+            </w:r>
+          </w:p>
+        </w:tc>
+        <w:tc>
+          <w:tcPr>
+            <w:tcW w:type="dxa" w:w="1203"/>
+          </w:tcPr>
+          <w:p>
+            <w:r>
+              <w:t xml:space="preserve">0.0145</w:t>
+            </w:r>
+          </w:p>
+        </w:tc>
+      </w:tr>
+      <w:tr>
+        <w:tc>
+          <w:tcPr>
+            <w:tcW w:type="dxa" w:w="1312"/>
+          </w:tcPr>
+          <w:p>
+            <w:r>
+              <w:t xml:space="preserve">MM - FM</w:t>
+            </w:r>
+          </w:p>
+        </w:tc>
+        <w:tc>
+          <w:tcPr>
+            <w:tcW w:type="dxa" w:w="1422"/>
+          </w:tcPr>
+          <w:p>
+            <w:r>
+              <w:t xml:space="preserve">+5.3 pts</w:t>
+            </w:r>
+          </w:p>
+        </w:tc>
+        <w:tc>
+          <w:tcPr>
+            <w:tcW w:type="dxa" w:w="2844"/>
+          </w:tcPr>
+          <w:p>
+            <w:r>
+              <w:t xml:space="preserve">between hosts</w:t>
+            </w:r>
+          </w:p>
+        </w:tc>
+        <w:tc>
+          <w:tcPr>
+            <w:tcW w:type="dxa" w:w="766"/>
+          </w:tcPr>
+          <w:p>
+            <w:r>
+              <w:t xml:space="preserve">7</w:t>
+            </w:r>
+          </w:p>
+        </w:tc>
+        <w:tc>
+          <w:tcPr>
+            <w:tcW w:type="dxa" w:w="1094"/>
+          </w:tcPr>
+          <w:p>
+            <w:r>
+              <w:t xml:space="preserve">0.0083</w:t>
+            </w:r>
+          </w:p>
+        </w:tc>
+        <w:tc>
+          <w:tcPr>
+            <w:tcW w:type="dxa" w:w="1203"/>
+          </w:tcPr>
+          <w:p>
+            <w:r>
+              <w:t xml:space="preserve">0.0250</w:t>
+            </w:r>
+          </w:p>
+        </w:tc>
+      </w:tr>
+      <w:tr>
+        <w:tc>
+          <w:tcPr>
+            <w:tcW w:type="dxa" w:w="1312"/>
+          </w:tcPr>
+          <w:p>
+            <w:r>
+              <w:t xml:space="preserve">MM - FF</w:t>
+            </w:r>
+          </w:p>
+        </w:tc>
+        <w:tc>
+          <w:tcPr>
+            <w:tcW w:type="dxa" w:w="1422"/>
+          </w:tcPr>
+          <w:p>
+            <w:r>
+              <w:t xml:space="preserve">+3.1 pts</w:t>
+            </w:r>
+          </w:p>
+        </w:tc>
+        <w:tc>
+          <w:tcPr>
+            <w:tcW w:type="dxa" w:w="2844"/>
+          </w:tcPr>
+          <w:p>
+            <w:r>
+              <w:t xml:space="preserve">between hosts</w:t>
+            </w:r>
+          </w:p>
+        </w:tc>
+        <w:tc>
+          <w:tcPr>
+            <w:tcW w:type="dxa" w:w="766"/>
+          </w:tcPr>
+          <w:p>
+            <w:r>
+              <w:t xml:space="preserve">7</w:t>
+            </w:r>
+          </w:p>
+        </w:tc>
+        <w:tc>
+          <w:tcPr>
+            <w:tcW w:type="dxa" w:w="1094"/>
+          </w:tcPr>
+          <w:p>
+            <w:r>
+              <w:t xml:space="preserve">0.0700</w:t>
+            </w:r>
+          </w:p>
+        </w:tc>
+        <w:tc>
+          <w:tcPr>
+            <w:tcW w:type="dxa" w:w="1203"/>
+          </w:tcPr>
+          <w:p>
+            <w:r>
+              <w:t xml:space="preserve">0.1400</w:t>
+            </w:r>
+          </w:p>
+        </w:tc>
+      </w:tr>
+      <w:tr>
+        <w:tc>
+          <w:tcPr>
+            <w:tcW w:type="dxa" w:w="1312"/>
+          </w:tcPr>
+          <w:p>
+            <w:r>
+              <w:t xml:space="preserve">MF - FM</w:t>
+            </w:r>
+          </w:p>
+        </w:tc>
+        <w:tc>
+          <w:tcPr>
+            <w:tcW w:type="dxa" w:w="1422"/>
+          </w:tcPr>
+          <w:p>
+            <w:r>
+              <w:t xml:space="preserve">+9.2 pts</w:t>
+            </w:r>
+          </w:p>
+        </w:tc>
+        <w:tc>
+          <w:tcPr>
+            <w:tcW w:type="dxa" w:w="2844"/>
+          </w:tcPr>
+          <w:p>
+            <w:r>
+              <w:t xml:space="preserve">between hosts</w:t>
+            </w:r>
+          </w:p>
+        </w:tc>
+        <w:tc>
+          <w:tcPr>
+            <w:tcW w:type="dxa" w:w="766"/>
+          </w:tcPr>
+          <w:p>
+            <w:r>
+              <w:t xml:space="preserve">7</w:t>
+            </w:r>
+          </w:p>
+        </w:tc>
+        <w:tc>
+          <w:tcPr>
+            <w:tcW w:type="dxa" w:w="1094"/>
+          </w:tcPr>
+          <w:p>
+            <w:r>
+              <w:t xml:space="preserve">0.0011</w:t>
+            </w:r>
+          </w:p>
+        </w:tc>
+        <w:tc>
+          <w:tcPr>
+            <w:tcW w:type="dxa" w:w="1203"/>
+          </w:tcPr>
+          <w:p>
+            <w:r>
+              <w:t xml:space="preserve">0.0065</w:t>
+            </w:r>
+          </w:p>
+        </w:tc>
+      </w:tr>
+      <w:tr>
+        <w:tc>
+          <w:tcPr>
+            <w:tcW w:type="dxa" w:w="1312"/>
+          </w:tcPr>
+          <w:p>
+            <w:r>
+              <w:t xml:space="preserve">MF - FF</w:t>
+            </w:r>
+          </w:p>
+        </w:tc>
+        <w:tc>
+          <w:tcPr>
+            <w:tcW w:type="dxa" w:w="1422"/>
+          </w:tcPr>
+          <w:p>
+            <w:r>
+              <w:t xml:space="preserve">+7.0 pts</w:t>
+            </w:r>
+          </w:p>
+        </w:tc>
+        <w:tc>
+          <w:tcPr>
+            <w:tcW w:type="dxa" w:w="2844"/>
+          </w:tcPr>
+          <w:p>
+            <w:r>
+              <w:t xml:space="preserve">between hosts</w:t>
+            </w:r>
+          </w:p>
+        </w:tc>
+        <w:tc>
+          <w:tcPr>
+            <w:tcW w:type="dxa" w:w="766"/>
+          </w:tcPr>
+          <w:p>
+            <w:r>
+              <w:t xml:space="preserve">7</w:t>
+            </w:r>
+          </w:p>
+        </w:tc>
+        <w:tc>
+          <w:tcPr>
+            <w:tcW w:type="dxa" w:w="1094"/>
+          </w:tcPr>
+          <w:p>
+            <w:r>
+              <w:t xml:space="preserve">0.0047</w:t>
+            </w:r>
+          </w:p>
+        </w:tc>
+        <w:tc>
+          <w:tcPr>
+            <w:tcW w:type="dxa" w:w="1203"/>
+          </w:tcPr>
+          <w:p>
+            <w:r>
+              <w:t xml:space="preserve">0.0188</w:t>
+            </w:r>
+          </w:p>
+        </w:tc>
+      </w:tr>
+      <w:tr>
+        <w:tc>
+          <w:tcPr>
+            <w:tcW w:type="dxa" w:w="1312"/>
+          </w:tcPr>
+          <w:p>
+            <w:r>
+              <w:t xml:space="preserve">FM - FF</w:t>
+            </w:r>
+          </w:p>
+        </w:tc>
+        <w:tc>
+          <w:tcPr>
+            <w:tcW w:type="dxa" w:w="1422"/>
+          </w:tcPr>
+          <w:p>
+            <w:r>
+              <w:t xml:space="preserve">-2.2 pts</w:t>
+            </w:r>
+          </w:p>
+        </w:tc>
+        <w:tc>
+          <w:tcPr>
+            <w:tcW w:type="dxa" w:w="2844"/>
+          </w:tcPr>
+          <w:p>
+            <w:r>
+              <w:t xml:space="preserve">within host (guest gender)</w:t>
+            </w:r>
+          </w:p>
+        </w:tc>
+        <w:tc>
+          <w:tcPr>
+            <w:tcW w:type="dxa" w:w="766"/>
+          </w:tcPr>
+          <w:p>
+            <w:r>
+              <w:t xml:space="preserve">378</w:t>
+            </w:r>
+          </w:p>
+        </w:tc>
+        <w:tc>
+          <w:tcPr>
+            <w:tcW w:type="dxa" w:w="1094"/>
+          </w:tcPr>
+          <w:p>
+            <w:r>
+              <w:t xml:space="preserve">0.2357</w:t>
+            </w:r>
+          </w:p>
+        </w:tc>
+        <w:tc>
+          <w:tcPr>
+            <w:tcW w:type="dxa" w:w="1203"/>
+          </w:tcPr>
+          <w:p>
+            <w:r>
+              <w:t xml:space="preserve">0.2357</w:t>
+            </w:r>
+          </w:p>
+        </w:tc>
+      </w:tr>
+    </w:tbl>
+    <w:p/>
+    <w:p>
+      <w:pPr>
+        <w:pStyle w:val="Heading2"/>
+      </w:pPr>
+      <w:r>
+        <w:t xml:space="preserve">7.7 Variance Components and Model Comparisons</w:t>
+      </w:r>
+    </w:p>
+    <w:tbl>
+      <w:tblPr>
+        <w:tblStyle w:val="LightGrid-Accent1"/>
+        <w:tblW w:type="auto" w:w="0"/>
+        <w:jc w:val="center"/>
+        <w:tblLook w:firstColumn="1" w:firstRow="1" w:lastColumn="0" w:lastRow="0" w:noHBand="0" w:noVBand="1" w:val="04A0"/>
+      </w:tblPr>
+      <w:tblGrid>
+        <w:gridCol w:w="5400"/>
+        <w:gridCol w:w="3240"/>
+      </w:tblGrid>
+      <w:tr>
+        <w:tc>
+          <w:tcPr>
+            <w:tcW w:type="dxa" w:w="5400"/>
+            <w:shd w:val="clear" w:color="auto" w:fill="2E5395"/>
+          </w:tcPr>
+          <w:p>
+            <w:r>
+              <w:rPr>
+                <w:b/>
+                <w:color w:val="FFFFFF"/>
+              </w:rPr>
+              <w:t xml:space="preserve">Quantity</w:t>
+            </w:r>
+          </w:p>
+        </w:tc>
+        <w:tc>
+          <w:tcPr>
+            <w:tcW w:type="dxa" w:w="3240"/>
+            <w:shd w:val="clear" w:color="auto" w:fill="2E5395"/>
+          </w:tcPr>
+          <w:p>
+            <w:r>
+              <w:rPr>
+                <w:b/>
+                <w:color w:val="FFFFFF"/>
+              </w:rPr>
+              <w:t xml:space="preserve">Value</w:t>
+            </w:r>
+          </w:p>
+        </w:tc>
+      </w:tr>
+      <w:tr>
+        <w:tc>
+          <w:tcPr>
+            <w:tcW w:type="dxa" w:w="5400"/>
+          </w:tcPr>
+          <w:p>
+            <w:r>
+              <w:t xml:space="preserve">Between-host (show) variance</w:t>
+            </w:r>
+          </w:p>
+        </w:tc>
+        <w:tc>
+          <w:tcPr>
+            <w:tcW w:type="dxa" w:w="3240"/>
+          </w:tcPr>
+          <w:p>
+            <w:r>
+              <w:t xml:space="preserve">1.85e-11</w:t>
+            </w:r>
+          </w:p>
+        </w:tc>
+      </w:tr>
+      <w:tr>
+        <w:tc>
+          <w:tcPr>
+            <w:tcW w:type="dxa" w:w="5400"/>
+          </w:tcPr>
+          <w:p>
+            <w:r>
+              <w:t xml:space="preserve">Residual (episode) variance</w:t>
+            </w:r>
+          </w:p>
+        </w:tc>
+        <w:tc>
+          <w:tcPr>
+            <w:tcW w:type="dxa" w:w="3240"/>
+          </w:tcPr>
+          <w:p>
+            <w:r>
+              <w:t xml:space="preserve">0.0087</w:t>
+            </w:r>
+          </w:p>
+        </w:tc>
+      </w:tr>
+      <w:tr>
+        <w:tc>
+          <w:tcPr>
+            <w:tcW w:type="dxa" w:w="5400"/>
+          </w:tcPr>
+          <w:p>
+            <w:r>
+              <w:t xml:space="preserve">ICC (share of variance due to host)</w:t>
+            </w:r>
+          </w:p>
+        </w:tc>
+        <w:tc>
+          <w:tcPr>
+            <w:tcW w:type="dxa" w:w="3240"/>
+          </w:tcPr>
+          <w:p>
+            <w:r>
+              <w:t xml:space="preserve">0.000</w:t>
+            </w:r>
+          </w:p>
+        </w:tc>
+      </w:tr>
+      <w:tr>
+        <w:tc>
+          <w:tcPr>
+            <w:tcW w:type="dxa" w:w="5400"/>
+          </w:tcPr>
+          <w:p>
+            <w:r>
+              <w:t xml:space="preserve">R2 marginal (fixed effects)</w:t>
+            </w:r>
+          </w:p>
+        </w:tc>
+        <w:tc>
+          <w:tcPr>
+            <w:tcW w:type="dxa" w:w="3240"/>
+          </w:tcPr>
+          <w:p>
+            <w:r>
+              <w:t xml:space="preserve">0.079</w:t>
+            </w:r>
+          </w:p>
+        </w:tc>
+      </w:tr>
+      <w:tr>
+        <w:tc>
+          <w:tcPr>
+            <w:tcW w:type="dxa" w:w="5400"/>
+          </w:tcPr>
+          <w:p>
+            <w:r>
+              <w:t xml:space="preserve">R2 conditional (fixed effects + host)</w:t>
+            </w:r>
+          </w:p>
+        </w:tc>
+        <w:tc>
+          <w:tcPr>
+            <w:tcW w:type="dxa" w:w="3240"/>
+          </w:tcPr>
+          <w:p>
+            <w:r>
+              <w:t xml:space="preserve">0.079</w:t>
+            </w:r>
+          </w:p>
+        </w:tc>
+      </w:tr>
+      <w:tr>
+        <w:tc>
+          <w:tcPr>
+            <w:tcW w:type="dxa" w:w="5400"/>
+          </w:tcPr>
+          <w:p>
+            <w:r>
+              <w:t xml:space="preserve">LRT, host random effect (p, boundary-corrected)</w:t>
+            </w:r>
+          </w:p>
+        </w:tc>
+        <w:tc>
+          <w:tcPr>
+            <w:tcW w:type="dxa" w:w="3240"/>
+          </w:tcPr>
+          <w:p>
+            <w:r>
+              <w:t xml:space="preserve">0.50</w:t>
+            </w:r>
+          </w:p>
+        </w:tc>
+      </w:tr>
+      <w:tr>
+        <w:tc>
+          <w:tcPr>
+            <w:tcW w:type="dxa" w:w="5400"/>
+          </w:tcPr>
+          <w:p>
+            <w:r>
+              <w:t xml:space="preserve">LRT, host × guest gender interaction (chi2, p)</w:t>
+            </w:r>
+          </w:p>
+        </w:tc>
+        <w:tc>
+          <w:tcPr>
+            <w:tcW w:type="dxa" w:w="3240"/>
+          </w:tcPr>
+          <w:p>
+            <w:r>
+              <w:t xml:space="preserve">0.62, 0.43</w:t>
+            </w:r>
+          </w:p>
+        </w:tc>
+      </w:tr>
+    </w:tbl>
+    <w:p/>
+    <w:p>
+      <w:r>
+        <w:t xml:space="preserve">The between-host variance is estimated at zero (a singular fit): once host gender is in the model, the shows do not differ in host share beyond episode-to-episode noise, and the host random effect does not improve the fit. Host and guest gender together explain about 8% of the variation in host share (R2 marginal); the remaining variation is between episodes. With zero host variance the mixed model is equivalent to an ordinary regression and no longer adjusts for which host an episode belongs to, so the guest-gender result is also checked within host below.</w:t>
+      </w:r>
+    </w:p>
+    <w:p>
+      <w:pPr>
+        <w:pStyle w:val="Heading2"/>
+      </w:pPr>
+      <w:r>
+        <w:t xml:space="preserve">7.8 Robustness</w:t>
+      </w:r>
+    </w:p>
+    <w:tbl>
+      <w:tblPr>
+        <w:tblStyle w:val="LightGrid-Accent1"/>
+        <w:tblW w:type="auto" w:w="0"/>
+        <w:jc w:val="center"/>
+        <w:tblLook w:firstColumn="1" w:firstRow="1" w:lastColumn="0" w:lastRow="0" w:noHBand="0" w:noVBand="1" w:val="04A0"/>
+      </w:tblPr>
+      <w:tblGrid>
+        <w:gridCol w:w="1910"/>
+        <w:gridCol w:w="728"/>
+        <w:gridCol w:w="1637"/>
+        <w:gridCol w:w="1637"/>
+        <w:gridCol w:w="1455"/>
+        <w:gridCol w:w="1273"/>
+      </w:tblGrid>
+      <w:tr>
+        <w:tc>
+          <w:tcPr>
+            <w:tcW w:type="dxa" w:w="1910"/>
+            <w:shd w:val="clear" w:color="auto" w:fill="2E5395"/>
+          </w:tcPr>
+          <w:p>
+            <w:r>
+              <w:rPr>
+                <w:b/>
+                <w:color w:val="FFFFFF"/>
+              </w:rPr>
+              <w:t xml:space="preserve">Model</w:t>
+            </w:r>
+          </w:p>
+        </w:tc>
+        <w:tc>
+          <w:tcPr>
+            <w:tcW w:type="dxa" w:w="728"/>
+            <w:shd w:val="clear" w:color="auto" w:fill="2E5395"/>
+          </w:tcPr>
+          <w:p>
+            <w:r>
+              <w:rPr>
+                <w:b/>
+                <w:color w:val="FFFFFF"/>
+              </w:rPr>
+              <w:t xml:space="preserve">Eps.</w:t>
+            </w:r>
+          </w:p>
+        </w:tc>
+        <w:tc>
+          <w:tcPr>
+            <w:tcW w:type="dxa" w:w="1637"/>
+            <w:shd w:val="clear" w:color="auto" w:fill="2E5395"/>
+          </w:tcPr>
+          <w:p>
+            <w:r>
+              <w:rPr>
+                <w:b/>
+                <w:color w:val="FFFFFF"/>
+              </w:rPr>
+              <w:t xml:space="preserve">Guest female: mixed model</w:t>
+            </w:r>
+          </w:p>
+        </w:tc>
+        <w:tc>
+          <w:tcPr>
+            <w:tcW w:type="dxa" w:w="1637"/>
+            <w:shd w:val="clear" w:color="auto" w:fill="2E5395"/>
+          </w:tcPr>
+          <w:p>
+            <w:r>
+              <w:rPr>
+                <w:b/>
+                <w:color w:val="FFFFFF"/>
+              </w:rPr>
+              <w:t xml:space="preserve">Guest female: host fixed effects</w:t>
+            </w:r>
+          </w:p>
+        </w:tc>
+        <w:tc>
+          <w:tcPr>
+            <w:tcW w:type="dxa" w:w="1455"/>
+            <w:shd w:val="clear" w:color="auto" w:fill="2E5395"/>
+          </w:tcPr>
+          <w:p>
+            <w:r>
+              <w:rPr>
+                <w:b/>
+                <w:color w:val="FFFFFF"/>
+              </w:rPr>
+              <w:t xml:space="preserve">Host female</w:t>
+            </w:r>
+          </w:p>
+        </w:tc>
+        <w:tc>
+          <w:tcPr>
+            <w:tcW w:type="dxa" w:w="1273"/>
+            <w:shd w:val="clear" w:color="auto" w:fill="2E5395"/>
+          </w:tcPr>
+          <w:p>
+            <w:r>
+              <w:rPr>
+                <w:b/>
+                <w:color w:val="FFFFFF"/>
+              </w:rPr>
+              <w:t xml:space="preserve">Interaction p</w:t>
+            </w:r>
+          </w:p>
+        </w:tc>
+      </w:tr>
+      <w:tr>
+        <w:tc>
+          <w:tcPr>
+            <w:tcW w:type="dxa" w:w="1910"/>
+          </w:tcPr>
+          <w:p>
+            <w:r>
+              <w:t xml:space="preserve">Main model (time share)</w:t>
+            </w:r>
+          </w:p>
+        </w:tc>
+        <w:tc>
+          <w:tcPr>
+            <w:tcW w:type="dxa" w:w="728"/>
+          </w:tcPr>
+          <w:p>
+            <w:r>
+              <w:t xml:space="preserve">389</w:t>
+            </w:r>
+          </w:p>
+        </w:tc>
+        <w:tc>
+          <w:tcPr>
+            <w:tcW w:type="dxa" w:w="1637"/>
+          </w:tcPr>
+          <w:p>
+            <w:r>
+              <w:t xml:space="preserve">+3.9 pts (p 0.0029)</w:t>
+            </w:r>
+          </w:p>
+        </w:tc>
+        <w:tc>
+          <w:tcPr>
+            <w:tcW w:type="dxa" w:w="1637"/>
+          </w:tcPr>
+          <w:p>
+            <w:r>
+              <w:t xml:space="preserve">+3.7 pts (p 0.0055)</w:t>
+            </w:r>
+          </w:p>
+        </w:tc>
+        <w:tc>
+          <w:tcPr>
+            <w:tcW w:type="dxa" w:w="1455"/>
+          </w:tcPr>
+          <w:p>
+            <w:r>
+              <w:t xml:space="preserve">-5.3 pts (p 0.0083)</w:t>
+            </w:r>
+          </w:p>
+        </w:tc>
+        <w:tc>
+          <w:tcPr>
+            <w:tcW w:type="dxa" w:w="1273"/>
+          </w:tcPr>
+          <w:p>
+            <w:r>
+              <w:t xml:space="preserve">0.4342</w:t>
+            </w:r>
+          </w:p>
+        </w:tc>
+      </w:tr>
+      <w:tr>
+        <w:tc>
+          <w:tcPr>
+            <w:tcW w:type="dxa" w:w="1910"/>
+          </w:tcPr>
+          <w:p>
+            <w:r>
+              <w:t xml:space="preserve">Logit of time share</w:t>
+            </w:r>
+          </w:p>
+        </w:tc>
+        <w:tc>
+          <w:tcPr>
+            <w:tcW w:type="dxa" w:w="728"/>
+          </w:tcPr>
+          <w:p>
+            <w:r>
+              <w:t xml:space="preserve">389</w:t>
+            </w:r>
+          </w:p>
+        </w:tc>
+        <w:tc>
+          <w:tcPr>
+            <w:tcW w:type="dxa" w:w="1637"/>
+          </w:tcPr>
+          <w:p>
+            <w:r>
+              <w:t xml:space="preserve">+0.213 (p 0.0049)</w:t>
+            </w:r>
+          </w:p>
+        </w:tc>
+        <w:tc>
+          <w:tcPr>
+            <w:tcW w:type="dxa" w:w="1637"/>
+          </w:tcPr>
+          <w:p>
+            <w:r>
+              <w:t xml:space="preserve">+0.207 (p 0.0070)</w:t>
+            </w:r>
+          </w:p>
+        </w:tc>
+        <w:tc>
+          <w:tcPr>
+            <w:tcW w:type="dxa" w:w="1455"/>
+          </w:tcPr>
+          <w:p>
+            <w:r>
+              <w:t xml:space="preserve">-0.305 (p 0.0079)</w:t>
+            </w:r>
+          </w:p>
+        </w:tc>
+        <w:tc>
+          <w:tcPr>
+            <w:tcW w:type="dxa" w:w="1273"/>
+          </w:tcPr>
+          <w:p>
+            <w:r>
+              <w:t xml:space="preserve">0.5770</w:t>
+            </w:r>
+          </w:p>
+        </w:tc>
+      </w:tr>
+      <w:tr>
+        <w:tc>
+          <w:tcPr>
+            <w:tcW w:type="dxa" w:w="1910"/>
+          </w:tcPr>
+          <w:p>
+            <w:r>
+              <w:t xml:space="preserve">Word share</w:t>
+            </w:r>
+          </w:p>
+        </w:tc>
+        <w:tc>
+          <w:tcPr>
+            <w:tcW w:type="dxa" w:w="728"/>
+          </w:tcPr>
+          <w:p>
+            <w:r>
+              <w:t xml:space="preserve">389</w:t>
+            </w:r>
+          </w:p>
+        </w:tc>
+        <w:tc>
+          <w:tcPr>
+            <w:tcW w:type="dxa" w:w="1637"/>
+          </w:tcPr>
+          <w:p>
+            <w:r>
+              <w:t xml:space="preserve">+4.5 pts (p 0.0007)</w:t>
+            </w:r>
+          </w:p>
+        </w:tc>
+        <w:tc>
+          <w:tcPr>
+            <w:tcW w:type="dxa" w:w="1637"/>
+          </w:tcPr>
+          <w:p>
+            <w:r>
+              <w:t xml:space="preserve">+4.3 pts (p 0.0012)</w:t>
+            </w:r>
+          </w:p>
+        </w:tc>
+        <w:tc>
+          <w:tcPr>
+            <w:tcW w:type="dxa" w:w="1455"/>
+          </w:tcPr>
+          <w:p>
+            <w:r>
+              <w:t xml:space="preserve">-5.9 pts (p 0.0050)</w:t>
+            </w:r>
+          </w:p>
+        </w:tc>
+        <w:tc>
+          <w:tcPr>
+            <w:tcW w:type="dxa" w:w="1273"/>
+          </w:tcPr>
+          <w:p>
+            <w:r>
+              <w:t xml:space="preserve">0.3840</w:t>
+            </w:r>
+          </w:p>
+        </w:tc>
+      </w:tr>
+      <w:tr>
+        <w:tc>
+          <w:tcPr>
+            <w:tcW w:type="dxa" w:w="1910"/>
+          </w:tcPr>
+          <w:p>
+            <w:r>
+              <w:t xml:space="preserve">Balanced 200-episode subset</w:t>
+            </w:r>
+          </w:p>
+        </w:tc>
+        <w:tc>
+          <w:tcPr>
+            <w:tcW w:type="dxa" w:w="728"/>
+          </w:tcPr>
+          <w:p>
+            <w:r>
+              <w:t xml:space="preserve">181</w:t>
+            </w:r>
+          </w:p>
+        </w:tc>
+        <w:tc>
+          <w:tcPr>
+            <w:tcW w:type="dxa" w:w="1637"/>
+          </w:tcPr>
+          <w:p>
+            <w:r>
+              <w:t xml:space="preserve">+1.5 pts (p 0.4598)</w:t>
+            </w:r>
+          </w:p>
+        </w:tc>
+        <w:tc>
+          <w:tcPr>
+            <w:tcW w:type="dxa" w:w="1637"/>
+          </w:tcPr>
+          <w:p>
+            <w:r>
+              <w:t xml:space="preserve">+1.4 pts (p 0.5139)</w:t>
+            </w:r>
+          </w:p>
+        </w:tc>
+        <w:tc>
+          <w:tcPr>
+            <w:tcW w:type="dxa" w:w="1455"/>
+          </w:tcPr>
+          <w:p>
+            <w:r>
+              <w:t xml:space="preserve">-7.6 pts (p 0.0246)</w:t>
+            </w:r>
+          </w:p>
+        </w:tc>
+        <w:tc>
+          <w:tcPr>
+            <w:tcW w:type="dxa" w:w="1273"/>
+          </w:tcPr>
+          <w:p>
+            <w:r>
+              <w:t xml:space="preserve">0.8762</w:t>
+            </w:r>
+          </w:p>
+        </w:tc>
+      </w:tr>
+    </w:tbl>
+    <w:p/>
+    <w:p>
+      <w:r>
+        <w:t xml:space="preserve">Guest-female effects are for male hosts (the reference); the logit row is on the logit scale. The host-fixed-effects column estimates the guest-gender effect strictly within each host.</w:t>
+      </w:r>
+    </w:p>
+    <w:p>
+      <w:r>
+        <w:t xml:space="preserve">Rank-based within-host test (Section 6 method) on host time share: +0.126 (p 0.0002) on all episodes and +0.099 (p 0.0236) on the balanced subset.</w:t>
+      </w:r>
+    </w:p>
+    <w:p>
+      <w:r>
+        <w:t xml:space="preserve">Leaving out one host at a time, the guest-female effect stays between +3.4 pts and +4.2 pts with p at most 0.014. The host-female effect stays negative but loses significance when Karishma Mehta (p 0.19) or Ranveer A (p 0.55) is left out. (The fit without Ranveer A does not formally converge because the host variance is on the zero boundary; the highest-likelihood fit is reported.)</w:t>
+      </w:r>
+    </w:p>
+    <w:p>
+      <w:r>
+        <w:t xml:space="preserve">In the balanced subset the mean-based estimates of the guest effect are small (+1.4 to +1.5 pts, not significant), while the rank-based test is significant. The difference comes from a few male-guest episodes of Raj Shamani with unusually high host share that are in the balanced sample (mean 26.0% against 22.1% for his other male-guest episodes, with the same median of 21%); means are sensitive to them, ranks are not.</w:t>
+      </w:r>
+    </w:p>
+    <w:p>
+      <w:pPr>
+        <w:pStyle w:val="Heading2"/>
+      </w:pPr>
+      <w:r>
+        <w:t xml:space="preserve">7.9 Diagnostics</w:t>
+      </w:r>
+    </w:p>
+    <w:p>
+      <w:pPr>
+        <w:jc w:val="center"/>
+      </w:pPr>
+      <w:r>
+        <w:drawing>
+          <wp:inline xmlns:a="http://schemas.openxmlformats.org/drawingml/2006/main" xmlns:pic="http://schemas.openxmlformats.org/drawingml/2006/picture">
+            <wp:extent cx="5669280" cy="1795272"/>
+            <wp:docPr id="101" name="Picture 101"/>
+            <wp:cNvGraphicFramePr>
+              <a:graphicFrameLocks noChangeAspect="1"/>
+            </wp:cNvGraphicFramePr>
+            <a:graphic>
+              <a:graphicData uri="http://schemas.openxmlformats.org/drawingml/2006/picture">
+                <pic:pic>
+                  <pic:nvPicPr>
+                    <pic:cNvPr id="0" name="speaking_time_model_diagnostics.png"/>
+                    <pic:cNvPicPr/>
+                  </pic:nvPicPr>
+                  <pic:blipFill>
+                    <a:blip r:embed="rIdFig2"/>
+                    <a:stretch>
+                      <a:fillRect/>
+                    </a:stretch>
+                  </pic:blipFill>
+                  <pic:spPr>
+                    <a:xfrm>
+                      <a:off x="0" y="0"/>
+                      <a:ext cx="5669280" cy="1795272"/>
+                    </a:xfrm>
+                    <a:prstGeom prst="rect"/>
+                  </pic:spPr>
+                </pic:pic>
+              </a:graphicData>
+            </a:graphic>
+          </wp:inline>
+        </w:drawing>
+      </w:r>
+    </w:p>
+    <w:p>
+      <w:r>
+        <w:t xml:space="preserve">Figure 7.2. Residual QQ plot, residuals against fitted values, and the host random intercepts (all near zero, on a 10^-9 scale).</w:t>
+      </w:r>
+    </w:p>
+    <w:p>
+      <w:r>
+        <w:t xml:space="preserve">Residuals are right-skewed: a few episodes have a very high host share. The largest, ep_202 (Raj Shamani, MALE-&gt;MALE), gives the host 95.2% of speaking time and the guest 1.2 minutes, most likely a diarization error. The logit-scale fit and the rank-based test, which are less sensitive to such values, give the same conclusions.</w:t>
+      </w:r>
+    </w:p>
+    <w:p>
+      <w:pPr>
+        <w:pStyle w:val="Heading2"/>
+      </w:pPr>
+      <w:r>
+        <w:t xml:space="preserve">7.10 Interpretation: What These Results Suggest</w:t>
+      </w:r>
+    </w:p>
+    <w:p>
+      <w:pPr>
+        <w:pStyle w:val="ListBullet"/>
+      </w:pPr>
+      <w:r>
+        <w:rPr>
+          <w:b/>
+        </w:rPr>
+        <w:t xml:space="preserve">Hosts take more of the conversation with female guests. </w:t>
+      </w:r>
+      <w:r>
+        <w:t xml:space="preserve">With male hosts, the host's share of speaking time is +3.9 pts higher when the guest is a woman (27.7% vs. 23.7%; p = 0.003). The effect is the same within host (+3.7 pts), holds without any single host, on the logit scale, with word share, and in the rank-based test, including the balanced subset.</w:t>
+      </w:r>
+    </w:p>
+    <w:p>
+      <w:pPr>
+        <w:pStyle w:val="ListBullet"/>
+      </w:pPr>
+      <w:r>
+        <w:rPr>
+          <w:b/>
+        </w:rPr>
+        <w:t xml:space="preserve">The effect for female hosts is smaller and uncertain. </w:t>
+      </w:r>
+      <w:r>
+        <w:t xml:space="preserve">Female hosts also take a larger share with female guests (20.7% vs. 18.5%), but this difference is not significant (p = 0.24), and the interaction is not significant either (p = 0.43). The data are consistent with the same guest-gender effect for both host genders, with less precision for the 4 female hosts' 104 episodes.</w:t>
+      </w:r>
+    </w:p>
+    <w:p>
+      <w:pPr>
+        <w:pStyle w:val="ListBullet"/>
+      </w:pPr>
+      <w:r>
+        <w:rPr>
+          <w:b/>
+        </w:rPr>
+        <w:t xml:space="preserve">The host-gender difference describes these particular shows. </w:t>
+      </w:r>
+      <w:r>
+        <w:t xml:space="preserve">The model estimates that female hosts take 5.3 pts less of the conversation than male hosts (p = 0.008 with 7 df), but this is a comparison of 4 female-hosted and 5 male-hosted shows, and it loses significance when Karishma Mehta or Ranveer A is left out. It describes these shows; it cannot be attributed to host gender.</w:t>
+      </w:r>
+    </w:p>
+    <w:p>
+      <w:pPr>
+        <w:pStyle w:val="ListBullet"/>
+      </w:pPr>
+      <w:r>
+        <w:rPr>
+          <w:b/>
+        </w:rPr>
+        <w:t xml:space="preserve">There is little show-level variation beyond host gender. </w:t>
+      </w:r>
+      <w:r>
+        <w:t xml:space="preserve">The between-host variance is zero once host gender is included: apart from the host-gender difference, the shows do not differ systematically in how much the host speaks, and most of the variation is between episodes of the same show.</w:t>
+      </w:r>
+    </w:p>
+    <w:p>
+      <w:pPr>
+        <w:pStyle w:val="Heading2"/>
+      </w:pPr>
+      <w:r>
+        <w:t xml:space="preserve">7.11 Notes &amp; Limitations</w:t>
+      </w:r>
+    </w:p>
+    <w:p>
+      <w:pPr>
+        <w:pStyle w:val="ListBullet"/>
+      </w:pPr>
+      <w:r>
+        <w:t xml:space="preserve">Speaking time comes from diarization. Overlapping speech is counted for both speakers, and misattributed segments move time from one speaker to the other; episodes such as the one in 7.9 are likely diarization errors.</w:t>
+      </w:r>
+    </w:p>
+    <w:p>
+      <w:pPr>
+        <w:pStyle w:val="ListBullet"/>
+      </w:pPr>
+      <w:r>
+        <w:t xml:space="preserve">With 9 hosts, all host-level quantities (host-gender effect, between-host variance) are estimated from very little information; the between-within degrees of freedom make the tests conservative, but they cannot add information that is not there.</w:t>
+      </w:r>
+    </w:p>
+    <w:p>
+      <w:pPr>
+        <w:pStyle w:val="ListBullet"/>
+      </w:pPr>
+      <w:r>
+        <w:t xml:space="preserve">The model assumes normally distributed residuals; they are right-skewed, which is why the logit and rank-based checks are reported.</w:t>
+      </w:r>
+    </w:p>
+    <w:p>
+      <w:pPr>
+        <w:pStyle w:val="ListBullet"/>
+      </w:pPr>
+      <w:r>
+        <w:t xml:space="preserve">These are associations in observational data. Guests are not randomly assigned to shows, and female and male guests may differ in profession or topic, which could account for part of the guest-gender difference.</w:t>
       </w:r>
     </w:p>
     <w:sectPr>

</xml_diff>

<commit_message>
Add dialogue acts for all 418 episodes and ask-label check (v2 Section 8)
- run_dialogue_classification_remaining.sbatch: classify the 218 episodes
  outside the balanced 200 with the same script and settings
- combine_dialogue_acts.py: join both runs into 418-episode tables
  (results/dialogue_acts/all_418/, git-ignored)
- stat_analysis/ask_within_host_check_v2.py: check the exploratory
  direct-question result with the classifier's "ask" label (agreement,
  within-host interaction, split by host gender, leave-one-host-out)
- Project_Documentation_v2: Section 8; Section 6 now points to it

Co-Authored-By: Claude Opus 5.5 <noreply@anthropic.com>
</commit_message>
<xml_diff>
--- a/documentation/Project_Documentation_v2.docx
+++ b/documentation/Project_Documentation_v2.docx
@@ -72,7 +72,7 @@
     </w:p>
     <w:p>
       <w:r>
-        <w:t xml:space="preserve">It covers: src/compute_bias_features_v2.py (Section 1, per-speaker hedge, booster and politeness features adapted to speech), the precision audits built with src/make_audit_sample.py (Section 2), src/episode_dyads.py (Section 3, host→guest gender dyads), src/dyad_analysis_v2.py (Section 4, episode-level dyad dataset), src/stat_analysis/kruskal_wallis_test_v2.py (Section 5), and src/stat_analysis/Mann_Whitney_test_v2.py and src/stat_analysis/within_host_test_v2.py (Section 6, pairwise dyad tests and the guest-gender test within host), and src/speaking_time_v2.py with src/stat_analysis/speaking_time_mixed_model_v2.py (Section 7, host and guest speaking time and a mixed-effects model of the host's share).</w:t>
+        <w:t xml:space="preserve">It covers: src/compute_bias_features_v2.py (Section 1, per-speaker hedge, booster and politeness features adapted to speech), the precision audits built with src/make_audit_sample.py (Section 2), src/episode_dyads.py (Section 3, host→guest gender dyads), src/dyad_analysis_v2.py (Section 4, episode-level dyad dataset), src/stat_analysis/kruskal_wallis_test_v2.py (Section 5), and src/stat_analysis/Mann_Whitney_test_v2.py and src/stat_analysis/within_host_test_v2.py (Section 6, pairwise dyad tests and the guest-gender test within host), and src/speaking_time_v2.py with src/stat_analysis/speaking_time_mixed_model_v2.py (Section 7, host and guest speaking time and a mixed-effects model of the host's share), and the dialogue-act classification of all episodes with src/stat_analysis/ask_within_host_check_v2.py (Section 8, a check of the direct-question result with the classifier's question label).</w:t>
       </w:r>
     </w:p>
     <w:p>
@@ -7899,7 +7899,7 @@
     <w:p/>
     <w:p>
       <w:r>
-        <w:t xml:space="preserve">Only host direct questions differ after correction: male hosts ask female guests more direct questions than male guests, while female hosts ask female guests fewer. This test was added after the per-host results showed the pattern, so it should be confirmed before being reported as a finding.</w:t>
+        <w:t xml:space="preserve">Only host direct questions differ after correction: male hosts ask female guests more direct questions than male guests, while female hosts ask female guests fewer. This test was added after the per-host results showed the pattern, so Section 8 checks it with an independent measure of questions.</w:t>
       </w:r>
     </w:p>
     <w:p>
@@ -7977,7 +7977,7 @@
         <w:t xml:space="preserve">Direct questions may follow a cross-gender pattern. </w:t>
       </w:r>
       <w:r>
-        <w:t xml:space="preserve">Pooled, FM episodes have the most host direct questions but FF episodes do not, so this is not simply a host-gender difference. The exploratory within-host result suggests hosts ask more direct questions of guests of the other gender. This needs confirming.</w:t>
+        <w:t xml:space="preserve">Pooled, FM episodes have the most host direct questions but FF episodes do not, so this is not simply a host-gender difference. The exploratory within-host result suggests hosts ask more direct questions of guests of the other gender; Section 8 confirms it with the dialogue-act classifier's question label.</w:t>
       </w:r>
     </w:p>
     <w:p>
@@ -11453,6 +11453,1742 @@
       </w:pPr>
       <w:r>
         <w:t xml:space="preserve">These are associations in observational data. Guests are not randomly assigned to shows, and female and male guests may differ in profession or topic, which could account for part of the guest-gender difference.</w:t>
+      </w:r>
+    </w:p>
+    <w:p>
+      <w:pPr>
+        <w:pStyle w:val="Heading1"/>
+      </w:pPr>
+      <w:r>
+        <w:t xml:space="preserve">8. Dialogue Acts for All Episodes and a Check of the Direct-Question Result</w:t>
+      </w:r>
+    </w:p>
+    <w:p>
+      <w:pPr>
+        <w:pStyle w:val="Heading2"/>
+      </w:pPr>
+      <w:r>
+        <w:t xml:space="preserve">8.1 Purpose</w:t>
+      </w:r>
+    </w:p>
+    <w:p>
+      <w:r>
+        <w:t xml:space="preserve">Section 6 found an exploratory pattern in host direct questions: with the host held fixed, male hosts ask female guests more direct questions than male guests, while female hosts ask female guests fewer. Because the test was chosen after the per-host results suggested the pattern, it needs confirmation with a second, independent way of measuring questions. This section classifies every host and guest segment of all 418 episodes into dialogue acts with a pretrained model, and repeats the within-host test on the model's “ask” label.</w:t>
+      </w:r>
+    </w:p>
+    <w:p>
+      <w:pPr>
+        <w:pStyle w:val="Heading2"/>
+      </w:pPr>
+      <w:r>
+        <w:t xml:space="preserve">8.2 Dialogue-Act Classification (src/dialogue_act_classification.py)</w:t>
+      </w:r>
+    </w:p>
+    <w:p>
+      <w:pPr>
+        <w:pStyle w:val="ListBullet"/>
+      </w:pPr>
+      <w:r>
+        <w:t xml:space="preserve">Model: diwank/silicone-deberta-pair, a DeBERTa model fine-tuned on the SILICONE dialogue-act benchmark, which assigns one of 11 labels: ask, answer, say, acknowledge, intent, reply_yes, reply_no, backchannel, exclaim, hold, ask_yes_no.</w:t>
+      </w:r>
+    </w:p>
+    <w:p>
+      <w:pPr>
+        <w:pStyle w:val="ListBullet"/>
+      </w:pPr>
+      <w:r>
+        <w:t xml:space="preserve">Unit: each WhisperX segment with text, classified together with the preceding segment as context. Unlike Sections 1-7, segments are not merged into turns and the first and last 60 seconds are not excluded; the label files carry no timestamps.</w:t>
+      </w:r>
+    </w:p>
+    <w:p>
+      <w:pPr>
+        <w:pStyle w:val="ListBullet"/>
+      </w:pPr>
+      <w:r>
+        <w:t xml:space="preserve">Runs: the script classifies the episodes listed in a CSV. It was run once for 200 episodes (4 h 36 min on one A100 GPU) and once, with the same script and settings, for the remaining 218 (5 h 19 min); src/combine_dialogue_acts.py joins the two into 418-episode tables and checks that no episode appears twice.</w:t>
+      </w:r>
+    </w:p>
+    <w:p>
+      <w:r>
+        <w:t xml:space="preserve">The 418 episodes give 556,045 segments (143,207 host, 412,838 guest). Share of segments by label (labels under 0.5% for both roles omitted):</w:t>
+      </w:r>
+    </w:p>
+    <w:tbl>
+      <w:tblPr>
+        <w:tblStyle w:val="LightGrid-Accent1"/>
+        <w:tblW w:type="auto" w:w="0"/>
+        <w:jc w:val="center"/>
+        <w:tblLook w:firstColumn="1" w:firstRow="1" w:lastColumn="0" w:lastRow="0" w:noHBand="0" w:noVBand="1" w:val="04A0"/>
+      </w:tblPr>
+      <w:tblGrid>
+        <w:gridCol w:w="3323"/>
+        <w:gridCol w:w="2658"/>
+        <w:gridCol w:w="2658"/>
+      </w:tblGrid>
+      <w:tr>
+        <w:tc>
+          <w:tcPr>
+            <w:tcW w:type="dxa" w:w="3323"/>
+            <w:shd w:val="clear" w:color="auto" w:fill="2E5395"/>
+          </w:tcPr>
+          <w:p>
+            <w:r>
+              <w:rPr>
+                <w:b/>
+                <w:color w:val="FFFFFF"/>
+              </w:rPr>
+              <w:t xml:space="preserve">Label</w:t>
+            </w:r>
+          </w:p>
+        </w:tc>
+        <w:tc>
+          <w:tcPr>
+            <w:tcW w:type="dxa" w:w="2658"/>
+            <w:shd w:val="clear" w:color="auto" w:fill="2E5395"/>
+          </w:tcPr>
+          <w:p>
+            <w:r>
+              <w:rPr>
+                <w:b/>
+                <w:color w:val="FFFFFF"/>
+              </w:rPr>
+              <w:t xml:space="preserve">Host segments</w:t>
+            </w:r>
+          </w:p>
+        </w:tc>
+        <w:tc>
+          <w:tcPr>
+            <w:tcW w:type="dxa" w:w="2658"/>
+            <w:shd w:val="clear" w:color="auto" w:fill="2E5395"/>
+          </w:tcPr>
+          <w:p>
+            <w:r>
+              <w:rPr>
+                <w:b/>
+                <w:color w:val="FFFFFF"/>
+              </w:rPr>
+              <w:t xml:space="preserve">Guest segments</w:t>
+            </w:r>
+          </w:p>
+        </w:tc>
+      </w:tr>
+      <w:tr>
+        <w:tc>
+          <w:tcPr>
+            <w:tcW w:type="dxa" w:w="3323"/>
+          </w:tcPr>
+          <w:p>
+            <w:r>
+              <w:t xml:space="preserve">answer</w:t>
+            </w:r>
+          </w:p>
+        </w:tc>
+        <w:tc>
+          <w:tcPr>
+            <w:tcW w:type="dxa" w:w="2658"/>
+          </w:tcPr>
+          <w:p>
+            <w:r>
+              <w:t xml:space="preserve">36.9%</w:t>
+            </w:r>
+          </w:p>
+        </w:tc>
+        <w:tc>
+          <w:tcPr>
+            <w:tcW w:type="dxa" w:w="2658"/>
+          </w:tcPr>
+          <w:p>
+            <w:r>
+              <w:t xml:space="preserve">42.0%</w:t>
+            </w:r>
+          </w:p>
+        </w:tc>
+      </w:tr>
+      <w:tr>
+        <w:tc>
+          <w:tcPr>
+            <w:tcW w:type="dxa" w:w="3323"/>
+          </w:tcPr>
+          <w:p>
+            <w:r>
+              <w:t xml:space="preserve">say</w:t>
+            </w:r>
+          </w:p>
+        </w:tc>
+        <w:tc>
+          <w:tcPr>
+            <w:tcW w:type="dxa" w:w="2658"/>
+          </w:tcPr>
+          <w:p>
+            <w:r>
+              <w:t xml:space="preserve">29.6%</w:t>
+            </w:r>
+          </w:p>
+        </w:tc>
+        <w:tc>
+          <w:tcPr>
+            <w:tcW w:type="dxa" w:w="2658"/>
+          </w:tcPr>
+          <w:p>
+            <w:r>
+              <w:t xml:space="preserve">42.3%</w:t>
+            </w:r>
+          </w:p>
+        </w:tc>
+      </w:tr>
+      <w:tr>
+        <w:tc>
+          <w:tcPr>
+            <w:tcW w:type="dxa" w:w="3323"/>
+          </w:tcPr>
+          <w:p>
+            <w:r>
+              <w:t xml:space="preserve">ask</w:t>
+            </w:r>
+          </w:p>
+        </w:tc>
+        <w:tc>
+          <w:tcPr>
+            <w:tcW w:type="dxa" w:w="2658"/>
+          </w:tcPr>
+          <w:p>
+            <w:r>
+              <w:t xml:space="preserve">19.9%</w:t>
+            </w:r>
+          </w:p>
+        </w:tc>
+        <w:tc>
+          <w:tcPr>
+            <w:tcW w:type="dxa" w:w="2658"/>
+          </w:tcPr>
+          <w:p>
+            <w:r>
+              <w:t xml:space="preserve">7.5%</w:t>
+            </w:r>
+          </w:p>
+        </w:tc>
+      </w:tr>
+      <w:tr>
+        <w:tc>
+          <w:tcPr>
+            <w:tcW w:type="dxa" w:w="3323"/>
+          </w:tcPr>
+          <w:p>
+            <w:r>
+              <w:t xml:space="preserve">acknowledge</w:t>
+            </w:r>
+          </w:p>
+        </w:tc>
+        <w:tc>
+          <w:tcPr>
+            <w:tcW w:type="dxa" w:w="2658"/>
+          </w:tcPr>
+          <w:p>
+            <w:r>
+              <w:t xml:space="preserve">4.9%</w:t>
+            </w:r>
+          </w:p>
+        </w:tc>
+        <w:tc>
+          <w:tcPr>
+            <w:tcW w:type="dxa" w:w="2658"/>
+          </w:tcPr>
+          <w:p>
+            <w:r>
+              <w:t xml:space="preserve">2.4%</w:t>
+            </w:r>
+          </w:p>
+        </w:tc>
+      </w:tr>
+      <w:tr>
+        <w:tc>
+          <w:tcPr>
+            <w:tcW w:type="dxa" w:w="3323"/>
+          </w:tcPr>
+          <w:p>
+            <w:r>
+              <w:t xml:space="preserve">intent</w:t>
+            </w:r>
+          </w:p>
+        </w:tc>
+        <w:tc>
+          <w:tcPr>
+            <w:tcW w:type="dxa" w:w="2658"/>
+          </w:tcPr>
+          <w:p>
+            <w:r>
+              <w:t xml:space="preserve">3.7%</w:t>
+            </w:r>
+          </w:p>
+        </w:tc>
+        <w:tc>
+          <w:tcPr>
+            <w:tcW w:type="dxa" w:w="2658"/>
+          </w:tcPr>
+          <w:p>
+            <w:r>
+              <w:t xml:space="preserve">2.7%</w:t>
+            </w:r>
+          </w:p>
+        </w:tc>
+      </w:tr>
+      <w:tr>
+        <w:tc>
+          <w:tcPr>
+            <w:tcW w:type="dxa" w:w="3323"/>
+          </w:tcPr>
+          <w:p>
+            <w:r>
+              <w:t xml:space="preserve">reply_yes</w:t>
+            </w:r>
+          </w:p>
+        </w:tc>
+        <w:tc>
+          <w:tcPr>
+            <w:tcW w:type="dxa" w:w="2658"/>
+          </w:tcPr>
+          <w:p>
+            <w:r>
+              <w:t xml:space="preserve">2.7%</w:t>
+            </w:r>
+          </w:p>
+        </w:tc>
+        <w:tc>
+          <w:tcPr>
+            <w:tcW w:type="dxa" w:w="2658"/>
+          </w:tcPr>
+          <w:p>
+            <w:r>
+              <w:t xml:space="preserve">1.8%</w:t>
+            </w:r>
+          </w:p>
+        </w:tc>
+      </w:tr>
+      <w:tr>
+        <w:tc>
+          <w:tcPr>
+            <w:tcW w:type="dxa" w:w="3323"/>
+          </w:tcPr>
+          <w:p>
+            <w:r>
+              <w:t xml:space="preserve">backchannel</w:t>
+            </w:r>
+          </w:p>
+        </w:tc>
+        <w:tc>
+          <w:tcPr>
+            <w:tcW w:type="dxa" w:w="2658"/>
+          </w:tcPr>
+          <w:p>
+            <w:r>
+              <w:t xml:space="preserve">1.4%</w:t>
+            </w:r>
+          </w:p>
+        </w:tc>
+        <w:tc>
+          <w:tcPr>
+            <w:tcW w:type="dxa" w:w="2658"/>
+          </w:tcPr>
+          <w:p>
+            <w:r>
+              <w:t xml:space="preserve">0.8%</w:t>
+            </w:r>
+          </w:p>
+        </w:tc>
+      </w:tr>
+      <w:tr>
+        <w:tc>
+          <w:tcPr>
+            <w:tcW w:type="dxa" w:w="3323"/>
+          </w:tcPr>
+          <w:p>
+            <w:r>
+              <w:t xml:space="preserve">ask_yes_no</w:t>
+            </w:r>
+          </w:p>
+        </w:tc>
+        <w:tc>
+          <w:tcPr>
+            <w:tcW w:type="dxa" w:w="2658"/>
+          </w:tcPr>
+          <w:p>
+            <w:r>
+              <w:t xml:space="preserve">0.3%</w:t>
+            </w:r>
+          </w:p>
+        </w:tc>
+        <w:tc>
+          <w:tcPr>
+            <w:tcW w:type="dxa" w:w="2658"/>
+          </w:tcPr>
+          <w:p>
+            <w:r>
+              <w:t xml:space="preserve">0.2%</w:t>
+            </w:r>
+          </w:p>
+        </w:tc>
+      </w:tr>
+    </w:tbl>
+    <w:p/>
+    <w:p>
+      <w:r>
+        <w:t xml:space="preserve">“ask” is the model's general question label: it is applied to wh-questions and most yes/no questions alike (ask_yes_no is rare). One in five host segments is a question, against one in thirteen guest segments.</w:t>
+      </w:r>
+    </w:p>
+    <w:p>
+      <w:pPr>
+        <w:pStyle w:val="Heading2"/>
+      </w:pPr>
+      <w:r>
+        <w:t xml:space="preserve">8.3 Methodology of the Check (src/stat_analysis/ask_within_host_check_v2.py)</w:t>
+      </w:r>
+    </w:p>
+    <w:p>
+      <w:pPr>
+        <w:pStyle w:val="ListBullet"/>
+      </w:pPr>
+      <w:r>
+        <w:t xml:space="preserve">Host question measures per episode, from all segments labeled HOST: the number of “ask” segments per 1,000 host words (comparable to the direct-question rate, which is also per 1,000 words), and the share of host segments labeled “ask”.</w:t>
+      </w:r>
+    </w:p>
+    <w:p>
+      <w:pPr>
+        <w:pStyle w:val="ListBullet"/>
+      </w:pPr>
+      <w:r>
+        <w:t xml:space="preserve">Criterion, fixed before the results were examined: the direct-question pattern is confirmed for a measure if the host-gender × guest-gender interaction of the within-host test has the same sign (guest-gender effect positive for male hosts, negative for female hosts) and p &lt; 0.05.</w:t>
+      </w:r>
+    </w:p>
+    <w:p>
+      <w:pPr>
+        <w:pStyle w:val="ListBullet"/>
+      </w:pPr>
+      <w:r>
+        <w:t xml:space="preserve">The within-host test and its interaction are exactly those of Section 6 (percentile ranks within host, 10,000 within-host permutations of guest gender). The guest-gender effect is also tested separately within male hosts and within female hosts, and the interaction is re-run leaving out one host at a time (3,000 permutations each).</w:t>
+      </w:r>
+    </w:p>
+    <w:p>
+      <w:pPr>
+        <w:pStyle w:val="ListBullet"/>
+      </w:pPr>
+      <w:r>
+        <w:t xml:space="preserve">Agreement between the two ways of measuring host questions: Spearman correlation between the direct-question rate and each “ask” measure across episodes, and within host (on within-host percentile ranks).</w:t>
+      </w:r>
+    </w:p>
+    <w:p>
+      <w:pPr>
+        <w:pStyle w:val="Heading2"/>
+      </w:pPr>
+      <w:r>
+        <w:t xml:space="preserve">8.4 How It Was Run</w:t>
+      </w:r>
+    </w:p>
+    <w:p>
+      <w:r>
+        <w:rPr>
+          <w:rFonts w:ascii="Consolas" w:hAnsi="Consolas"/>
+          <w:sz w:val="20"/>
+        </w:rPr>
+        <w:t xml:space="preserve">sbatch sbatch/run_dialogue_classification.sbatch             # first 200 episodes</w:t>
+      </w:r>
+    </w:p>
+    <w:p>
+      <w:r>
+        <w:rPr>
+          <w:rFonts w:ascii="Consolas" w:hAnsi="Consolas"/>
+          <w:sz w:val="20"/>
+        </w:rPr>
+        <w:t xml:space="preserve">sbatch sbatch/run_dialogue_classification_remaining.sbatch   # remaining 218</w:t>
+      </w:r>
+    </w:p>
+    <w:p>
+      <w:r>
+        <w:rPr>
+          <w:rFonts w:ascii="Consolas" w:hAnsi="Consolas"/>
+          <w:sz w:val="20"/>
+        </w:rPr>
+        <w:t xml:space="preserve">python src/combine_dialogue_acts.py</w:t>
+      </w:r>
+    </w:p>
+    <w:p>
+      <w:r>
+        <w:rPr>
+          <w:rFonts w:ascii="Consolas" w:hAnsi="Consolas"/>
+          <w:sz w:val="20"/>
+        </w:rPr>
+        <w:t xml:space="preserve">python src/stat_analysis/ask_within_host_check_v2.py</w:t>
+      </w:r>
+    </w:p>
+    <w:p>
+      <w:r>
+        <w:t xml:space="preserve">The classification runs on a GPU in the whisperx_cudnn8 environment; the other two scripts run in the convokit environment.</w:t>
+      </w:r>
+    </w:p>
+    <w:p>
+      <w:pPr>
+        <w:pStyle w:val="Heading2"/>
+      </w:pPr>
+      <w:r>
+        <w:t xml:space="preserve">8.5 Output Files</w:t>
+      </w:r>
+    </w:p>
+    <w:tbl>
+      <w:tblPr>
+        <w:tblStyle w:val="LightGrid-Accent1"/>
+        <w:tblW w:type="auto" w:w="0"/>
+        <w:jc w:val="center"/>
+        <w:tblLook w:firstColumn="1" w:firstRow="1" w:lastColumn="0" w:lastRow="0" w:noHBand="0" w:noVBand="1" w:val="04A0"/>
+      </w:tblPr>
+      <w:tblGrid>
+        <w:gridCol w:w="4992"/>
+        <w:gridCol w:w="3648"/>
+      </w:tblGrid>
+      <w:tr>
+        <w:tc>
+          <w:tcPr>
+            <w:tcW w:type="dxa" w:w="4992"/>
+            <w:shd w:val="clear" w:color="auto" w:fill="2E5395"/>
+          </w:tcPr>
+          <w:p>
+            <w:r>
+              <w:rPr>
+                <w:b/>
+                <w:color w:val="FFFFFF"/>
+              </w:rPr>
+              <w:t xml:space="preserve">File</w:t>
+            </w:r>
+          </w:p>
+        </w:tc>
+        <w:tc>
+          <w:tcPr>
+            <w:tcW w:type="dxa" w:w="3648"/>
+            <w:shd w:val="clear" w:color="auto" w:fill="2E5395"/>
+          </w:tcPr>
+          <w:p>
+            <w:r>
+              <w:rPr>
+                <w:b/>
+                <w:color w:val="FFFFFF"/>
+              </w:rPr>
+              <w:t xml:space="preserve">Contents</w:t>
+            </w:r>
+          </w:p>
+        </w:tc>
+      </w:tr>
+      <w:tr>
+        <w:tc>
+          <w:tcPr>
+            <w:tcW w:type="dxa" w:w="4992"/>
+          </w:tcPr>
+          <w:p>
+            <w:r>
+              <w:t xml:space="preserve">results/dialogue_acts/all_418/dialogue_act_labels.csv</w:t>
+            </w:r>
+          </w:p>
+        </w:tc>
+        <w:tc>
+          <w:tcPr>
+            <w:tcW w:type="dxa" w:w="3648"/>
+          </w:tcPr>
+          <w:p>
+            <w:r>
+              <w:t xml:space="preserve">Label of every segment (68 MB; not in git)</w:t>
+            </w:r>
+          </w:p>
+        </w:tc>
+      </w:tr>
+      <w:tr>
+        <w:tc>
+          <w:tcPr>
+            <w:tcW w:type="dxa" w:w="4992"/>
+          </w:tcPr>
+          <w:p>
+            <w:r>
+              <w:t xml:space="preserve">results/dialogue_acts/all_418/dialogue_act_rates_by_episode_role.csv</w:t>
+            </w:r>
+          </w:p>
+        </w:tc>
+        <w:tc>
+          <w:tcPr>
+            <w:tcW w:type="dxa" w:w="3648"/>
+          </w:tcPr>
+          <w:p>
+            <w:r>
+              <w:t xml:space="preserve">Share of each label per episode and role</w:t>
+            </w:r>
+          </w:p>
+        </w:tc>
+      </w:tr>
+      <w:tr>
+        <w:tc>
+          <w:tcPr>
+            <w:tcW w:type="dxa" w:w="4992"/>
+          </w:tcPr>
+          <w:p>
+            <w:r>
+              <w:t xml:space="preserve">results/stat_analysis/ask_within_host_check_v2_episodes.csv</w:t>
+            </w:r>
+          </w:p>
+        </w:tc>
+        <w:tc>
+          <w:tcPr>
+            <w:tcW w:type="dxa" w:w="3648"/>
+          </w:tcPr>
+          <w:p>
+            <w:r>
+              <w:t xml:space="preserve">Host question measures per episode</w:t>
+            </w:r>
+          </w:p>
+        </w:tc>
+      </w:tr>
+      <w:tr>
+        <w:tc>
+          <w:tcPr>
+            <w:tcW w:type="dxa" w:w="4992"/>
+          </w:tcPr>
+          <w:p>
+            <w:r>
+              <w:t xml:space="preserve">results/stat_analysis/ask_within_host_check_v2_agreement.csv</w:t>
+            </w:r>
+          </w:p>
+        </w:tc>
+        <w:tc>
+          <w:tcPr>
+            <w:tcW w:type="dxa" w:w="3648"/>
+          </w:tcPr>
+          <w:p>
+            <w:r>
+              <w:t xml:space="preserve">Agreement between measures</w:t>
+            </w:r>
+          </w:p>
+        </w:tc>
+      </w:tr>
+      <w:tr>
+        <w:tc>
+          <w:tcPr>
+            <w:tcW w:type="dxa" w:w="4992"/>
+          </w:tcPr>
+          <w:p>
+            <w:r>
+              <w:t xml:space="preserve">results/stat_analysis/ask_within_host_check_v2_within_host.csv</w:t>
+            </w:r>
+          </w:p>
+        </w:tc>
+        <w:tc>
+          <w:tcPr>
+            <w:tcW w:type="dxa" w:w="3648"/>
+          </w:tcPr>
+          <w:p>
+            <w:r>
+              <w:t xml:space="preserve">Within-host test and interaction</w:t>
+            </w:r>
+          </w:p>
+        </w:tc>
+      </w:tr>
+      <w:tr>
+        <w:tc>
+          <w:tcPr>
+            <w:tcW w:type="dxa" w:w="4992"/>
+          </w:tcPr>
+          <w:p>
+            <w:r>
+              <w:t xml:space="preserve">results/stat_analysis/ask_within_host_check_v2_by_host_gender.csv</w:t>
+            </w:r>
+          </w:p>
+        </w:tc>
+        <w:tc>
+          <w:tcPr>
+            <w:tcW w:type="dxa" w:w="3648"/>
+          </w:tcPr>
+          <w:p>
+            <w:r>
+              <w:t xml:space="preserve">Guest-gender effect within male / female hosts</w:t>
+            </w:r>
+          </w:p>
+        </w:tc>
+      </w:tr>
+      <w:tr>
+        <w:tc>
+          <w:tcPr>
+            <w:tcW w:type="dxa" w:w="4992"/>
+          </w:tcPr>
+          <w:p>
+            <w:r>
+              <w:t xml:space="preserve">results/stat_analysis/ask_within_host_check_v2_per_host.csv</w:t>
+            </w:r>
+          </w:p>
+        </w:tc>
+        <w:tc>
+          <w:tcPr>
+            <w:tcW w:type="dxa" w:w="3648"/>
+          </w:tcPr>
+          <w:p>
+            <w:r>
+              <w:t xml:space="preserve">Guest-gender effect per host</w:t>
+            </w:r>
+          </w:p>
+        </w:tc>
+      </w:tr>
+      <w:tr>
+        <w:tc>
+          <w:tcPr>
+            <w:tcW w:type="dxa" w:w="4992"/>
+          </w:tcPr>
+          <w:p>
+            <w:r>
+              <w:t xml:space="preserve">results/stat_analysis/ask_within_host_check_v2_leave_one_host_out.csv</w:t>
+            </w:r>
+          </w:p>
+        </w:tc>
+        <w:tc>
+          <w:tcPr>
+            <w:tcW w:type="dxa" w:w="3648"/>
+          </w:tcPr>
+          <w:p>
+            <w:r>
+              <w:t xml:space="preserve">Interaction leaving out one host</w:t>
+            </w:r>
+          </w:p>
+        </w:tc>
+      </w:tr>
+      <w:tr>
+        <w:tc>
+          <w:tcPr>
+            <w:tcW w:type="dxa" w:w="4992"/>
+          </w:tcPr>
+          <w:p>
+            <w:r>
+              <w:t xml:space="preserve">results/stat_analysis/ask_within_host_check_v2_by_dyad.csv</w:t>
+            </w:r>
+          </w:p>
+        </w:tc>
+        <w:tc>
+          <w:tcPr>
+            <w:tcW w:type="dxa" w:w="3648"/>
+          </w:tcPr>
+          <w:p>
+            <w:r>
+              <w:t xml:space="preserve">Medians by dyad</w:t>
+            </w:r>
+          </w:p>
+        </w:tc>
+      </w:tr>
+    </w:tbl>
+    <w:p/>
+    <w:p>
+      <w:pPr>
+        <w:pStyle w:val="Heading2"/>
+      </w:pPr>
+      <w:r>
+        <w:t xml:space="preserve">8.6 Results</w:t>
+      </w:r>
+    </w:p>
+    <w:p>
+      <w:r>
+        <w:t xml:space="preserve">Agreement between the direct-question rate and the “ask” measures (Spearman correlation):</w:t>
+      </w:r>
+    </w:p>
+    <w:tbl>
+      <w:tblPr>
+        <w:tblStyle w:val="LightGrid-Accent1"/>
+        <w:tblW w:type="auto" w:w="0"/>
+        <w:jc w:val="center"/>
+        <w:tblLook w:firstColumn="1" w:firstRow="1" w:lastColumn="0" w:lastRow="0" w:noHBand="0" w:noVBand="1" w:val="04A0"/>
+      </w:tblPr>
+      <w:tblGrid>
+        <w:gridCol w:w="4320"/>
+        <w:gridCol w:w="2160"/>
+        <w:gridCol w:w="2160"/>
+      </w:tblGrid>
+      <w:tr>
+        <w:tc>
+          <w:tcPr>
+            <w:tcW w:type="dxa" w:w="4320"/>
+            <w:shd w:val="clear" w:color="auto" w:fill="2E5395"/>
+          </w:tcPr>
+          <w:p>
+            <w:r>
+              <w:rPr>
+                <w:b/>
+                <w:color w:val="FFFFFF"/>
+              </w:rPr>
+              <w:t xml:space="preserve">Measure</w:t>
+            </w:r>
+          </w:p>
+        </w:tc>
+        <w:tc>
+          <w:tcPr>
+            <w:tcW w:type="dxa" w:w="2160"/>
+            <w:shd w:val="clear" w:color="auto" w:fill="2E5395"/>
+          </w:tcPr>
+          <w:p>
+            <w:r>
+              <w:rPr>
+                <w:b/>
+                <w:color w:val="FFFFFF"/>
+              </w:rPr>
+              <w:t xml:space="preserve">Across episodes</w:t>
+            </w:r>
+          </w:p>
+        </w:tc>
+        <w:tc>
+          <w:tcPr>
+            <w:tcW w:type="dxa" w:w="2160"/>
+            <w:shd w:val="clear" w:color="auto" w:fill="2E5395"/>
+          </w:tcPr>
+          <w:p>
+            <w:r>
+              <w:rPr>
+                <w:b/>
+                <w:color w:val="FFFFFF"/>
+              </w:rPr>
+              <w:t xml:space="preserve">Within host</w:t>
+            </w:r>
+          </w:p>
+        </w:tc>
+      </w:tr>
+      <w:tr>
+        <w:tc>
+          <w:tcPr>
+            <w:tcW w:type="dxa" w:w="4320"/>
+          </w:tcPr>
+          <w:p>
+            <w:r>
+              <w:t xml:space="preserve">“ask” per 1k host words</w:t>
+            </w:r>
+          </w:p>
+        </w:tc>
+        <w:tc>
+          <w:tcPr>
+            <w:tcW w:type="dxa" w:w="2160"/>
+          </w:tcPr>
+          <w:p>
+            <w:r>
+              <w:t xml:space="preserve">0.74</w:t>
+            </w:r>
+          </w:p>
+        </w:tc>
+        <w:tc>
+          <w:tcPr>
+            <w:tcW w:type="dxa" w:w="2160"/>
+          </w:tcPr>
+          <w:p>
+            <w:r>
+              <w:t xml:space="preserve">0.77</w:t>
+            </w:r>
+          </w:p>
+        </w:tc>
+      </w:tr>
+      <w:tr>
+        <w:tc>
+          <w:tcPr>
+            <w:tcW w:type="dxa" w:w="4320"/>
+          </w:tcPr>
+          <w:p>
+            <w:r>
+              <w:t xml:space="preserve">“ask” share of host segments</w:t>
+            </w:r>
+          </w:p>
+        </w:tc>
+        <w:tc>
+          <w:tcPr>
+            <w:tcW w:type="dxa" w:w="2160"/>
+          </w:tcPr>
+          <w:p>
+            <w:r>
+              <w:t xml:space="preserve">0.63</w:t>
+            </w:r>
+          </w:p>
+        </w:tc>
+        <w:tc>
+          <w:tcPr>
+            <w:tcW w:type="dxa" w:w="2160"/>
+          </w:tcPr>
+          <w:p>
+            <w:r>
+              <w:t xml:space="preserve">0.66</w:t>
+            </w:r>
+          </w:p>
+        </w:tc>
+      </w:tr>
+    </w:tbl>
+    <w:p/>
+    <w:p>
+      <w:r>
+        <w:t xml:space="preserve">Both are strongly related to the direct-question rate, also within a host's own episodes: the two methods largely count the same host questions.</w:t>
+      </w:r>
+    </w:p>
+    <w:p>
+      <w:r>
+        <w:t xml:space="preserve">Guest-gender effect with the host held fixed (percentile rank of female-guest minus male-guest episodes), separately for male and female hosts, and the difference between them (the interaction):</w:t>
+      </w:r>
+    </w:p>
+    <w:tbl>
+      <w:tblPr>
+        <w:tblStyle w:val="LightGrid-Accent1"/>
+        <w:tblW w:type="auto" w:w="0"/>
+        <w:jc w:val="center"/>
+        <w:tblLook w:firstColumn="1" w:firstRow="1" w:lastColumn="0" w:lastRow="0" w:noHBand="0" w:noVBand="1" w:val="04A0"/>
+      </w:tblPr>
+      <w:tblGrid>
+        <w:gridCol w:w="2574"/>
+        <w:gridCol w:w="1746"/>
+        <w:gridCol w:w="1746"/>
+        <w:gridCol w:w="1563"/>
+        <w:gridCol w:w="1011"/>
+      </w:tblGrid>
+      <w:tr>
+        <w:tc>
+          <w:tcPr>
+            <w:tcW w:type="dxa" w:w="2574"/>
+            <w:shd w:val="clear" w:color="auto" w:fill="2E5395"/>
+          </w:tcPr>
+          <w:p>
+            <w:r>
+              <w:rPr>
+                <w:b/>
+                <w:color w:val="FFFFFF"/>
+              </w:rPr>
+              <w:t xml:space="preserve">Measure</w:t>
+            </w:r>
+          </w:p>
+        </w:tc>
+        <w:tc>
+          <w:tcPr>
+            <w:tcW w:type="dxa" w:w="1746"/>
+            <w:shd w:val="clear" w:color="auto" w:fill="2E5395"/>
+          </w:tcPr>
+          <w:p>
+            <w:r>
+              <w:rPr>
+                <w:b/>
+                <w:color w:val="FFFFFF"/>
+              </w:rPr>
+              <w:t xml:space="preserve">Male hosts (4 hosts, 270 eps.)</w:t>
+            </w:r>
+          </w:p>
+        </w:tc>
+        <w:tc>
+          <w:tcPr>
+            <w:tcW w:type="dxa" w:w="1746"/>
+            <w:shd w:val="clear" w:color="auto" w:fill="2E5395"/>
+          </w:tcPr>
+          <w:p>
+            <w:r>
+              <w:rPr>
+                <w:b/>
+                <w:color w:val="FFFFFF"/>
+              </w:rPr>
+              <w:t xml:space="preserve">Female hosts (4 hosts, 104 eps.)</w:t>
+            </w:r>
+          </w:p>
+        </w:tc>
+        <w:tc>
+          <w:tcPr>
+            <w:tcW w:type="dxa" w:w="1563"/>
+            <w:shd w:val="clear" w:color="auto" w:fill="2E5395"/>
+          </w:tcPr>
+          <w:p>
+            <w:r>
+              <w:rPr>
+                <w:b/>
+                <w:color w:val="FFFFFF"/>
+              </w:rPr>
+              <w:t xml:space="preserve">Interaction</w:t>
+            </w:r>
+          </w:p>
+        </w:tc>
+        <w:tc>
+          <w:tcPr>
+            <w:tcW w:type="dxa" w:w="1011"/>
+            <w:shd w:val="clear" w:color="auto" w:fill="2E5395"/>
+          </w:tcPr>
+          <w:p>
+            <w:r>
+              <w:rPr>
+                <w:b/>
+                <w:color w:val="FFFFFF"/>
+              </w:rPr>
+              <w:t xml:space="preserve">Meets criterion</w:t>
+            </w:r>
+          </w:p>
+        </w:tc>
+      </w:tr>
+      <w:tr>
+        <w:tc>
+          <w:tcPr>
+            <w:tcW w:type="dxa" w:w="2574"/>
+          </w:tcPr>
+          <w:p>
+            <w:r>
+              <w:t xml:space="preserve">Direct questions per 1k words (Section 1)</w:t>
+            </w:r>
+          </w:p>
+        </w:tc>
+        <w:tc>
+          <w:tcPr>
+            <w:tcW w:type="dxa" w:w="1746"/>
+          </w:tcPr>
+          <w:p>
+            <w:r>
+              <w:t xml:space="preserve">+0.145 (p 0.0002)</w:t>
+            </w:r>
+          </w:p>
+        </w:tc>
+        <w:tc>
+          <w:tcPr>
+            <w:tcW w:type="dxa" w:w="1746"/>
+          </w:tcPr>
+          <w:p>
+            <w:r>
+              <w:t xml:space="preserve">-0.205 (p 0.0003)</w:t>
+            </w:r>
+          </w:p>
+        </w:tc>
+        <w:tc>
+          <w:tcPr>
+            <w:tcW w:type="dxa" w:w="1563"/>
+          </w:tcPr>
+          <w:p>
+            <w:r>
+              <w:t xml:space="preserve">+0.350 (p &lt;0.0001)</w:t>
+            </w:r>
+          </w:p>
+        </w:tc>
+        <w:tc>
+          <w:tcPr>
+            <w:tcW w:type="dxa" w:w="1011"/>
+          </w:tcPr>
+          <w:p>
+            <w:r>
+              <w:t xml:space="preserve">Yes</w:t>
+            </w:r>
+          </w:p>
+        </w:tc>
+      </w:tr>
+      <w:tr>
+        <w:tc>
+          <w:tcPr>
+            <w:tcW w:type="dxa" w:w="2574"/>
+          </w:tcPr>
+          <w:p>
+            <w:r>
+              <w:t xml:space="preserve">“ask” per 1k host words</w:t>
+            </w:r>
+          </w:p>
+        </w:tc>
+        <w:tc>
+          <w:tcPr>
+            <w:tcW w:type="dxa" w:w="1746"/>
+          </w:tcPr>
+          <w:p>
+            <w:r>
+              <w:t xml:space="preserve">+0.093 (p 0.0244)</w:t>
+            </w:r>
+          </w:p>
+        </w:tc>
+        <w:tc>
+          <w:tcPr>
+            <w:tcW w:type="dxa" w:w="1746"/>
+          </w:tcPr>
+          <w:p>
+            <w:r>
+              <w:t xml:space="preserve">-0.187 (p 0.0012)</w:t>
+            </w:r>
+          </w:p>
+        </w:tc>
+        <w:tc>
+          <w:tcPr>
+            <w:tcW w:type="dxa" w:w="1563"/>
+          </w:tcPr>
+          <w:p>
+            <w:r>
+              <w:t xml:space="preserve">+0.280 (p 0.0003)</w:t>
+            </w:r>
+          </w:p>
+        </w:tc>
+        <w:tc>
+          <w:tcPr>
+            <w:tcW w:type="dxa" w:w="1011"/>
+          </w:tcPr>
+          <w:p>
+            <w:r>
+              <w:t xml:space="preserve">Yes</w:t>
+            </w:r>
+          </w:p>
+        </w:tc>
+      </w:tr>
+      <w:tr>
+        <w:tc>
+          <w:tcPr>
+            <w:tcW w:type="dxa" w:w="2574"/>
+          </w:tcPr>
+          <w:p>
+            <w:r>
+              <w:t xml:space="preserve">“ask” share of host segments</w:t>
+            </w:r>
+          </w:p>
+        </w:tc>
+        <w:tc>
+          <w:tcPr>
+            <w:tcW w:type="dxa" w:w="1746"/>
+          </w:tcPr>
+          <w:p>
+            <w:r>
+              <w:t xml:space="preserve">+0.054 (p 0.1874)</w:t>
+            </w:r>
+          </w:p>
+        </w:tc>
+        <w:tc>
+          <w:tcPr>
+            <w:tcW w:type="dxa" w:w="1746"/>
+          </w:tcPr>
+          <w:p>
+            <w:r>
+              <w:t xml:space="preserve">-0.100 (p 0.0865)</w:t>
+            </w:r>
+          </w:p>
+        </w:tc>
+        <w:tc>
+          <w:tcPr>
+            <w:tcW w:type="dxa" w:w="1563"/>
+          </w:tcPr>
+          <w:p>
+            <w:r>
+              <w:t xml:space="preserve">+0.154 (p 0.0311)</w:t>
+            </w:r>
+          </w:p>
+        </w:tc>
+        <w:tc>
+          <w:tcPr>
+            <w:tcW w:type="dxa" w:w="1011"/>
+          </w:tcPr>
+          <w:p>
+            <w:r>
+              <w:t xml:space="preserve">Yes</w:t>
+            </w:r>
+          </w:p>
+        </w:tc>
+      </w:tr>
+    </w:tbl>
+    <w:p/>
+    <w:p>
+      <w:r>
+        <w:t xml:space="preserve">The direct-question row repeats Section 6 for comparison. Both “ask” measures meet the criterion. For “ask” per 1,000 words the guest-gender effect is significant within both male and female hosts; for the segment share both halves point the same way but neither is significant on its own.</w:t>
+      </w:r>
+    </w:p>
+    <w:p>
+      <w:r>
+        <w:t xml:space="preserve">Guest-gender effect per host (percentile rank, female minus male guests):</w:t>
+      </w:r>
+    </w:p>
+    <w:tbl>
+      <w:tblPr>
+        <w:tblStyle w:val="LightGrid-Accent1"/>
+        <w:tblW w:type="auto" w:w="0"/>
+        <w:jc w:val="center"/>
+        <w:tblLook w:firstColumn="1" w:firstRow="1" w:lastColumn="0" w:lastRow="0" w:noHBand="0" w:noVBand="1" w:val="04A0"/>
+      </w:tblPr>
+      <w:tblGrid>
+        <w:gridCol w:w="2612"/>
+        <w:gridCol w:w="804"/>
+        <w:gridCol w:w="1808"/>
+        <w:gridCol w:w="1808"/>
+        <w:gridCol w:w="1607"/>
+      </w:tblGrid>
+      <w:tr>
+        <w:tc>
+          <w:tcPr>
+            <w:tcW w:type="dxa" w:w="2612"/>
+            <w:shd w:val="clear" w:color="auto" w:fill="2E5395"/>
+          </w:tcPr>
+          <w:p>
+            <w:r>
+              <w:rPr>
+                <w:b/>
+                <w:color w:val="FFFFFF"/>
+              </w:rPr>
+              <w:t xml:space="preserve">Host</w:t>
+            </w:r>
+          </w:p>
+        </w:tc>
+        <w:tc>
+          <w:tcPr>
+            <w:tcW w:type="dxa" w:w="804"/>
+            <w:shd w:val="clear" w:color="auto" w:fill="2E5395"/>
+          </w:tcPr>
+          <w:p>
+            <w:r>
+              <w:rPr>
+                <w:b/>
+                <w:color w:val="FFFFFF"/>
+              </w:rPr>
+              <w:t xml:space="preserve">Sex</w:t>
+            </w:r>
+          </w:p>
+        </w:tc>
+        <w:tc>
+          <w:tcPr>
+            <w:tcW w:type="dxa" w:w="1808"/>
+            <w:shd w:val="clear" w:color="auto" w:fill="2E5395"/>
+          </w:tcPr>
+          <w:p>
+            <w:r>
+              <w:rPr>
+                <w:b/>
+                <w:color w:val="FFFFFF"/>
+              </w:rPr>
+              <w:t xml:space="preserve">Direct questions</w:t>
+            </w:r>
+          </w:p>
+        </w:tc>
+        <w:tc>
+          <w:tcPr>
+            <w:tcW w:type="dxa" w:w="1808"/>
+            <w:shd w:val="clear" w:color="auto" w:fill="2E5395"/>
+          </w:tcPr>
+          <w:p>
+            <w:r>
+              <w:rPr>
+                <w:b/>
+                <w:color w:val="FFFFFF"/>
+              </w:rPr>
+              <w:t xml:space="preserve">“ask” per 1k words</w:t>
+            </w:r>
+          </w:p>
+        </w:tc>
+        <w:tc>
+          <w:tcPr>
+            <w:tcW w:type="dxa" w:w="1607"/>
+            <w:shd w:val="clear" w:color="auto" w:fill="2E5395"/>
+          </w:tcPr>
+          <w:p>
+            <w:r>
+              <w:rPr>
+                <w:b/>
+                <w:color w:val="FFFFFF"/>
+              </w:rPr>
+              <w:t xml:space="preserve">“ask” share</w:t>
+            </w:r>
+          </w:p>
+        </w:tc>
+      </w:tr>
+      <w:tr>
+        <w:tc>
+          <w:tcPr>
+            <w:tcW w:type="dxa" w:w="2612"/>
+          </w:tcPr>
+          <w:p>
+            <w:r>
+              <w:t xml:space="preserve">Faye Dsouza</w:t>
+            </w:r>
+          </w:p>
+        </w:tc>
+        <w:tc>
+          <w:tcPr>
+            <w:tcW w:type="dxa" w:w="804"/>
+          </w:tcPr>
+          <w:p>
+            <w:r>
+              <w:t xml:space="preserve">F</w:t>
+            </w:r>
+          </w:p>
+        </w:tc>
+        <w:tc>
+          <w:tcPr>
+            <w:tcW w:type="dxa" w:w="1808"/>
+          </w:tcPr>
+          <w:p>
+            <w:r>
+              <w:t xml:space="preserve">-0.19</w:t>
+            </w:r>
+          </w:p>
+        </w:tc>
+        <w:tc>
+          <w:tcPr>
+            <w:tcW w:type="dxa" w:w="1808"/>
+          </w:tcPr>
+          <w:p>
+            <w:r>
+              <w:t xml:space="preserve">-0.19</w:t>
+            </w:r>
+          </w:p>
+        </w:tc>
+        <w:tc>
+          <w:tcPr>
+            <w:tcW w:type="dxa" w:w="1607"/>
+          </w:tcPr>
+          <w:p>
+            <w:r>
+              <w:t xml:space="preserve">-0.19</w:t>
+            </w:r>
+          </w:p>
+        </w:tc>
+      </w:tr>
+      <w:tr>
+        <w:tc>
+          <w:tcPr>
+            <w:tcW w:type="dxa" w:w="2612"/>
+          </w:tcPr>
+          <w:p>
+            <w:r>
+              <w:t xml:space="preserve">Karishma Mehta</w:t>
+            </w:r>
+          </w:p>
+        </w:tc>
+        <w:tc>
+          <w:tcPr>
+            <w:tcW w:type="dxa" w:w="804"/>
+          </w:tcPr>
+          <w:p>
+            <w:r>
+              <w:t xml:space="preserve">F</w:t>
+            </w:r>
+          </w:p>
+        </w:tc>
+        <w:tc>
+          <w:tcPr>
+            <w:tcW w:type="dxa" w:w="1808"/>
+          </w:tcPr>
+          <w:p>
+            <w:r>
+              <w:t xml:space="preserve">-0.21</w:t>
+            </w:r>
+          </w:p>
+        </w:tc>
+        <w:tc>
+          <w:tcPr>
+            <w:tcW w:type="dxa" w:w="1808"/>
+          </w:tcPr>
+          <w:p>
+            <w:r>
+              <w:t xml:space="preserve">-0.16</w:t>
+            </w:r>
+          </w:p>
+        </w:tc>
+        <w:tc>
+          <w:tcPr>
+            <w:tcW w:type="dxa" w:w="1607"/>
+          </w:tcPr>
+          <w:p>
+            <w:r>
+              <w:t xml:space="preserve">-0.01</w:t>
+            </w:r>
+          </w:p>
+        </w:tc>
+      </w:tr>
+      <w:tr>
+        <w:tc>
+          <w:tcPr>
+            <w:tcW w:type="dxa" w:w="2612"/>
+          </w:tcPr>
+          <w:p>
+            <w:r>
+              <w:t xml:space="preserve">Pooja Dhingra</w:t>
+            </w:r>
+          </w:p>
+        </w:tc>
+        <w:tc>
+          <w:tcPr>
+            <w:tcW w:type="dxa" w:w="804"/>
+          </w:tcPr>
+          <w:p>
+            <w:r>
+              <w:t xml:space="preserve">F</w:t>
+            </w:r>
+          </w:p>
+        </w:tc>
+        <w:tc>
+          <w:tcPr>
+            <w:tcW w:type="dxa" w:w="1808"/>
+          </w:tcPr>
+          <w:p>
+            <w:r>
+              <w:t xml:space="preserve">-0.40</w:t>
+            </w:r>
+          </w:p>
+        </w:tc>
+        <w:tc>
+          <w:tcPr>
+            <w:tcW w:type="dxa" w:w="1808"/>
+          </w:tcPr>
+          <w:p>
+            <w:r>
+              <w:t xml:space="preserve">-0.30</w:t>
+            </w:r>
+          </w:p>
+        </w:tc>
+        <w:tc>
+          <w:tcPr>
+            <w:tcW w:type="dxa" w:w="1607"/>
+          </w:tcPr>
+          <w:p>
+            <w:r>
+              <w:t xml:space="preserve">-0.30</w:t>
+            </w:r>
+          </w:p>
+        </w:tc>
+      </w:tr>
+      <w:tr>
+        <w:tc>
+          <w:tcPr>
+            <w:tcW w:type="dxa" w:w="2612"/>
+          </w:tcPr>
+          <w:p>
+            <w:r>
+              <w:t xml:space="preserve">Soha Ali Khan</w:t>
+            </w:r>
+          </w:p>
+        </w:tc>
+        <w:tc>
+          <w:tcPr>
+            <w:tcW w:type="dxa" w:w="804"/>
+          </w:tcPr>
+          <w:p>
+            <w:r>
+              <w:t xml:space="preserve">F</w:t>
+            </w:r>
+          </w:p>
+        </w:tc>
+        <w:tc>
+          <w:tcPr>
+            <w:tcW w:type="dxa" w:w="1808"/>
+          </w:tcPr>
+          <w:p>
+            <w:r>
+              <w:t xml:space="preserve">+0.50</w:t>
+            </w:r>
+          </w:p>
+        </w:tc>
+        <w:tc>
+          <w:tcPr>
+            <w:tcW w:type="dxa" w:w="1808"/>
+          </w:tcPr>
+          <w:p>
+            <w:r>
+              <w:t xml:space="preserve">-0.50</w:t>
+            </w:r>
+          </w:p>
+        </w:tc>
+        <w:tc>
+          <w:tcPr>
+            <w:tcW w:type="dxa" w:w="1607"/>
+          </w:tcPr>
+          <w:p>
+            <w:r>
+              <w:t xml:space="preserve">-0.50</w:t>
+            </w:r>
+          </w:p>
+        </w:tc>
+      </w:tr>
+      <w:tr>
+        <w:tc>
+          <w:tcPr>
+            <w:tcW w:type="dxa" w:w="2612"/>
+          </w:tcPr>
+          <w:p>
+            <w:r>
+              <w:t xml:space="preserve">Prakhar Gupta</w:t>
+            </w:r>
+          </w:p>
+        </w:tc>
+        <w:tc>
+          <w:tcPr>
+            <w:tcW w:type="dxa" w:w="804"/>
+          </w:tcPr>
+          <w:p>
+            <w:r>
+              <w:t xml:space="preserve">M</w:t>
+            </w:r>
+          </w:p>
+        </w:tc>
+        <w:tc>
+          <w:tcPr>
+            <w:tcW w:type="dxa" w:w="1808"/>
+          </w:tcPr>
+          <w:p>
+            <w:r>
+              <w:t xml:space="preserve">-0.04</w:t>
+            </w:r>
+          </w:p>
+        </w:tc>
+        <w:tc>
+          <w:tcPr>
+            <w:tcW w:type="dxa" w:w="1808"/>
+          </w:tcPr>
+          <w:p>
+            <w:r>
+              <w:t xml:space="preserve">-0.03</w:t>
+            </w:r>
+          </w:p>
+        </w:tc>
+        <w:tc>
+          <w:tcPr>
+            <w:tcW w:type="dxa" w:w="1607"/>
+          </w:tcPr>
+          <w:p>
+            <w:r>
+              <w:t xml:space="preserve">-0.20</w:t>
+            </w:r>
+          </w:p>
+        </w:tc>
+      </w:tr>
+      <w:tr>
+        <w:tc>
+          <w:tcPr>
+            <w:tcW w:type="dxa" w:w="2612"/>
+          </w:tcPr>
+          <w:p>
+            <w:r>
+              <w:t xml:space="preserve">Raj Shamani</w:t>
+            </w:r>
+          </w:p>
+        </w:tc>
+        <w:tc>
+          <w:tcPr>
+            <w:tcW w:type="dxa" w:w="804"/>
+          </w:tcPr>
+          <w:p>
+            <w:r>
+              <w:t xml:space="preserve">M</w:t>
+            </w:r>
+          </w:p>
+        </w:tc>
+        <w:tc>
+          <w:tcPr>
+            <w:tcW w:type="dxa" w:w="1808"/>
+          </w:tcPr>
+          <w:p>
+            <w:r>
+              <w:t xml:space="preserve">+0.14</w:t>
+            </w:r>
+          </w:p>
+        </w:tc>
+        <w:tc>
+          <w:tcPr>
+            <w:tcW w:type="dxa" w:w="1808"/>
+          </w:tcPr>
+          <w:p>
+            <w:r>
+              <w:t xml:space="preserve">+0.05</w:t>
+            </w:r>
+          </w:p>
+        </w:tc>
+        <w:tc>
+          <w:tcPr>
+            <w:tcW w:type="dxa" w:w="1607"/>
+          </w:tcPr>
+          <w:p>
+            <w:r>
+              <w:t xml:space="preserve">-0.02</w:t>
+            </w:r>
+          </w:p>
+        </w:tc>
+      </w:tr>
+      <w:tr>
+        <w:tc>
+          <w:tcPr>
+            <w:tcW w:type="dxa" w:w="2612"/>
+          </w:tcPr>
+          <w:p>
+            <w:r>
+              <w:t xml:space="preserve">Ranveer A</w:t>
+            </w:r>
+          </w:p>
+        </w:tc>
+        <w:tc>
+          <w:tcPr>
+            <w:tcW w:type="dxa" w:w="804"/>
+          </w:tcPr>
+          <w:p>
+            <w:r>
+              <w:t xml:space="preserve">M</w:t>
+            </w:r>
+          </w:p>
+        </w:tc>
+        <w:tc>
+          <w:tcPr>
+            <w:tcW w:type="dxa" w:w="1808"/>
+          </w:tcPr>
+          <w:p>
+            <w:r>
+              <w:t xml:space="preserve">+0.18</w:t>
+            </w:r>
+          </w:p>
+        </w:tc>
+        <w:tc>
+          <w:tcPr>
+            <w:tcW w:type="dxa" w:w="1808"/>
+          </w:tcPr>
+          <w:p>
+            <w:r>
+              <w:t xml:space="preserve">+0.21</w:t>
+            </w:r>
+          </w:p>
+        </w:tc>
+        <w:tc>
+          <w:tcPr>
+            <w:tcW w:type="dxa" w:w="1607"/>
+          </w:tcPr>
+          <w:p>
+            <w:r>
+              <w:t xml:space="preserve">+0.22</w:t>
+            </w:r>
+          </w:p>
+        </w:tc>
+      </w:tr>
+      <w:tr>
+        <w:tc>
+          <w:tcPr>
+            <w:tcW w:type="dxa" w:w="2612"/>
+          </w:tcPr>
+          <w:p>
+            <w:r>
+              <w:t xml:space="preserve">Samdish Bhatia</w:t>
+            </w:r>
+          </w:p>
+        </w:tc>
+        <w:tc>
+          <w:tcPr>
+            <w:tcW w:type="dxa" w:w="804"/>
+          </w:tcPr>
+          <w:p>
+            <w:r>
+              <w:t xml:space="preserve">M</w:t>
+            </w:r>
+          </w:p>
+        </w:tc>
+        <w:tc>
+          <w:tcPr>
+            <w:tcW w:type="dxa" w:w="1808"/>
+          </w:tcPr>
+          <w:p>
+            <w:r>
+              <w:t xml:space="preserve">+0.24</w:t>
+            </w:r>
+          </w:p>
+        </w:tc>
+        <w:tc>
+          <w:tcPr>
+            <w:tcW w:type="dxa" w:w="1808"/>
+          </w:tcPr>
+          <w:p>
+            <w:r>
+              <w:t xml:space="preserve">-0.01</w:t>
+            </w:r>
+          </w:p>
+        </w:tc>
+        <w:tc>
+          <w:tcPr>
+            <w:tcW w:type="dxa" w:w="1607"/>
+          </w:tcPr>
+          <w:p>
+            <w:r>
+              <w:t xml:space="preserve">+0.08</w:t>
+            </w:r>
+          </w:p>
+        </w:tc>
+      </w:tr>
+    </w:tbl>
+    <w:p/>
+    <w:p>
+      <w:r>
+        <w:t xml:space="preserve">All three female hosts with several episodes of each guest gender ask female guests fewer questions on all three measures (Soha Ali Khan, with one episode of each, is too few to read). Among male hosts, Ranveer A asks female guests clearly more questions on every measure; for Raj Shamani, Prakhar Gupta and Samdish Bhatia the “ask” effects range from -0.20 to +0.08 and do not show the pattern on their own.</w:t>
+      </w:r>
+    </w:p>
+    <w:p>
+      <w:r>
+        <w:t xml:space="preserve">Leaving out one host at a time, the interaction stays significant for “ask” per 1,000 words (p at most 0.004) and for direct questions (p at most 0.001). For the segment share it is significant in 6 of 9 cases and not when Ranveer A (p 0.37), Faye Dsouza (p 0.17) or Pooja Dhingra (p 0.07) is left out.</w:t>
+      </w:r>
+    </w:p>
+    <w:p>
+      <w:pPr>
+        <w:pStyle w:val="Heading2"/>
+      </w:pPr>
+      <w:r>
+        <w:t xml:space="preserve">8.7 Interpretation: What These Results Suggest</w:t>
+      </w:r>
+    </w:p>
+    <w:p>
+      <w:pPr>
+        <w:pStyle w:val="ListBullet"/>
+      </w:pPr>
+      <w:r>
+        <w:rPr>
+          <w:b/>
+        </w:rPr>
+        <w:t xml:space="preserve">The cross-gender question pattern is confirmed by the dialogue-act label. </w:t>
+      </w:r>
+      <w:r>
+        <w:t xml:space="preserve">The pattern found with direct questions in Section 6 appears again with an independent measurement of questions: male hosts ask female guests more questions than male guests, and female hosts ask female guests fewer. On the comparable measure (per 1,000 words) it meets the pre-set criterion, holds within both host genders, and survives leaving out any single host.</w:t>
+      </w:r>
+    </w:p>
+    <w:p>
+      <w:pPr>
+        <w:pStyle w:val="ListBullet"/>
+      </w:pPr>
+      <w:r>
+        <w:rPr>
+          <w:b/>
+        </w:rPr>
+        <w:t xml:space="preserve">The female-host side is the more robust half. </w:t>
+      </w:r>
+      <w:r>
+        <w:t xml:space="preserve">The female-host effect is larger and consistent across the female hosts. The male-host effect is smaller and rests mainly on Ranveer A, so “female hosts ask female guests fewer questions” is the better-supported half.</w:t>
+      </w:r>
+    </w:p>
+    <w:p>
+      <w:pPr>
+        <w:pStyle w:val="ListBullet"/>
+      </w:pPr>
+      <w:r>
+        <w:rPr>
+          <w:b/>
+        </w:rPr>
+        <w:t xml:space="preserve">The segment-based measure is weaker. </w:t>
+      </w:r>
+      <w:r>
+        <w:t xml:space="preserve">The share of segments is noisier than a rate per word, probably because how WhisperX splits speech into segments varies between episodes; its weaker result is consistent with more noise rather than a different pattern.</w:t>
+      </w:r>
+    </w:p>
+    <w:p>
+      <w:pPr>
+        <w:pStyle w:val="Heading2"/>
+      </w:pPr>
+      <w:r>
+        <w:t xml:space="preserve">8.8 Notes &amp; Limitations</w:t>
+      </w:r>
+    </w:p>
+    <w:p>
+      <w:pPr>
+        <w:pStyle w:val="ListBullet"/>
+      </w:pPr>
+      <w:r>
+        <w:t xml:space="preserve">The check uses the same 418 episodes in which the pattern was first seen. It confirms that the pattern is not an artifact of the word-list measure, but it is not a replication on new data; the result should still be presented as exploratory and confirmed by a second measure.</w:t>
+      </w:r>
+    </w:p>
+    <w:p>
+      <w:pPr>
+        <w:pStyle w:val="ListBullet"/>
+      </w:pPr>
+      <w:r>
+        <w:t xml:space="preserve">The dialogue-act model was trained on English conversation corpora and was not audited on these podcasts, which mix English and Hindi; its errors on code-mixed speech are unknown.</w:t>
+      </w:r>
+    </w:p>
+    <w:p>
+      <w:pPr>
+        <w:pStyle w:val="ListBullet"/>
+      </w:pPr>
+      <w:r>
+        <w:t xml:space="preserve">Segments are classified with only the previous segment as context, and they include the first and last minute of each episode, unlike Sections 1-7.</w:t>
+      </w:r>
+    </w:p>
+    <w:p>
+      <w:pPr>
+        <w:pStyle w:val="ListBullet"/>
+      </w:pPr>
+      <w:r>
+        <w:t xml:space="preserve">Question counts do not distinguish types of questions (e.g. personal vs. professional), which could differ by guest gender even where the number of questions does not.</w:t>
       </w:r>
     </w:p>
     <w:sectPr>

</xml_diff>